<commit_message>
docs(reports): finalize team details and rubric
</commit_message>
<xml_diff>
--- a/docs/reports/27_Bao_cao_GocSach.docx
+++ b/docs/reports/27_Bao_cao_GocSach.docx
@@ -232,6 +232,7 @@
               <w:rPr>
                 <w:sz w:val="18"/>
               </w:rPr>
+              <w:t>Nguyễn Kiều Thành</w:t>
             </w:r>
           </w:p>
         </w:tc>
@@ -253,6 +254,7 @@
               <w:rPr>
                 <w:sz w:val="18"/>
               </w:rPr>
+              <w:t>22110231</w:t>
             </w:r>
           </w:p>
         </w:tc>
@@ -301,6 +303,7 @@
               <w:rPr>
                 <w:sz w:val="18"/>
               </w:rPr>
+              <w:t>Nguyễn An Khang</w:t>
             </w:r>
           </w:p>
         </w:tc>
@@ -322,6 +325,7 @@
               <w:rPr>
                 <w:sz w:val="18"/>
               </w:rPr>
+              <w:t>22110160</w:t>
             </w:r>
           </w:p>
         </w:tc>
@@ -348,7 +352,7 @@
     </w:p>
     <w:p>
       <w:r>
-        <w:t>Tên và MSSV của hai thành viên được để trống theo yêu cầu chuẩn bị hồ sơ. Phân công API đã thống nhất cho ba người ngày 28/10/2026; mỗi người tiếp nhận phần việc, kiểm thử và trình bày theo phạm vi bên dưới. Các ví dụ prompt đã được biên soạn lại để giải thích cách làm, không phải nhật ký chat nguyên văn.</w:t>
+        <w:t>Phân công API đã thống nhất cho ba người ngày 28/10/2026; mỗi người tiếp nhận phần việc, kiểm thử và trình bày theo phạm vi bên dưới. Các ví dụ prompt đã được biên soạn lại để giải thích cách làm, không phải nhật ký chat nguyên văn.</w:t>
       </w:r>
     </w:p>
     <w:p>
@@ -621,7 +625,7 @@
               <w:rPr>
                 <w:sz w:val="18"/>
               </w:rPr>
-              <w:t>Giữ bản mẫu gốc và một bản Excel chỉnh local. Điểm cá nhân để trống chờ từng thành viên tự đánh giá.</w:t>
+              <w:t>Giữ bản mẫu gốc và một bản Excel chỉnh local. Điểm nhóm tự chấm là 78/100, tương đương 7,8/10 cho mỗi thành viên; đây không phải điểm của giảng viên.</w:t>
             </w:r>
           </w:p>
         </w:tc>
@@ -2144,7 +2148,7 @@
     </w:p>
     <w:p>
       <w:r>
-        <w:t>Minh chứng: bộ test xác thực, SecurityWebTest và JWT kiểm tra đường dẫn, phiên, CSRF và phân quyền. Đợt nghiệm thu này không gửi email OTP thật; cần thử hộp thư trên máy trình bày nếu demo chức năng email trực tiếp.</w:t>
+        <w:t>Minh chứng: bộ test xác thực, SecurityWebTest và JWT kiểm tra đường dẫn, phiên, CSRF và phân quyền. Compose đã kiểm tra nhận OTP qua Mailpit và kích hoạt tài khoản; chưa nghiệm thu gửi email Internet trong đợt cuối.</w:t>
       </w:r>
     </w:p>
     <w:p>
@@ -4605,7 +4609,7 @@
               <w:rPr>
                 <w:sz w:val="18"/>
               </w:rPr>
-              <w:t>Cài JDK 21 và PostgreSQL 17. Đặt JAVA_HOME đúng thư mục JDK; dùng Maven wrapper trong source.</w:t>
+              <w:t>Cài và mở Docker Desktop với Linux containers; clone repository.</w:t>
             </w:r>
           </w:p>
         </w:tc>
@@ -4654,7 +4658,7 @@
               <w:rPr>
                 <w:sz w:val="18"/>
               </w:rPr>
-              <w:t>Tạo database mới tên goc_sach_final_demo. Đọc và chạy sql/schema.sql một lần trên database trống, sau đó sql/demo-final.sql. Không chạy trên database bài tập hoặc goc_sach hiện hữu.</w:t>
+              <w:t>Nhận riêng file team.properties từ Bảo, đặt vào config. Không đưa key lên Git.</w:t>
             </w:r>
           </w:p>
         </w:tc>
@@ -4703,7 +4707,7 @@
               <w:rPr>
                 <w:sz w:val="18"/>
               </w:rPr>
-              <w:t>Sao chép config/local.example.properties thành file local ngoài Git. Điền db.url, db.user, db.password và otp.secret. Demo dùng payos.enabled=false; SMTP local không gửi email thật.</w:t>
+              <w:t>Tại thư mục dự án, chạy docker compose up -d --build --wait. Compose tự tạo PostgreSQL, schema/seed khi volume trống và khóa JWT riêng.</w:t>
             </w:r>
           </w:p>
         </w:tc>
@@ -4752,7 +4756,7 @@
               <w:rPr>
                 <w:sz w:val="18"/>
               </w:rPr>
-              <w:t>Chạy mvnw.cmd -B -ntp verify. Cần dòng BUILD SUCCESS và báo cáo test mới, không chỉ dựa vào mã thoát.</w:t>
+              <w:t>Mở http://localhost:8080; đăng nhập tài khoản demo. Hộp thư OTP local ở http://localhost:8025; không gửi email Internet.</w:t>
             </w:r>
           </w:p>
         </w:tc>
@@ -4801,7 +4805,7 @@
               <w:rPr>
                 <w:sz w:val="18"/>
               </w:rPr>
-              <w:t>Chạy java -Dbookstore.config=C:/duong-dan/config/demo.properties -jar target/goc-sach.jar. Mở localhost:8080; cấu hình thật và khóa không được đưa vào gói nộp.</w:t>
+              <w:t>Dừng bằng docker compose stop hoặc down để giữ volume. Không thêm -v nếu muốn giữ dữ liệu. Hướng dẫn đầy đủ: docs/DOCKER_QUICKSTART.md.</w:t>
             </w:r>
           </w:p>
         </w:tc>
@@ -5128,7 +5132,7 @@
     </w:p>
     <w:p>
       <w:r>
-        <w:t>Database demo đã được tạo mới và nhập schema/seed trên máy chuẩn bị. Database goc_sach cũ chưa được migrate. Muốn chạy bản mới trên dữ liệu cũ phải sao lưu, đối chiếu schema và áp dụng operations-manual.sql đúng một lần sau các migration nền cần thiết.</w:t>
+        <w:t>Compose đã được kiểm tra từ bản clone sạch: đăng ký/OTP, JWT, API, checkout COD và giữ dữ liệu sau khi tạo lại container. PayOS mặc định tắt; Cloudinary dùng cấu hình riêng. Database demo đã được tạo mới và nhập schema/seed trên máy chuẩn bị. Database goc_sach cũ chưa được migrate. Muốn chạy bản mới trên dữ liệu cũ phải sao lưu, đối chiếu schema và áp dụng operations-manual.sql đúng một lần sau các migration nền cần thiết.</w:t>
       </w:r>
     </w:p>
     <w:p>
@@ -5689,9 +5693,9 @@
               <w:rPr>
                 <w:sz w:val="18"/>
               </w:rPr>
-              <w:t>Thành viên 2</w:t>
+              <w:t>Nguyễn Kiều Thành</w:t>
               <w:br/>
-              <w:t>Họ tên:               MSSV:</w:t>
+              <w:t>22110231</w:t>
             </w:r>
           </w:p>
         </w:tc>
@@ -5740,9 +5744,9 @@
               <w:rPr>
                 <w:sz w:val="18"/>
               </w:rPr>
-              <w:t>Thành viên 3</w:t>
+              <w:t>Nguyễn An Khang</w:t>
               <w:br/>
-              <w:t>Họ tên:               MSSV:</w:t>
+              <w:t>22110160</w:t>
             </w:r>
           </w:p>
         </w:tc>
@@ -5809,7 +5813,7 @@
     </w:p>
     <w:p>
       <w:r>
-        <w:t>Điền tên/MSSV hai bạn; xác nhận phân công và tự chấm rubric; quay video có mặt cả ba người; bổ sung commit/review thật nếu chưa có. Tại mốc rà soát 26/10, lịch sử repository có 17 commit cùng một tác giả, chưa đủ chứng minh cộng tác ba người. Không tạo lịch sử giả. Chạy thử trên máy báo cáo và xác nhận payOS với giảng viên. Gói này được chuẩn bị local, chưa nộp lên thư mục lớp.</w:t>
+        <w:t>Rubric đã điền đủ thông tin và điểm nhóm tự chấm 7,8/10 cho mỗi người. Nhóm cần quay video có mặt cả ba người; bổ sung commit/review thật nếu chưa có. Chạy thử trên máy báo cáo và xác nhận payOS với giảng viên. Gói này được chuẩn bị local, chưa nộp lên thư mục lớp.</w:t>
       </w:r>
     </w:p>
     <w:p>
@@ -6160,7 +6164,7 @@
     <w:p/>
     <w:p>
       <w:r>
-        <w:t>Danh sách đầy đủ theo từng người nằm ở phụ lục báo cáo cá nhân. API/API_REFERENCE.md và API/API_ROUTES.json trong gói nộp ghi URL, quyền, body và query. Base demo có thể đổi sang http://127.0.0.1:18082; port mặc định là 8080.</w:t>
+        <w:t>Danh sách đầy đủ theo từng người nằm ở phụ lục báo cáo cá nhân. API/API_REFERENCE.md trong gói nộp ghi URL, quyền, body và query. Base demo có thể đổi sang http://127.0.0.1:18082; port mặc định là 8080.</w:t>
       </w:r>
     </w:p>
     <w:p>

</xml_diff>

<commit_message>
docs(reports): update AI prompts and online rubric
</commit_message>
<xml_diff>
--- a/docs/reports/27_Bao_cao_GocSach.docx
+++ b/docs/reports/27_Bao_cao_GocSach.docx
@@ -5666,7 +5666,7 @@
               <w:rPr>
                 <w:sz w:val="18"/>
               </w:rPr>
-              <w:t>Checkout, đơn buyer/seller, payOS/webhook, trả hàng, ghi nhận hoàn tiền và thông báo đơn; kiểm thử xuyên suốt luồng mua hàng.</w:t>
+              <w:t>Trưởng nhóm: phân công, theo dõi tiến độ, thống nhất API và tích hợp. Phụ trách checkout, đơn, payOS, trả/hoàn tiền và thông báo.</w:t>
             </w:r>
           </w:p>
         </w:tc>
@@ -5785,22 +5785,27 @@
         <w:pStyle w:val="Heading2"/>
       </w:pPr>
       <w:r>
-        <w:t>Cách dùng AI trong quá trình phát triển</w:t>
+        <w:t>AI trong phát triển chức năng và điều phối nhóm</w:t>
       </w:r>
     </w:p>
     <w:p>
       <w:r>
-        <w:t>AI được dùng để phân tích các tình huống dễ bỏ sót, đề xuất cấu trúc chức năng và hỗ trợ viết test. Với checkout, câu hỏi không dừng ở tạo đơn thành công mà còn xét việc hai người chọn cùng một cuốn, giá đổi giữa hai bước và người dùng bấm gửi lại. Phương án gợi ý được đối chiếu với quy tắc của Góc Sách rồi mới đưa vào source.</w:t>
+        <w:t>Bảo phụ trách điều phối và tích hợp: chia việc theo đầu ra có thể demo, theo dõi phần phụ thuộc giữa ba người, thống nhất DTO và kiểm tra phiên bản bàn giao. Thành dùng AI để phân tích luồng người mua và hỗ trợ API tài khoản, catalog, giỏ, review. Khang tập trung vào quyền theo shop, kho từng bản, cấu hình vận hành và API quản trị. Mỗi phần đều gắn yêu cầu sinh code với điều kiện từ chối và ca kiểm thử.</w:t>
       </w:r>
     </w:p>
     <w:p>
       <w:r>
-        <w:t>Ở giao diện, AI hỗ trợ diễn đạt trạng thái và rà soát thông tin người mua cần nhìn thấy. Ở thanh toán, AI hỗ trợ xây dựng fake gateway và danh sách ca lỗi. Kết quả cuối cùng được kiểm tra bằng test tự động, PostgreSQL và thao tác trên trình duyệt; phần chưa kiểm chứng với dịch vụ thật được giữ rõ trong báo cáo.</w:t>
+        <w:t>Danh mục 14 prompt được tổ chức theo mã trong mục 2 của báo cáo cá nhân: B01–B06 của Bảo, T01–T04 của Thành và K01–K04 của Khang. B01–B02 phục vụ quản lý tiến độ và thống nhất API; B06 phục vụ đóng gói, phối hợp demo và nghiệm thu. Các prompt còn lại đi từ nghiệp vụ cụ thể đến controller, service và kiểm thử tương ứng.</w:t>
       </w:r>
     </w:p>
     <w:p>
       <w:r>
-        <w:t>Ví dụ prompt biên soạn lại: “Một giỏ có sách của nhiều cửa hàng, mỗi cuốn chỉ tồn tại một bản. Hãy đề xuất cách khóa và tạo đơn để gửi lại request không bán trùng”; “Thiết kế test webhook lặp, sai tiền và tiền đến sau hủy; không gọi ngân hàng thật”. Không đưa khóa API hoặc thông tin khách hàng thật vào prompt.</w:t>
+        <w:t>Các prompt được biên soạn và tái dựng theo phạm vi phát triển của đồ án, không phải bản xuất lịch sử hội thoại. Khi đối chiếu quá trình sử dụng thực tế, từng thành viên xác nhận prompt phù hợp với phần mình và bổ sung minh chứng nếu có. Đầu ra yêu cầu trong prompt là tiêu chí kiểm tra, không mặc nhiên là kết quả đã đạt.</w:t>
+      </w:r>
+    </w:p>
+    <w:p>
+      <w:r>
+        <w:t>Cách làm chung là cung cấp bối cảnh và source liên quan, yêu cầu AI đề xuất thay đổi nhỏ, đọc lại kiểm tra quyền và dữ liệu, rồi chạy test trước khi ghép vào luồng chung. Các điểm nối cần review chéo: danh tính và giỏ của Thành, kho và voucher của Khang, báo giá và đơn hàng của Bảo. Kết quả kiểm thử, giới hạn dịch vụ thật và phần chưa hoàn thành được báo cáo riêng.</w:t>
       </w:r>
     </w:p>
     <w:p>

</xml_diff>

<commit_message>
docs(reports): refine project narrative
</commit_message>
<xml_diff>
--- a/docs/reports/27_Bao_cao_GocSach.docx
+++ b/docs/reports/27_Bao_cao_GocSach.docx
@@ -342,17 +342,17 @@
         <w:pStyle w:val="Heading2"/>
       </w:pPr>
       <w:r>
-        <w:t>Phạm vi bản bàn giao</w:t>
+        <w:t>Phạm vi đề tài</w:t>
       </w:r>
     </w:p>
     <w:p>
       <w:r>
-        <w:t>Hồ sơ cập nhật API và phân công ngày 28/10/2026; dữ liệu minh họa được chuẩn bị ngày 26/10/2026. Các ảnh giao diện được chụp từ ứng dụng chạy local. Kiểm thử thanh toán dùng cổng giả lập, không chuyển tiền thật. Báo cáo không coi kết quả giả lập là bằng chứng ngân hàng đã thanh toán.</w:t>
+        <w:t>Báo cáo trình bày kiến trúc, mô hình dữ liệu và các chức năng của Góc Sách, từ tìm kiếm sách, đặt hàng đến quản lý cửa hàng. Các luồng nghiệp vụ được minh họa bằng sơ đồ, giao diện và mã nguồn, kết hợp kiểm thử để đánh giá tính nhất quán và phân quyền.</w:t>
       </w:r>
     </w:p>
     <w:p>
       <w:r>
-        <w:t>Phân công API đã thống nhất cho ba người ngày 28/10/2026; mỗi người tiếp nhận phần việc, kiểm thử và trình bày theo phạm vi bên dưới. Các ví dụ prompt đã được biên soạn lại để giải thích cách làm, không phải nhật ký chat nguyên văn.</w:t>
+        <w:t>Nhóm tổ chức công việc thành ba mảng: trải nghiệm người mua; đơn hàng và thanh toán; cửa hàng và vận hành. Các mảng phối hợp thông qua API và quy tắc dữ liệu chung. Phần sử dụng AI trình bày các mẫu prompt gắn với yêu cầu phát triển từng chức năng.</w:t>
       </w:r>
     </w:p>
     <w:p>
@@ -409,12 +409,12 @@
         <w:pStyle w:val="Heading1"/>
       </w:pPr>
       <w:r>
-        <w:t>1 Yêu cầu và kế hoạch trình bày</w:t>
+        <w:t>1 Mục tiêu và phạm vi ứng dụng</w:t>
       </w:r>
     </w:p>
     <w:p>
       <w:r>
-        <w:t>Đối chiếu trang hướng dẫn cuối kỳ trên UTEx và bản rubric được tải về ngày 26/10/2026. Lịch báo cáo công bố: 29/10/2026, từ 07:00 đến 18:00 tại A5-203. Nhóm 27 ở thứ tự 28; chưa có giờ riêng được xác nhận. Hồ sơ cần nộp trước lượt báo cáo 30 phút.</w:t>
+        <w:t>Góc Sách hướng đến việc kết nối người mua với các cửa hàng sách cũ. Hệ thống quản lý từng bản sách vật lý, cung cấp thông tin tình trạng và giá bán, hỗ trợ đặt hàng theo cửa hàng và theo dõi toàn bộ quá trình xử lý đơn.</w:t>
       </w:r>
     </w:p>
     <w:tbl>
@@ -625,7 +625,7 @@
               <w:rPr>
                 <w:sz w:val="18"/>
               </w:rPr>
-              <w:t>Giữ bản mẫu gốc và một bản Excel chỉnh local. Điểm nhóm tự chấm là 78/100, tương đương 7,8/10 cho mỗi thành viên; đây không phải điểm của giảng viên.</w:t>
+              <w:t>Bảng tự đánh giá của nhóm được trình bày tại tab 27 trong rubric chung của lớp.</w:t>
             </w:r>
           </w:p>
         </w:tc>
@@ -674,7 +674,7 @@
               <w:rPr>
                 <w:sz w:val="18"/>
               </w:rPr>
-              <w:t>Có đường dẫn repository, cách sử dụng AI và prompt minh họa. Chưa có đủ bằng chứng cộng tác ba người; cần bổ sung hoạt động thật.</w:t>
+              <w:t>Repository lưu mã nguồn và tài liệu kỹ thuật; phần AI giới thiệu cách đặt yêu cầu, hỗ trợ xây dựng API và kiểm tra kết quả.</w:t>
             </w:r>
           </w:p>
         </w:tc>
@@ -723,7 +723,7 @@
               <w:rPr>
                 <w:sz w:val="18"/>
               </w:rPr>
-              <w:t>Mỗi thành viên cần xuất hiện, giới thiệu tên và giải thích chức năng phụ trách. Kịch bản có trong báo cáo cá nhân; video phải do nhóm quay.</w:t>
+              <w:t>Video minh họa các luồng chức năng và phần phụ trách của từng thành viên.</w:t>
             </w:r>
           </w:p>
         </w:tc>
@@ -772,7 +772,7 @@
               <w:rPr>
                 <w:sz w:val="18"/>
               </w:rPr>
-              <w:t>Dùng payOS trong source. Cần xác nhận với giảng viên việc thay lựa chọn VNPAY/MOMO trong yêu cầu bằng payOS.</w:t>
+              <w:t>Ứng dụng tích hợp payOS cho thanh toán trực tuyến và COD cho thanh toán khi nhận hàng.</w:t>
             </w:r>
           </w:p>
         </w:tc>
@@ -789,7 +789,7 @@
     </w:p>
     <w:p>
       <w:r>
-        <w:t>Các mục 2–3 giải thích kiến trúc và dữ liệu. Mục 4–12 đi theo các nhóm chức năng từ đăng nhập đến vận hành. Mục 13 hướng dẫn cài đặt và dữ liệu. Mục 14 tổng hợp kiểm thử. Mục 15 trình bày cách dùng AI, phân công và những việc cần làm trước khi nộp.</w:t>
+        <w:t>Các mục 2–3 giải thích kiến trúc và dữ liệu. Mục 4–12 đi theo các nhóm chức năng từ đăng nhập đến vận hành. Mục 13 hướng dẫn cài đặt và dữ liệu. Mục 14 tổng hợp kiểm thử. Mục 15 trình bày cách dùng AI, phân công và cách phối hợp phát triển.</w:t>
       </w:r>
     </w:p>
     <w:p>
@@ -811,7 +811,7 @@
     </w:p>
     <w:p>
       <w:r>
-        <w:t>Bản rubric được xem có thời điểm cập nhật 24/10/2026. Chỉ bản tải về máy được chỉnh sửa; không thay đổi sheet hoặc thư mục công khai của giảng viên.</w:t>
+        <w:t>Rubric của nhóm: https://docs.google.com/spreadsheets/d/13f45c1BgWIiv1SToJRQCnXyHbGX1lDLK/edit?gid=347682576#gid=347682576</w:t>
       </w:r>
     </w:p>
     <w:p>
@@ -1817,7 +1817,7 @@
     </w:p>
     <w:p>
       <w:r>
-        <w:t>Schema mới được tạo trên goc_sach_final_demo riêng. Database goc_sach hiện hữu đã được sao lưu nhưng chưa áp dụng migration vận hành. File operations-manual.sql là hướng dẫn nâng cấp có chủ đích; không chạy schema.sql lại trên database đang có dữ liệu.</w:t>
+        <w:t>Môi trường demo sử dụng database riêng với schema và dữ liệu mẫu. Khi triển khai trên database đã có dữ liệu, cần sao lưu và áp dụng migration phù hợp; schema.sql dùng để khởi tạo database trống.</w:t>
       </w:r>
     </w:p>
     <w:p>
@@ -2148,7 +2148,7 @@
     </w:p>
     <w:p>
       <w:r>
-        <w:t>Minh chứng: bộ test xác thực, SecurityWebTest và JWT kiểm tra đường dẫn, phiên, CSRF và phân quyền. Compose đã kiểm tra nhận OTP qua Mailpit và kích hoạt tài khoản; chưa nghiệm thu gửi email Internet trong đợt cuối.</w:t>
+        <w:t>Các test xác thực, SecurityWebTest và JWT kiểm tra phiên, CSRF và phân quyền. Mailpit phục vụ việc kiểm tra nhận OTP và kích hoạt tài khoản trong môi trường demo.</w:t>
       </w:r>
     </w:p>
     <w:p>
@@ -2435,7 +2435,7 @@
     <w:p/>
     <w:p>
       <w:r>
-        <w:t>Mỗi bảng giới hạn tối đa 20 đầu sách, 10 sách mỗi trang. Trang chủ có thêm sách bán trên 10 bản. Dữ liệu demo tạo 12 lượt mua hoàn tất của một đầu sách để kiểm chứng điều kiện này; đây là doanh số giả dùng cho trình bày.</w:t>
+        <w:t>Mỗi bảng giới hạn tối đa 20 đầu sách, 10 sách mỗi trang. Trang chủ có thêm sách bán trên 10 bản. Dữ liệu demo tạo 12 lượt mua hoàn tất của một đầu sách để kiểm chứng điều kiện này; dùng để minh họa cách tính thống kê bán hàng.</w:t>
       </w:r>
     </w:p>
     <w:p>
@@ -2815,7 +2815,7 @@
     </w:p>
     <w:p>
       <w:r>
-        <w:t>Kiểm tra PostgreSQL phát hiện khác biệt biểu diễn 10000 và 10000.00 làm báo giá bị xem là thay đổi. Fingerprint đã chuẩn hóa BigDecimal bằng stripTrailingZeros().toPlainString(); test hồi quy xác nhận hai biểu diễn cho cùng kết quả.</w:t>
+        <w:t>Fingerprint chuẩn hóa số tiền bằng stripTrailingZeros().toPlainString() để các giá trị tương đương như 10000 và 10000.00 tạo cùng kết quả. Test hồi quy kiểm tra tính nhất quán của báo giá.</w:t>
       </w:r>
     </w:p>
     <w:p>
@@ -3312,12 +3312,12 @@
     </w:p>
     <w:p>
       <w:r>
-        <w:t>Các nhánh thành công, hủy, lỗi API, chữ ký sai, giao dịch lặp và đến muộn được kiểm thử với fake gateway. Kết nối đọc cấu hình payOS đã trả HTTP 200, mã 101 cho mã đơn chưa phát hành. Chưa có nghiệm thu webhook công khai HTTPS hoặc thanh toán tiền thật trong đợt này. Chưa có hoàn tiền hay chuyển tiền cho shop tự động.</w:t>
+        <w:t>Kiểm thử thanh toán sử dụng cổng mô phỏng cho các nhánh thành công, hủy, lỗi API, chữ ký sai, giao dịch lặp và đến muộn. Khi triển khai payOS, cấu hình dịch vụ và webhook HTTPS cần được kiểm tra trong môi trường tích hợp.</w:t>
       </w:r>
     </w:p>
     <w:p>
       <w:r>
-        <w:t>Cổng giả chỉ nằm trong src/test và công cụ preview; không đóng vào JAR production. Khi trình bày phải gọi đúng là thanh toán mô phỏng, không sử dụng ảnh giả để khẳng định ngân hàng đã giao dịch.</w:t>
+        <w:t>Cổng mô phỏng được đặt trong mã kiểm thử và công cụ preview, tách biệt với adapter payOS của ứng dụng. Chức năng hoàn tiền hiện ghi nhận kết quả xử lý bên ngoài hệ thống.</w:t>
       </w:r>
     </w:p>
     <w:p>
@@ -3402,7 +3402,7 @@
     </w:p>
     <w:p>
       <w:r>
-        <w:t>FinalWebTest mở WebSocket thật qua HTTP server, xác nhận danh sách đúng tài khoản và nhận thay đổi sau thao tác hủy. Cần giải thích được vì sao thông báo không thay thế kiểm tra quyền khi người dùng mở chi tiết đơn.</w:t>
+        <w:t>FinalWebTest kiểm tra phạm vi thông báo theo tài khoản và sự kiện thay đổi đơn. Khi mở chi tiết đơn, service tiếp tục kiểm tra quyền truy cập độc lập với thông báo.</w:t>
       </w:r>
     </w:p>
     <w:p>
@@ -3746,7 +3746,7 @@
     </w:p>
     <w:p>
       <w:r>
-        <w:t>Dùng reader hoặc manager để mở shop 1, nhập một bản ngừng bán, phân loại rồi mở bán. Chuyển sang buyer tìm đúng bản đó; thử mở URL shop khác bằng tài khoản không có quyền để chứng minh kiểm tra ở server. Không dùng tài khoản Admin cho toàn bộ video vì sẽ che mất khác biệt quyền.</w:t>
+        <w:t>Luồng quản lý kho gồm nhập bản sách, phân loại, xác định giá và mở bán. Người mua chỉ thấy các bản đủ điều kiện; quyền cập nhật kho được giới hạn theo thành viên của từng cửa hàng.</w:t>
       </w:r>
     </w:p>
     <w:p>
@@ -3764,7 +3764,7 @@
     </w:p>
     <w:p>
       <w:r>
-        <w:t>Voucher có mã duy nhất, shop, số tiền giảm, ngưỡng đơn, hạn dùng và số lượt tối đa. Hệ thống kiểm tra lại khi đặt đơn dưới khóa dữ liệu. Hủy đơn hiện không trả lại lượt voucher; đây là quy tắc của phiên bản bàn giao, cần thông báo khi giải thích chương trình.</w:t>
+        <w:t>Voucher có mã duy nhất, shop, số tiền giảm, ngưỡng đơn, hạn dùng và số lượt tối đa. Hệ thống kiểm tra lại khi đặt đơn dưới khóa dữ liệu. Hủy đơn hiện không trả lại lượt voucher; đây là quy tắc áp dụng trong hệ thống.</w:t>
       </w:r>
     </w:p>
     <w:p>
@@ -4483,7 +4483,7 @@
     </w:p>
     <w:p>
       <w:r>
-        <w:t>Mã nguồn minh họa được trích từ checkout hiện tại; số dòng có thể đổi khi nhóm chỉnh sửa tiếp. Khi bảo vệ nên mở phương thức trong IDE và giải thích điều kiện đầu vào, transaction và trường hợp bị từ chối thay vì đọc thuộc đoạn code.</w:t>
+        <w:t>Mã nguồn minh họa thể hiện điều kiện đầu vào, ranh giới transaction và cách xử lý các trường hợp bị từ chối trong nghiệp vụ checkout.</w:t>
       </w:r>
     </w:p>
     <w:p>
@@ -5132,7 +5132,7 @@
     </w:p>
     <w:p>
       <w:r>
-        <w:t>Compose đã được kiểm tra từ bản clone sạch: đăng ký/OTP, JWT, API, checkout COD và giữ dữ liệu sau khi tạo lại container. PayOS mặc định tắt; Cloudinary dùng cấu hình riêng. Database demo đã được tạo mới và nhập schema/seed trên máy chuẩn bị. Database goc_sach cũ chưa được migrate. Muốn chạy bản mới trên dữ liệu cũ phải sao lưu, đối chiếu schema và áp dụng operations-manual.sql đúng một lần sau các migration nền cần thiết.</w:t>
+        <w:t>Docker Compose tổ chức app, PostgreSQL và Mailpit thành các dịch vụ riêng. Schema và dữ liệu mẫu chỉ được khởi tạo trên volume mới; dữ liệu được giữ khi tạo lại container. payOS mặc định tắt trong cấu hình học nhóm, các dịch vụ ngoài dùng file cấu hình riêng.</w:t>
       </w:r>
     </w:p>
     <w:p>
@@ -5150,7 +5150,7 @@
     </w:p>
     <w:p>
       <w:r>
-        <w:t>Mốc kiểm tra ngày 28/10/2026: bộ Maven verify đạt 230 test, không lỗi, không thất bại và không bỏ qua ở lần chạy hoàn chỉnh trước đóng gói. Bộ test bao gồm nghiệp vụ, HTTP, bảo mật, truy vấn JPA và adapter. Số này không có nghĩa mọi tích hợp bên ngoài đã nghiệm thu production.</w:t>
+        <w:t>Bộ kiểm thử Maven verify ghi nhận 230 test đạt, bao gồm nghiệp vụ, HTTP, bảo mật, truy vấn JPA và adapter. Các ca kiểm thử được tổ chức theo chức năng và các tình huống lỗi có thể ảnh hưởng dữ liệu.</w:t>
       </w:r>
     </w:p>
     <w:tbl>
@@ -5508,7 +5508,7 @@
               <w:rPr>
                 <w:sz w:val="18"/>
               </w:rPr>
-              <w:t>payOS đọc endpoint trả phản hồi; chưa test thanh toán thật/webhook Internet. Video Cloudinary chưa test upload thật.</w:t>
+              <w:t>Các adapter payOS và Cloudinary có cấu hình và kiểm thử riêng; kiểm tra dịch vụ thực tế được thực hiện theo môi trường triển khai.</w:t>
             </w:r>
           </w:p>
         </w:tc>
@@ -5525,7 +5525,7 @@
     </w:p>
     <w:p>
       <w:r>
-        <w:t>Fingerprint khác nhau do scale thập phân của PostgreSQL đã được chuẩn hóa và thêm test hồi quy. Chi tiết đơn được bổ sung giảm giá, mã voucher và đơn vị giao hàng để tổng tiền có thể đối chiếu. Các test HTTP được cập nhật theo hai script ngoài thực tế, vẫn giữ yêu cầu không có inline script.</w:t>
+        <w:t>Kiểm thử hồi quy tập trung vào chuẩn hóa số tiền, đối chiếu giảm giá và phí giao hàng, kiểm tra quyền và tính nhất quán giữa API với giao diện.</w:t>
       </w:r>
     </w:p>
     <w:p>
@@ -5533,12 +5533,12 @@
         <w:pStyle w:val="Heading2"/>
       </w:pPr>
       <w:r>
-        <w:t>Phần cần nghiệm thu tiếp</w:t>
+        <w:t>Hướng phát triển</w:t>
       </w:r>
     </w:p>
     <w:p>
       <w:r>
-        <w:t>Chưa đo tải hoặc chứng minh mọi trường hợp tranh lượt voucher cuối cùng trên nhiều JVM. Chưa kiểm tra mobile trên thiết bị thật, khả năng tiếp cận đầy đủ hoặc upload video dịch vụ thật. Bảng phí giao hàng, doanh thu và hoàn tiền là mô hình nội bộ; chưa kết nối vận đơn, quyết toán hoặc hoàn tiền ngân hàng tự động.</w:t>
+        <w:t>Hướng phát triển gồm đánh giá tải trên nhiều instance, tối ưu trải nghiệm di động và khả năng tiếp cận. Các tích hợp vận đơn, quyết toán và hoàn tiền ngân hàng tự động có thể mở rộng từ mô hình vận hành hiện tại.</w:t>
       </w:r>
     </w:p>
     <w:p>
@@ -5551,7 +5551,7 @@
         <w:pStyle w:val="Heading1"/>
       </w:pPr>
       <w:r>
-        <w:t>15 Phân công sử dụng AI và chuẩn bị nộp</w:t>
+        <w:t>15 Phân công và ứng dụng AI</w:t>
       </w:r>
     </w:p>
     <w:tbl>
@@ -5777,7 +5777,7 @@
     <w:p/>
     <w:p>
       <w:r>
-        <w:t>Phân chia nhằm để mỗi người có một luồng đủ đầu vào, xử lý và kết quả để giải thích. Những phần giao nhau cần cùng review: người phụ trách giao diện thống nhất DTO với checkout; người phụ trách vận hành thống nhất trạng thái kho và tiền với thanh toán. TV2 bàn giao danh tính và giỏ cho TV1; TV3 bàn giao kho, voucher và phí. TV1 xử lý đổi kho từ đơn/trả hàng. Tự chấm điểm và lịch sử đóng góp phải dựa trên việc thực tế.</w:t>
+        <w:t>Các thành viên phối hợp tại những điểm giao nhau của nghiệp vụ: Thành cung cấp danh tính, địa chỉ và giỏ; Khang cung cấp kho, voucher và phí; Bảo xử lý báo giá, đơn hàng và thay đổi kho phát sinh từ đặt, hủy hoặc trả hàng. DTO và quy tắc trạng thái được thống nhất để các phần hoạt động đồng bộ.</w:t>
       </w:r>
     </w:p>
     <w:p>
@@ -5800,7 +5800,7 @@
     </w:p>
     <w:p>
       <w:r>
-        <w:t>Các prompt được biên soạn và tái dựng theo phạm vi phát triển của đồ án, không phải bản xuất lịch sử hội thoại. Khi đối chiếu quá trình sử dụng thực tế, từng thành viên xác nhận prompt phù hợp với phần mình và bổ sung minh chứng nếu có. Đầu ra yêu cầu trong prompt là tiêu chí kiểm tra, không mặc nhiên là kết quả đã đạt.</w:t>
+        <w:t>Các mẫu prompt minh họa cách chuyển yêu cầu nghiệp vụ thành nhiệm vụ phát triển: cung cấp bối cảnh, xác định đầu vào và đầu ra, nêu ràng buộc dữ liệu và yêu cầu kiểm thử. Nội dung được nhóm theo chức năng để thuận tiện tham khảo.</w:t>
       </w:r>
     </w:p>
     <w:p>
@@ -5813,12 +5813,12 @@
         <w:pStyle w:val="Heading2"/>
       </w:pPr>
       <w:r>
-        <w:t>Trước khi nộp</w:t>
+        <w:t>Tổ chức tài liệu dự án</w:t>
       </w:r>
     </w:p>
     <w:p>
       <w:r>
-        <w:t>Rubric đã điền đủ thông tin và điểm nhóm tự chấm 7,8/10 cho mỗi người. Nhóm cần quay video có mặt cả ba người; bổ sung commit/review thật nếu chưa có. Chạy thử trên máy báo cáo và xác nhận payOS với giảng viên. Gói này được chuẩn bị local, chưa nộp lên thư mục lớp.</w:t>
+        <w:t>Hồ sơ gồm báo cáo chung, báo cáo từng thành viên, mã nguồn, SQL và hướng dẫn cài đặt. Báo cáo chung mô tả hệ thống; báo cáo cá nhân trình bày sâu hơn các API và quy trình thuộc từng phần phụ trách.</w:t>
       </w:r>
     </w:p>
     <w:p>
@@ -5937,7 +5937,7 @@
     </w:p>
     <w:p>
       <w:r>
-        <w:t>Bản cập nhật bổ sung REST API cho những chức năng trước đây chỉ có form web. Controller dùng lại service hiện có, giữ kiểm tra quyền và transaction. Không thêm schema hoặc migrate database trong lần cập nhật API này.</w:t>
+        <w:t>REST API và form web dùng chung service để thống nhất nghiệp vụ, kiểm tra quyền và transaction. Cách tổ chức này giúp giao diện và các client API tuân theo cùng quy tắc xử lý.</w:t>
       </w:r>
     </w:p>
     <w:tbl>
@@ -6169,7 +6169,7 @@
     <w:p/>
     <w:p>
       <w:r>
-        <w:t>Danh sách đầy đủ theo từng người nằm ở phụ lục báo cáo cá nhân. API/API_REFERENCE.md trong gói nộp ghi URL, quyền, body và query. Base demo có thể đổi sang http://127.0.0.1:18082; port mặc định là 8080.</w:t>
+        <w:t>Danh sách đầy đủ theo từng người nằm ở phụ lục báo cáo cá nhân. API/API_REFERENCE.md trong gói nộp ghi URL, quyền, body và query. Port mặc định là 8080 và có thể thay đổi theo cấu hình triển khai.</w:t>
       </w:r>
     </w:p>
     <w:p>
@@ -6196,7 +6196,7 @@
       <w:pStyle w:val="Footer"/>
     </w:pPr>
     <w:r>
-      <w:t xml:space="preserve">Hồ sơ ngày 28 tháng 10 năm 2026                                           </w:t>
+      <w:t xml:space="preserve">Góc Sách • Đồ án Lập trình Web                                           </w:t>
     </w:r>
     <w:fldSimple w:instr="PAGE"/>
   </w:p>

</xml_diff>

<commit_message>
docs(report): fix cover frame
</commit_message>
<xml_diff>
--- a/docs/reports/27_Bao_cao_GocSach.docx
+++ b/docs/reports/27_Bao_cao_GocSach.docx
@@ -2,280 +2,308 @@
 <file path=word/document.xml><?xml version="1.0" encoding="utf-8"?>
 <w:document xmlns:wpc="http://schemas.microsoft.com/office/word/2010/wordprocessingCanvas" xmlns:cx="http://schemas.microsoft.com/office/drawing/2014/chartex" xmlns:mc="http://schemas.openxmlformats.org/markup-compatibility/2006" xmlns:o="urn:schemas-microsoft-com:office:office" xmlns:r="http://schemas.openxmlformats.org/officeDocument/2006/relationships" xmlns:m="http://schemas.openxmlformats.org/officeDocument/2006/math" xmlns:v="urn:schemas-microsoft-com:vml" xmlns:wp14="http://schemas.microsoft.com/office/word/2010/wordprocessingDrawing" xmlns:wp="http://schemas.openxmlformats.org/drawingml/2006/wordprocessingDrawing" xmlns:w10="urn:schemas-microsoft-com:office:word" xmlns:w="http://schemas.openxmlformats.org/wordprocessingml/2006/main" xmlns:w14="http://schemas.microsoft.com/office/word/2010/wordml" xmlns:w15="http://schemas.microsoft.com/office/word/2012/wordml" xmlns:w16se="http://schemas.microsoft.com/office/word/2015/wordml/symex" xmlns:wpg="http://schemas.microsoft.com/office/word/2010/wordprocessingGroup" xmlns:wpi="http://schemas.microsoft.com/office/word/2010/wordprocessingInk" xmlns:wne="http://schemas.microsoft.com/office/word/2006/wordml" xmlns:wps="http://schemas.microsoft.com/office/word/2010/wordprocessingShape" mc:Ignorable="w14 w15 w16se wp14">
   <w:body>
+    <w:tbl>
+      <w:tblPr>
+        <w:tblW w:w="10374" w:type="dxa"/>
+        <w:jc w:val="center"/>
+        <w:tblBorders>
+          <w:top w:val="double" w:sz="20" w:space="0" w:color="000080"/>
+          <w:left w:val="double" w:sz="20" w:space="0" w:color="000080"/>
+          <w:bottom w:val="double" w:sz="20" w:space="0" w:color="000080"/>
+          <w:right w:val="double" w:sz="20" w:space="0" w:color="000080"/>
+        </w:tblBorders>
+        <w:tblLayout w:type="fixed"/>
+        <w:tblLook w:val="04A0" w:firstRow="1" w:lastRow="0" w:firstColumn="1" w:lastColumn="0" w:noHBand="0" w:noVBand="1"/>
+      </w:tblPr>
+      <w:tblGrid>
+        <w:gridCol w:w="10374"/>
+      </w:tblGrid>
+      <w:tr>
+        <w:trPr>
+          <w:cantSplit/>
+          <w:trHeight w:hRule="exact" w:val="14854"/>
+          <w:jc w:val="center"/>
+        </w:trPr>
+        <w:tc>
+          <w:tcPr>
+            <w:tcW w:w="10375" w:type="dxa"/>
+            <w:tcMar>
+              <w:top w:w="340" w:type="dxa"/>
+              <w:left w:w="340" w:type="dxa"/>
+              <w:bottom w:w="340" w:type="dxa"/>
+              <w:right w:w="340" w:type="dxa"/>
+            </w:tcMar>
+            <w:vAlign w:val="center"/>
+          </w:tcPr>
+          <w:p>
+            <w:pPr>
+              <w:spacing w:after="160"/>
+              <w:jc w:val="center"/>
+            </w:pPr>
+            <w:bookmarkStart w:id="0" w:name="_GoBack"/>
+            <w:bookmarkEnd w:id="0"/>
+            <w:r>
+              <w:rPr>
+                <w:b/>
+                <w:sz w:val="26"/>
+              </w:rPr>
+              <w:t>BỘ GIÁO DỤC VÀ ĐÀO TẠO</w:t>
+            </w:r>
+          </w:p>
+          <w:p>
+            <w:pPr>
+              <w:spacing w:after="160"/>
+              <w:jc w:val="center"/>
+            </w:pPr>
+            <w:r>
+              <w:rPr>
+                <w:b/>
+                <w:sz w:val="26"/>
+              </w:rPr>
+              <w:t>TRƯỜNG ĐẠI HỌC CÔNG NGHỆ KỸ THUẬT TP.HCM</w:t>
+            </w:r>
+          </w:p>
+          <w:p>
+            <w:pPr>
+              <w:spacing w:after="600"/>
+              <w:jc w:val="center"/>
+            </w:pPr>
+            <w:r>
+              <w:rPr>
+                <w:b/>
+                <w:sz w:val="26"/>
+              </w:rPr>
+              <w:t>KHOA CÔNG NGHỆ THÔNG TIN</w:t>
+            </w:r>
+          </w:p>
+          <w:p>
+            <w:pPr>
+              <w:spacing w:after="480"/>
+              <w:jc w:val="center"/>
+            </w:pPr>
+            <w:r>
+              <w:rPr>
+                <w:noProof/>
+              </w:rPr>
+              <w:drawing>
+                <wp:inline distT="0" distB="0" distL="0" distR="0">
+                  <wp:extent cx="1102112" cy="1332000"/>
+                  <wp:effectExtent l="0" t="0" r="0" b="0"/>
+                  <wp:docPr id="1" name="Picture 1"/>
+                  <wp:cNvGraphicFramePr>
+                    <a:graphicFrameLocks xmlns:a="http://schemas.openxmlformats.org/drawingml/2006/main" noChangeAspect="1"/>
+                  </wp:cNvGraphicFramePr>
+                  <a:graphic xmlns:a="http://schemas.openxmlformats.org/drawingml/2006/main">
+                    <a:graphicData uri="http://schemas.openxmlformats.org/drawingml/2006/picture">
+                      <pic:pic xmlns:pic="http://schemas.openxmlformats.org/drawingml/2006/picture">
+                        <pic:nvPicPr>
+                          <pic:cNvPr id="0" name="cover-0-Image28.png"/>
+                          <pic:cNvPicPr/>
+                        </pic:nvPicPr>
+                        <pic:blipFill>
+                          <a:blip r:embed="rId8"/>
+                          <a:stretch>
+                            <a:fillRect/>
+                          </a:stretch>
+                        </pic:blipFill>
+                        <pic:spPr>
+                          <a:xfrm>
+                            <a:off x="0" y="0"/>
+                            <a:ext cx="1102112" cy="1332000"/>
+                          </a:xfrm>
+                          <a:prstGeom prst="rect">
+                            <a:avLst/>
+                          </a:prstGeom>
+                        </pic:spPr>
+                      </pic:pic>
+                    </a:graphicData>
+                  </a:graphic>
+                </wp:inline>
+              </w:drawing>
+            </w:r>
+          </w:p>
+          <w:p>
+            <w:pPr>
+              <w:spacing w:after="240"/>
+              <w:jc w:val="center"/>
+            </w:pPr>
+            <w:r>
+              <w:rPr>
+                <w:b/>
+                <w:sz w:val="40"/>
+              </w:rPr>
+              <w:t>BÁO CÁO ĐỒ ÁN CUỐI KỲ</w:t>
+            </w:r>
+          </w:p>
+          <w:p>
+            <w:pPr>
+              <w:spacing w:after="480"/>
+              <w:jc w:val="center"/>
+            </w:pPr>
+            <w:r>
+              <w:rPr>
+                <w:b/>
+                <w:sz w:val="32"/>
+              </w:rPr>
+              <w:t>MÔN HỌC: LẬP TRÌNH WEB</w:t>
+            </w:r>
+          </w:p>
+          <w:p>
+            <w:pPr>
+              <w:spacing w:after="200"/>
+              <w:jc w:val="center"/>
+            </w:pPr>
+            <w:r>
+              <w:rPr>
+                <w:b/>
+                <w:sz w:val="44"/>
+              </w:rPr>
+              <w:t>GÓC SÁCH</w:t>
+            </w:r>
+          </w:p>
+          <w:p>
+            <w:pPr>
+              <w:spacing w:after="240"/>
+              <w:jc w:val="center"/>
+            </w:pPr>
+            <w:r>
+              <w:rPr>
+                <w:b/>
+                <w:sz w:val="32"/>
+              </w:rPr>
+              <w:t>XÂY DỰNG WEBSITE QUẢN LÝ</w:t>
+            </w:r>
+            <w:r>
+              <w:rPr>
+                <w:b/>
+                <w:sz w:val="32"/>
+              </w:rPr>
+              <w:br/>
+              <w:t>CHUỖI CỬA HÀNG SÁCH CŨ</w:t>
+            </w:r>
+          </w:p>
+          <w:p>
+            <w:pPr>
+              <w:spacing w:after="560"/>
+              <w:jc w:val="center"/>
+            </w:pPr>
+            <w:r>
+              <w:t>Spring Boot · Thymeleaf · JPA · PostgreSQL</w:t>
+            </w:r>
+            <w:r>
+              <w:br/>
+              <w:t>Spring Security · JWT · WebSocket · payOS · Cloudinary</w:t>
+            </w:r>
+          </w:p>
+          <w:p>
+            <w:pPr>
+              <w:tabs>
+                <w:tab w:val="left" w:pos="4252"/>
+              </w:tabs>
+              <w:ind w:left="1701"/>
+            </w:pPr>
+            <w:r>
+              <w:t>Giảng viên hướng dẫn: ThS. Nguyễn Hữu Trung</w:t>
+            </w:r>
+          </w:p>
+          <w:p>
+            <w:pPr>
+              <w:tabs>
+                <w:tab w:val="left" w:pos="4252"/>
+              </w:tabs>
+              <w:ind w:left="1701"/>
+            </w:pPr>
+            <w:r>
+              <w:t>Lớp học phần: Nhóm 11 – ST2 – ST4 – A109</w:t>
+            </w:r>
+          </w:p>
+          <w:p>
+            <w:pPr>
+              <w:tabs>
+                <w:tab w:val="left" w:pos="4252"/>
+              </w:tabs>
+              <w:ind w:left="1701"/>
+            </w:pPr>
+            <w:r>
+              <w:t>Nhóm thực hiện: 27     |     Đề tài: 14</w:t>
+            </w:r>
+          </w:p>
+          <w:p>
+            <w:pPr>
+              <w:tabs>
+                <w:tab w:val="left" w:pos="4252"/>
+              </w:tabs>
+              <w:ind w:left="1701"/>
+            </w:pPr>
+            <w:r>
+              <w:t>Sinh viên thực hiện:</w:t>
+            </w:r>
+          </w:p>
+          <w:p>
+            <w:pPr>
+              <w:tabs>
+                <w:tab w:val="left" w:pos="4252"/>
+              </w:tabs>
+              <w:ind w:left="1701"/>
+            </w:pPr>
+            <w:r>
+              <w:t>Lê Trọng Bảo</w:t>
+            </w:r>
+            <w:r>
+              <w:tab/>
+              <w:t>22110106</w:t>
+            </w:r>
+          </w:p>
+          <w:p>
+            <w:pPr>
+              <w:tabs>
+                <w:tab w:val="left" w:pos="4252"/>
+              </w:tabs>
+              <w:ind w:left="1701"/>
+            </w:pPr>
+            <w:r>
+              <w:t>Nguyễn Kiều Thành</w:t>
+            </w:r>
+            <w:r>
+              <w:tab/>
+              <w:t>22110231</w:t>
+            </w:r>
+          </w:p>
+          <w:p>
+            <w:pPr>
+              <w:tabs>
+                <w:tab w:val="left" w:pos="4252"/>
+              </w:tabs>
+              <w:ind w:left="1701"/>
+            </w:pPr>
+            <w:r>
+              <w:t>Nguyễn An Khang</w:t>
+            </w:r>
+            <w:r>
+              <w:tab/>
+              <w:t>22110160</w:t>
+            </w:r>
+          </w:p>
+          <w:p>
+            <w:pPr>
+              <w:spacing w:before="480" w:after="0"/>
+              <w:jc w:val="center"/>
+            </w:pPr>
+            <w:r>
+              <w:t>Thành phố Hồ Chí Minh – 2026</w:t>
+            </w:r>
+          </w:p>
+        </w:tc>
+      </w:tr>
+    </w:tbl>
     <w:p>
       <w:pPr>
-        <w:spacing w:after="160"/>
-        <w:jc w:val="center"/>
-      </w:pPr>
-      <w:bookmarkStart w:id="0" w:name="_GoBack"/>
-      <w:bookmarkEnd w:id="0"/>
-      <w:r>
-        <w:rPr>
-          <w:b/>
-          <w:sz w:val="26"/>
-        </w:rPr>
-        <w:t>BỘ GIÁO DỤC VÀ ĐÀO TẠO</w:t>
-      </w:r>
-    </w:p>
-    <w:p>
-      <w:pPr>
-        <w:spacing w:after="160"/>
-        <w:jc w:val="center"/>
-      </w:pPr>
-      <w:r>
-        <w:rPr>
-          <w:b/>
-          <w:sz w:val="26"/>
-        </w:rPr>
-        <w:t>TRƯỜNG ĐẠI HỌC CÔNG NGHỆ KỸ THUẬT TP.HCM</w:t>
-      </w:r>
-    </w:p>
-    <w:p>
-      <w:pPr>
-        <w:spacing w:after="600"/>
-        <w:jc w:val="center"/>
-      </w:pPr>
-      <w:r>
-        <w:rPr>
-          <w:b/>
-          <w:sz w:val="26"/>
-        </w:rPr>
-        <w:t>KHOA CÔNG NGHỆ THÔNG TIN</w:t>
-      </w:r>
-    </w:p>
-    <w:p>
-      <w:pPr>
-        <w:spacing w:after="480"/>
-        <w:jc w:val="center"/>
-      </w:pPr>
-      <w:r>
-        <w:rPr>
-          <w:noProof/>
-        </w:rPr>
-        <w:drawing>
-          <wp:inline distT="0" distB="0" distL="0" distR="0">
-            <wp:extent cx="1102112" cy="1332000"/>
-            <wp:effectExtent l="0" t="0" r="0" b="0"/>
-            <wp:docPr id="1" name="Picture 1"/>
-            <wp:cNvGraphicFramePr>
-              <a:graphicFrameLocks xmlns:a="http://schemas.openxmlformats.org/drawingml/2006/main" noChangeAspect="1"/>
-            </wp:cNvGraphicFramePr>
-            <a:graphic xmlns:a="http://schemas.openxmlformats.org/drawingml/2006/main">
-              <a:graphicData uri="http://schemas.openxmlformats.org/drawingml/2006/picture">
-                <pic:pic xmlns:pic="http://schemas.openxmlformats.org/drawingml/2006/picture">
-                  <pic:nvPicPr>
-                    <pic:cNvPr id="0" name="cover-0-Image28.png"/>
-                    <pic:cNvPicPr/>
-                  </pic:nvPicPr>
-                  <pic:blipFill>
-                    <a:blip r:embed="rId8"/>
-                    <a:stretch>
-                      <a:fillRect/>
-                    </a:stretch>
-                  </pic:blipFill>
-                  <pic:spPr>
-                    <a:xfrm>
-                      <a:off x="0" y="0"/>
-                      <a:ext cx="1102112" cy="1332000"/>
-                    </a:xfrm>
-                    <a:prstGeom prst="rect">
-                      <a:avLst/>
-                    </a:prstGeom>
-                  </pic:spPr>
-                </pic:pic>
-              </a:graphicData>
-            </a:graphic>
-          </wp:inline>
-        </w:drawing>
-      </w:r>
-    </w:p>
-    <w:p>
-      <w:pPr>
-        <w:spacing w:after="240"/>
-        <w:jc w:val="center"/>
-      </w:pPr>
-      <w:r>
-        <w:rPr>
-          <w:b/>
-          <w:sz w:val="40"/>
-        </w:rPr>
-        <w:t>BÁO CÁO ĐỒ ÁN CUỐI KỲ</w:t>
-      </w:r>
-    </w:p>
-    <w:p>
-      <w:pPr>
-        <w:spacing w:after="480"/>
-        <w:jc w:val="center"/>
-      </w:pPr>
-      <w:r>
-        <w:rPr>
-          <w:b/>
-          <w:sz w:val="32"/>
-        </w:rPr>
-        <w:t>MÔN HỌC: LẬP TRÌNH WEB</w:t>
-      </w:r>
-    </w:p>
-    <w:p>
-      <w:pPr>
-        <w:spacing w:after="200"/>
-        <w:jc w:val="center"/>
-      </w:pPr>
-      <w:r>
-        <w:rPr>
-          <w:b/>
-          <w:sz w:val="44"/>
-        </w:rPr>
-        <w:t>GÓC SÁCH</w:t>
-      </w:r>
-    </w:p>
-    <w:p>
-      <w:pPr>
-        <w:spacing w:after="240"/>
-        <w:jc w:val="center"/>
-      </w:pPr>
-      <w:r>
-        <w:rPr>
-          <w:b/>
-          <w:sz w:val="32"/>
-        </w:rPr>
-        <w:t>XÂY DỰNG WEBSITE QUẢN LÝ</w:t>
-      </w:r>
-      <w:r>
-        <w:rPr>
-          <w:b/>
-          <w:sz w:val="32"/>
-        </w:rPr>
-        <w:br/>
-        <w:t>CHUỖI CỬA HÀNG SÁCH CŨ</w:t>
-      </w:r>
-    </w:p>
-    <w:p>
-      <w:pPr>
-        <w:spacing w:after="560"/>
-        <w:jc w:val="center"/>
-      </w:pPr>
-      <w:r>
-        <w:t>Spring Boot · Thymeleaf · JPA · PostgreSQL</w:t>
-      </w:r>
-      <w:r>
-        <w:br/>
-        <w:t xml:space="preserve">Spring Security · </w:t>
-      </w:r>
-      <w:r>
-        <w:t>JWT · WebSocket · payOS · Cloudinary</w:t>
-      </w:r>
-    </w:p>
-    <w:p>
-      <w:pPr>
-        <w:tabs>
-          <w:tab w:val="left" w:pos="4252"/>
-        </w:tabs>
-        <w:ind w:left="1701"/>
-      </w:pPr>
-      <w:r>
-        <w:t>Giảng viên hướng dẫn: ThS. Nguyễn Hữu Trung</w:t>
-      </w:r>
-    </w:p>
-    <w:p>
-      <w:pPr>
-        <w:tabs>
-          <w:tab w:val="left" w:pos="4252"/>
-        </w:tabs>
-        <w:ind w:left="1701"/>
-      </w:pPr>
-      <w:r>
-        <w:t>Lớp học phần: Nhóm 11 – ST2 – ST4 – A109</w:t>
-      </w:r>
-    </w:p>
-    <w:p>
-      <w:pPr>
-        <w:tabs>
-          <w:tab w:val="left" w:pos="4252"/>
-        </w:tabs>
-        <w:ind w:left="1701"/>
-      </w:pPr>
-      <w:r>
-        <w:t>Nhóm thực hiện: 27     |     Đề tài: 14</w:t>
-      </w:r>
-    </w:p>
-    <w:p>
-      <w:pPr>
-        <w:tabs>
-          <w:tab w:val="left" w:pos="4252"/>
-        </w:tabs>
-        <w:ind w:left="1701"/>
-      </w:pPr>
-      <w:r>
-        <w:t>Sinh viên thực hiện:</w:t>
-      </w:r>
-    </w:p>
-    <w:p>
-      <w:pPr>
-        <w:tabs>
-          <w:tab w:val="left" w:pos="4252"/>
-        </w:tabs>
-        <w:ind w:left="1701"/>
-      </w:pPr>
-      <w:r>
-        <w:t>Lê Trọng Bảo</w:t>
-      </w:r>
-      <w:r>
-        <w:tab/>
-        <w:t>22110106</w:t>
-      </w:r>
-    </w:p>
-    <w:p>
-      <w:pPr>
-        <w:tabs>
-          <w:tab w:val="left" w:pos="4252"/>
-        </w:tabs>
-        <w:ind w:left="1701"/>
-      </w:pPr>
-      <w:r>
-        <w:t>Nguyễn Kiều Thành</w:t>
-      </w:r>
-      <w:r>
-        <w:tab/>
-        <w:t>22110231</w:t>
-      </w:r>
-    </w:p>
-    <w:p>
-      <w:pPr>
-        <w:tabs>
-          <w:tab w:val="left" w:pos="4252"/>
-        </w:tabs>
-        <w:ind w:left="1701"/>
-      </w:pPr>
-      <w:r>
-        <w:t>Nguyễn An Khang</w:t>
-      </w:r>
-      <w:r>
-        <w:tab/>
-        <w:t>22110160</w:t>
-      </w:r>
-    </w:p>
-    <w:p>
-      <w:pPr>
-        <w:spacing w:before="480" w:after="0"/>
-        <w:jc w:val="center"/>
-      </w:pPr>
-      <w:r>
-        <w:t>Thành phố Hồ Chí Minh – 2026</w:t>
-      </w:r>
-    </w:p>
-    <w:p>
-      <w:pPr>
+        <w:spacing w:after="0" w:line="20" w:lineRule="exact"/>
         <w:sectPr>
           <w:headerReference w:type="default" r:id="rId9"/>
           <w:footerReference w:type="default" r:id="rId10"/>
           <w:pgSz w:w="11906" w:h="16838"/>
-          <w:pgMar w:top="1247" w:right="1134" w:bottom="1134" w:left="1417" w:header="510" w:footer="510" w:gutter="0"/>
-          <w:pgBorders w:offsetFrom="page">
-            <w:top w:val="double" w:sz="18" w:space="25" w:color="000080"/>
-            <w:left w:val="double" w:sz="18" w:space="25" w:color="000080"/>
-            <w:bottom w:val="double" w:sz="18" w:space="25" w:color="000080"/>
-            <w:right w:val="double" w:sz="18" w:space="25" w:color="000080"/>
-          </w:pgBorders>
+          <w:pgMar w:top="765" w:right="765" w:bottom="765" w:left="765" w:header="510" w:footer="510" w:gutter="0"/>
           <w:cols w:space="720"/>
           <w:docGrid w:linePitch="360"/>
         </w:sectPr>
@@ -326,7 +354,7 @@
         </w:rPr>
         <w:fldChar w:fldCharType="separate"/>
       </w:r>
-      <w:hyperlink w:anchor="_Toc244162604" w:history="1">
+      <w:hyperlink w:anchor="_Toc244163823" w:history="1">
         <w:r>
           <w:rPr>
             <w:rStyle w:val="Hyperlink"/>
@@ -357,7 +385,7 @@
             <w:webHidden/>
             <w:sz w:val="22"/>
           </w:rPr>
-          <w:instrText xml:space="preserve"> PAGEREF _Toc244162604 \h </w:instrText>
+          <w:instrText xml:space="preserve"> PAGEREF _Toc244163823 \h </w:instrText>
         </w:r>
         <w:r>
           <w:rPr>
@@ -406,7 +434,7 @@
           <w:sz w:val="22"/>
         </w:rPr>
       </w:pPr>
-      <w:hyperlink w:anchor="_Toc244162605" w:history="1">
+      <w:hyperlink w:anchor="_Toc244163824" w:history="1">
         <w:r>
           <w:rPr>
             <w:rStyle w:val="Hyperlink"/>
@@ -437,7 +465,7 @@
             <w:webHidden/>
             <w:sz w:val="22"/>
           </w:rPr>
-          <w:instrText xml:space="preserve"> PAGEREF _Toc244162605 \h </w:instrText>
+          <w:instrText xml:space="preserve"> PAGEREF _Toc244163824 \h </w:instrText>
         </w:r>
         <w:r>
           <w:rPr>
@@ -486,7 +514,7 @@
           <w:sz w:val="22"/>
         </w:rPr>
       </w:pPr>
-      <w:hyperlink w:anchor="_Toc244162606" w:history="1">
+      <w:hyperlink w:anchor="_Toc244163825" w:history="1">
         <w:r>
           <w:rPr>
             <w:rStyle w:val="Hyperlink"/>
@@ -517,7 +545,7 @@
             <w:webHidden/>
             <w:sz w:val="22"/>
           </w:rPr>
-          <w:instrText xml:space="preserve"> PAGEREF _Toc244162606 \h </w:instrText>
+          <w:instrText xml:space="preserve"> PAGEREF _Toc244163825 \h </w:instrText>
         </w:r>
         <w:r>
           <w:rPr>
@@ -566,7 +594,7 @@
           <w:sz w:val="22"/>
         </w:rPr>
       </w:pPr>
-      <w:hyperlink w:anchor="_Toc244162607" w:history="1">
+      <w:hyperlink w:anchor="_Toc244163826" w:history="1">
         <w:r>
           <w:rPr>
             <w:rStyle w:val="Hyperlink"/>
@@ -597,7 +625,7 @@
             <w:webHidden/>
             <w:sz w:val="22"/>
           </w:rPr>
-          <w:instrText xml:space="preserve"> PAGEREF _Toc244162607 \h </w:instrText>
+          <w:instrText xml:space="preserve"> PAGEREF _Toc244163826 \h </w:instrText>
         </w:r>
         <w:r>
           <w:rPr>
@@ -646,7 +674,7 @@
           <w:sz w:val="22"/>
         </w:rPr>
       </w:pPr>
-      <w:hyperlink w:anchor="_Toc244162608" w:history="1">
+      <w:hyperlink w:anchor="_Toc244163827" w:history="1">
         <w:r>
           <w:rPr>
             <w:rStyle w:val="Hyperlink"/>
@@ -677,7 +705,7 @@
             <w:webHidden/>
             <w:sz w:val="22"/>
           </w:rPr>
-          <w:instrText xml:space="preserve"> PAGEREF _Toc244162608 \h </w:instrText>
+          <w:instrText xml:space="preserve"> PAGEREF _Toc244163827 \h </w:instrText>
         </w:r>
         <w:r>
           <w:rPr>
@@ -726,7 +754,7 @@
           <w:sz w:val="22"/>
         </w:rPr>
       </w:pPr>
-      <w:hyperlink w:anchor="_Toc244162609" w:history="1">
+      <w:hyperlink w:anchor="_Toc244163828" w:history="1">
         <w:r>
           <w:rPr>
             <w:rStyle w:val="Hyperlink"/>
@@ -757,7 +785,7 @@
             <w:webHidden/>
             <w:sz w:val="22"/>
           </w:rPr>
-          <w:instrText xml:space="preserve"> PAGEREF _Toc244162609 \h </w:instrText>
+          <w:instrText xml:space="preserve"> PAGEREF _Toc244163828 \h </w:instrText>
         </w:r>
         <w:r>
           <w:rPr>
@@ -806,7 +834,7 @@
           <w:sz w:val="22"/>
         </w:rPr>
       </w:pPr>
-      <w:hyperlink w:anchor="_Toc244162610" w:history="1">
+      <w:hyperlink w:anchor="_Toc244163829" w:history="1">
         <w:r>
           <w:rPr>
             <w:rStyle w:val="Hyperlink"/>
@@ -837,7 +865,7 @@
             <w:webHidden/>
             <w:sz w:val="22"/>
           </w:rPr>
-          <w:instrText xml:space="preserve"> PAGEREF _Toc244162610 \h </w:instrText>
+          <w:instrText xml:space="preserve"> PAGEREF _Toc244163829 \h </w:instrText>
         </w:r>
         <w:r>
           <w:rPr>
@@ -886,7 +914,7 @@
           <w:sz w:val="22"/>
         </w:rPr>
       </w:pPr>
-      <w:hyperlink w:anchor="_Toc244162611" w:history="1">
+      <w:hyperlink w:anchor="_Toc244163830" w:history="1">
         <w:r>
           <w:rPr>
             <w:rStyle w:val="Hyperlink"/>
@@ -917,7 +945,7 @@
             <w:webHidden/>
             <w:sz w:val="22"/>
           </w:rPr>
-          <w:instrText xml:space="preserve"> PAGEREF _Toc244162611 \h </w:instrText>
+          <w:instrText xml:space="preserve"> PAGEREF _Toc244163830 \h </w:instrText>
         </w:r>
         <w:r>
           <w:rPr>
@@ -966,7 +994,7 @@
           <w:sz w:val="22"/>
         </w:rPr>
       </w:pPr>
-      <w:hyperlink w:anchor="_Toc244162612" w:history="1">
+      <w:hyperlink w:anchor="_Toc244163831" w:history="1">
         <w:r>
           <w:rPr>
             <w:rStyle w:val="Hyperlink"/>
@@ -997,7 +1025,7 @@
             <w:webHidden/>
             <w:sz w:val="22"/>
           </w:rPr>
-          <w:instrText xml:space="preserve"> PAGEREF _Toc244162612 \h </w:instrText>
+          <w:instrText xml:space="preserve"> PAGEREF _Toc244163831 \h </w:instrText>
         </w:r>
         <w:r>
           <w:rPr>
@@ -1046,7 +1074,7 @@
           <w:sz w:val="22"/>
         </w:rPr>
       </w:pPr>
-      <w:hyperlink w:anchor="_Toc244162613" w:history="1">
+      <w:hyperlink w:anchor="_Toc244163832" w:history="1">
         <w:r>
           <w:rPr>
             <w:rStyle w:val="Hyperlink"/>
@@ -1077,7 +1105,7 @@
             <w:webHidden/>
             <w:sz w:val="22"/>
           </w:rPr>
-          <w:instrText xml:space="preserve"> PAGEREF _Toc244162613 \h </w:instrText>
+          <w:instrText xml:space="preserve"> PAGEREF _Toc244163832 \h </w:instrText>
         </w:r>
         <w:r>
           <w:rPr>
@@ -1126,7 +1154,7 @@
           <w:sz w:val="22"/>
         </w:rPr>
       </w:pPr>
-      <w:hyperlink w:anchor="_Toc244162614" w:history="1">
+      <w:hyperlink w:anchor="_Toc244163833" w:history="1">
         <w:r>
           <w:rPr>
             <w:rStyle w:val="Hyperlink"/>
@@ -1157,7 +1185,7 @@
             <w:webHidden/>
             <w:sz w:val="22"/>
           </w:rPr>
-          <w:instrText xml:space="preserve"> PAGEREF _Toc244162614 \h </w:instrText>
+          <w:instrText xml:space="preserve"> PAGEREF _Toc244163833 \h </w:instrText>
         </w:r>
         <w:r>
           <w:rPr>
@@ -1206,7 +1234,7 @@
           <w:sz w:val="22"/>
         </w:rPr>
       </w:pPr>
-      <w:hyperlink w:anchor="_Toc244162615" w:history="1">
+      <w:hyperlink w:anchor="_Toc244163834" w:history="1">
         <w:r>
           <w:rPr>
             <w:rStyle w:val="Hyperlink"/>
@@ -1237,7 +1265,7 @@
             <w:webHidden/>
             <w:sz w:val="22"/>
           </w:rPr>
-          <w:instrText xml:space="preserve"> PAGEREF _Toc244162615 \h </w:instrText>
+          <w:instrText xml:space="preserve"> PAGEREF _Toc244163834 \h </w:instrText>
         </w:r>
         <w:r>
           <w:rPr>
@@ -1286,7 +1314,7 @@
           <w:sz w:val="22"/>
         </w:rPr>
       </w:pPr>
-      <w:hyperlink w:anchor="_Toc244162616" w:history="1">
+      <w:hyperlink w:anchor="_Toc244163835" w:history="1">
         <w:r>
           <w:rPr>
             <w:rStyle w:val="Hyperlink"/>
@@ -1317,7 +1345,7 @@
             <w:webHidden/>
             <w:sz w:val="22"/>
           </w:rPr>
-          <w:instrText xml:space="preserve"> PAGEREF _Toc244162616 \h </w:instrText>
+          <w:instrText xml:space="preserve"> PAGEREF _Toc244163835 \h </w:instrText>
         </w:r>
         <w:r>
           <w:rPr>
@@ -1366,7 +1394,7 @@
           <w:sz w:val="22"/>
         </w:rPr>
       </w:pPr>
-      <w:hyperlink w:anchor="_Toc244162617" w:history="1">
+      <w:hyperlink w:anchor="_Toc244163836" w:history="1">
         <w:r>
           <w:rPr>
             <w:rStyle w:val="Hyperlink"/>
@@ -1397,7 +1425,7 @@
             <w:webHidden/>
             <w:sz w:val="22"/>
           </w:rPr>
-          <w:instrText xml:space="preserve"> PAGEREF _Toc244162617 \h </w:instrText>
+          <w:instrText xml:space="preserve"> PAGEREF _Toc244163836 \h </w:instrText>
         </w:r>
         <w:r>
           <w:rPr>
@@ -1446,7 +1474,7 @@
           <w:sz w:val="22"/>
         </w:rPr>
       </w:pPr>
-      <w:hyperlink w:anchor="_Toc244162618" w:history="1">
+      <w:hyperlink w:anchor="_Toc244163837" w:history="1">
         <w:r>
           <w:rPr>
             <w:rStyle w:val="Hyperlink"/>
@@ -1477,7 +1505,7 @@
             <w:webHidden/>
             <w:sz w:val="22"/>
           </w:rPr>
-          <w:instrText xml:space="preserve"> PAGEREF _Toc244162618 \h </w:instrText>
+          <w:instrText xml:space="preserve"> PAGEREF _Toc244163837 \h </w:instrText>
         </w:r>
         <w:r>
           <w:rPr>
@@ -1526,7 +1554,7 @@
           <w:sz w:val="22"/>
         </w:rPr>
       </w:pPr>
-      <w:hyperlink w:anchor="_Toc244162619" w:history="1">
+      <w:hyperlink w:anchor="_Toc244163838" w:history="1">
         <w:r>
           <w:rPr>
             <w:rStyle w:val="Hyperlink"/>
@@ -1557,7 +1585,7 @@
             <w:webHidden/>
             <w:sz w:val="22"/>
           </w:rPr>
-          <w:instrText xml:space="preserve"> PAGEREF _Toc244162619 \h </w:instrText>
+          <w:instrText xml:space="preserve"> PAGEREF _Toc244163838 \h </w:instrText>
         </w:r>
         <w:r>
           <w:rPr>
@@ -1606,7 +1634,7 @@
           <w:sz w:val="22"/>
         </w:rPr>
       </w:pPr>
-      <w:hyperlink w:anchor="_Toc244162620" w:history="1">
+      <w:hyperlink w:anchor="_Toc244163839" w:history="1">
         <w:r>
           <w:rPr>
             <w:rStyle w:val="Hyperlink"/>
@@ -1637,7 +1665,7 @@
             <w:webHidden/>
             <w:sz w:val="22"/>
           </w:rPr>
-          <w:instrText xml:space="preserve"> PAGEREF _Toc244162620 \h </w:instrText>
+          <w:instrText xml:space="preserve"> PAGEREF _Toc244163839 \h </w:instrText>
         </w:r>
         <w:r>
           <w:rPr>
@@ -1686,7 +1714,7 @@
           <w:sz w:val="22"/>
         </w:rPr>
       </w:pPr>
-      <w:hyperlink w:anchor="_Toc244162621" w:history="1">
+      <w:hyperlink w:anchor="_Toc244163840" w:history="1">
         <w:r>
           <w:rPr>
             <w:rStyle w:val="Hyperlink"/>
@@ -1717,7 +1745,7 @@
             <w:webHidden/>
             <w:sz w:val="22"/>
           </w:rPr>
-          <w:instrText xml:space="preserve"> PAGEREF _Toc244162621 \h </w:instrText>
+          <w:instrText xml:space="preserve"> PAGEREF _Toc244163840 \h </w:instrText>
         </w:r>
         <w:r>
           <w:rPr>
@@ -1766,7 +1794,7 @@
           <w:sz w:val="22"/>
         </w:rPr>
       </w:pPr>
-      <w:hyperlink w:anchor="_Toc244162622" w:history="1">
+      <w:hyperlink w:anchor="_Toc244163841" w:history="1">
         <w:r>
           <w:rPr>
             <w:rStyle w:val="Hyperlink"/>
@@ -1797,7 +1825,7 @@
             <w:webHidden/>
             <w:sz w:val="22"/>
           </w:rPr>
-          <w:instrText xml:space="preserve"> PAGEREF _Toc244162622 \h </w:instrText>
+          <w:instrText xml:space="preserve"> PAGEREF _Toc244163841 \h </w:instrText>
         </w:r>
         <w:r>
           <w:rPr>
@@ -1846,7 +1874,7 @@
           <w:sz w:val="22"/>
         </w:rPr>
       </w:pPr>
-      <w:hyperlink w:anchor="_Toc244162623" w:history="1">
+      <w:hyperlink w:anchor="_Toc244163842" w:history="1">
         <w:r>
           <w:rPr>
             <w:rStyle w:val="Hyperlink"/>
@@ -1877,7 +1905,7 @@
             <w:webHidden/>
             <w:sz w:val="22"/>
           </w:rPr>
-          <w:instrText xml:space="preserve"> PAGEREF _Toc244162623 \h </w:instrText>
+          <w:instrText xml:space="preserve"> PAGEREF _Toc244163842 \h </w:instrText>
         </w:r>
         <w:r>
           <w:rPr>
@@ -1926,7 +1954,7 @@
           <w:sz w:val="22"/>
         </w:rPr>
       </w:pPr>
-      <w:hyperlink w:anchor="_Toc244162624" w:history="1">
+      <w:hyperlink w:anchor="_Toc244163843" w:history="1">
         <w:r>
           <w:rPr>
             <w:rStyle w:val="Hyperlink"/>
@@ -1957,7 +1985,7 @@
             <w:webHidden/>
             <w:sz w:val="22"/>
           </w:rPr>
-          <w:instrText xml:space="preserve"> PAGEREF _Toc244162624 \h </w:instrText>
+          <w:instrText xml:space="preserve"> PAGEREF _Toc244163843 \h </w:instrText>
         </w:r>
         <w:r>
           <w:rPr>
@@ -2006,7 +2034,7 @@
           <w:sz w:val="22"/>
         </w:rPr>
       </w:pPr>
-      <w:hyperlink w:anchor="_Toc244162625" w:history="1">
+      <w:hyperlink w:anchor="_Toc244163844" w:history="1">
         <w:r>
           <w:rPr>
             <w:rStyle w:val="Hyperlink"/>
@@ -2037,7 +2065,7 @@
             <w:webHidden/>
             <w:sz w:val="22"/>
           </w:rPr>
-          <w:instrText xml:space="preserve"> PAGEREF _Toc244162625 \h </w:instrText>
+          <w:instrText xml:space="preserve"> PAGEREF _Toc244163844 \h </w:instrText>
         </w:r>
         <w:r>
           <w:rPr>
@@ -2086,7 +2114,7 @@
           <w:sz w:val="22"/>
         </w:rPr>
       </w:pPr>
-      <w:hyperlink w:anchor="_Toc244162626" w:history="1">
+      <w:hyperlink w:anchor="_Toc244163845" w:history="1">
         <w:r>
           <w:rPr>
             <w:rStyle w:val="Hyperlink"/>
@@ -2117,7 +2145,7 @@
             <w:webHidden/>
             <w:sz w:val="22"/>
           </w:rPr>
-          <w:instrText xml:space="preserve"> PAGEREF _Toc244162626 \h </w:instrText>
+          <w:instrText xml:space="preserve"> PAGEREF _Toc244163845 \h </w:instrText>
         </w:r>
         <w:r>
           <w:rPr>
@@ -2166,7 +2194,7 @@
           <w:sz w:val="22"/>
         </w:rPr>
       </w:pPr>
-      <w:hyperlink w:anchor="_Toc244162627" w:history="1">
+      <w:hyperlink w:anchor="_Toc244163846" w:history="1">
         <w:r>
           <w:rPr>
             <w:rStyle w:val="Hyperlink"/>
@@ -2197,7 +2225,7 @@
             <w:webHidden/>
             <w:sz w:val="22"/>
           </w:rPr>
-          <w:instrText xml:space="preserve"> PAGEREF _Toc244162627 \h </w:instrText>
+          <w:instrText xml:space="preserve"> PAGEREF _Toc244163846 \h </w:instrText>
         </w:r>
         <w:r>
           <w:rPr>
@@ -2246,7 +2274,7 @@
           <w:sz w:val="22"/>
         </w:rPr>
       </w:pPr>
-      <w:hyperlink w:anchor="_Toc244162628" w:history="1">
+      <w:hyperlink w:anchor="_Toc244163847" w:history="1">
         <w:r>
           <w:rPr>
             <w:rStyle w:val="Hyperlink"/>
@@ -2277,7 +2305,7 @@
             <w:webHidden/>
             <w:sz w:val="22"/>
           </w:rPr>
-          <w:instrText xml:space="preserve"> PAGEREF _Toc244162628 \h </w:instrText>
+          <w:instrText xml:space="preserve"> PAGEREF _Toc244163847 \h </w:instrText>
         </w:r>
         <w:r>
           <w:rPr>
@@ -2326,7 +2354,7 @@
           <w:sz w:val="22"/>
         </w:rPr>
       </w:pPr>
-      <w:hyperlink w:anchor="_Toc244162629" w:history="1">
+      <w:hyperlink w:anchor="_Toc244163848" w:history="1">
         <w:r>
           <w:rPr>
             <w:rStyle w:val="Hyperlink"/>
@@ -2357,7 +2385,7 @@
             <w:webHidden/>
             <w:sz w:val="22"/>
           </w:rPr>
-          <w:instrText xml:space="preserve"> PAGEREF _Toc244162629 \h </w:instrText>
+          <w:instrText xml:space="preserve"> PAGEREF _Toc244163848 \h </w:instrText>
         </w:r>
         <w:r>
           <w:rPr>
@@ -2406,7 +2434,7 @@
           <w:sz w:val="22"/>
         </w:rPr>
       </w:pPr>
-      <w:hyperlink w:anchor="_Toc244162630" w:history="1">
+      <w:hyperlink w:anchor="_Toc244163849" w:history="1">
         <w:r>
           <w:rPr>
             <w:rStyle w:val="Hyperlink"/>
@@ -2437,7 +2465,7 @@
             <w:webHidden/>
             <w:sz w:val="22"/>
           </w:rPr>
-          <w:instrText xml:space="preserve"> PAGEREF _Toc244162630 \h </w:instrText>
+          <w:instrText xml:space="preserve"> PAGEREF _Toc244163849 \h </w:instrText>
         </w:r>
         <w:r>
           <w:rPr>
@@ -2486,7 +2514,7 @@
           <w:sz w:val="22"/>
         </w:rPr>
       </w:pPr>
-      <w:hyperlink w:anchor="_Toc244162631" w:history="1">
+      <w:hyperlink w:anchor="_Toc244163850" w:history="1">
         <w:r>
           <w:rPr>
             <w:rStyle w:val="Hyperlink"/>
@@ -2517,7 +2545,7 @@
             <w:webHidden/>
             <w:sz w:val="22"/>
           </w:rPr>
-          <w:instrText xml:space="preserve"> PAGEREF _Toc244162631 \h </w:instrText>
+          <w:instrText xml:space="preserve"> PAGEREF _Toc244163850 \h </w:instrText>
         </w:r>
         <w:r>
           <w:rPr>
@@ -2566,7 +2594,7 @@
           <w:sz w:val="22"/>
         </w:rPr>
       </w:pPr>
-      <w:hyperlink w:anchor="_Toc244162632" w:history="1">
+      <w:hyperlink w:anchor="_Toc244163851" w:history="1">
         <w:r>
           <w:rPr>
             <w:rStyle w:val="Hyperlink"/>
@@ -2597,7 +2625,7 @@
             <w:webHidden/>
             <w:sz w:val="22"/>
           </w:rPr>
-          <w:instrText xml:space="preserve"> PAGEREF _Toc244162632 \h </w:instrText>
+          <w:instrText xml:space="preserve"> PAGEREF _Toc244163851 \h </w:instrText>
         </w:r>
         <w:r>
           <w:rPr>
@@ -2646,7 +2674,7 @@
           <w:sz w:val="22"/>
         </w:rPr>
       </w:pPr>
-      <w:hyperlink w:anchor="_Toc244162633" w:history="1">
+      <w:hyperlink w:anchor="_Toc244163852" w:history="1">
         <w:r>
           <w:rPr>
             <w:rStyle w:val="Hyperlink"/>
@@ -2677,7 +2705,7 @@
             <w:webHidden/>
             <w:sz w:val="22"/>
           </w:rPr>
-          <w:instrText xml:space="preserve"> PAGEREF _Toc244162633 \h </w:instrText>
+          <w:instrText xml:space="preserve"> PAGEREF _Toc244163852 \h </w:instrText>
         </w:r>
         <w:r>
           <w:rPr>
@@ -2726,7 +2754,7 @@
           <w:sz w:val="22"/>
         </w:rPr>
       </w:pPr>
-      <w:hyperlink w:anchor="_Toc244162634" w:history="1">
+      <w:hyperlink w:anchor="_Toc244163853" w:history="1">
         <w:r>
           <w:rPr>
             <w:rStyle w:val="Hyperlink"/>
@@ -2757,7 +2785,7 @@
             <w:webHidden/>
             <w:sz w:val="22"/>
           </w:rPr>
-          <w:instrText xml:space="preserve"> PAGEREF _Toc244162634 \h </w:instrText>
+          <w:instrText xml:space="preserve"> PAGEREF _Toc244163853 \h </w:instrText>
         </w:r>
         <w:r>
           <w:rPr>
@@ -2806,7 +2834,7 @@
           <w:sz w:val="22"/>
         </w:rPr>
       </w:pPr>
-      <w:hyperlink w:anchor="_Toc244162635" w:history="1">
+      <w:hyperlink w:anchor="_Toc244163854" w:history="1">
         <w:r>
           <w:rPr>
             <w:rStyle w:val="Hyperlink"/>
@@ -2837,7 +2865,7 @@
             <w:webHidden/>
             <w:sz w:val="22"/>
           </w:rPr>
-          <w:instrText xml:space="preserve"> PAGEREF _Toc244162635 \h </w:instrText>
+          <w:instrText xml:space="preserve"> PAGEREF _Toc244163854 \h </w:instrText>
         </w:r>
         <w:r>
           <w:rPr>
@@ -2886,7 +2914,7 @@
           <w:sz w:val="22"/>
         </w:rPr>
       </w:pPr>
-      <w:hyperlink w:anchor="_Toc244162636" w:history="1">
+      <w:hyperlink w:anchor="_Toc244163855" w:history="1">
         <w:r>
           <w:rPr>
             <w:rStyle w:val="Hyperlink"/>
@@ -2917,7 +2945,7 @@
             <w:webHidden/>
             <w:sz w:val="22"/>
           </w:rPr>
-          <w:instrText xml:space="preserve"> PAGEREF _Toc244162636 \h </w:instrText>
+          <w:instrText xml:space="preserve"> PAGEREF _Toc244163855 \h </w:instrText>
         </w:r>
         <w:r>
           <w:rPr>
@@ -2966,7 +2994,7 @@
           <w:sz w:val="22"/>
         </w:rPr>
       </w:pPr>
-      <w:hyperlink w:anchor="_Toc244162637" w:history="1">
+      <w:hyperlink w:anchor="_Toc244163856" w:history="1">
         <w:r>
           <w:rPr>
             <w:rStyle w:val="Hyperlink"/>
@@ -2997,7 +3025,7 @@
             <w:webHidden/>
             <w:sz w:val="22"/>
           </w:rPr>
-          <w:instrText xml:space="preserve"> PAGEREF _Toc244162637 \h </w:instrText>
+          <w:instrText xml:space="preserve"> PAGEREF _Toc244163856 \h </w:instrText>
         </w:r>
         <w:r>
           <w:rPr>
@@ -3046,7 +3074,7 @@
           <w:sz w:val="22"/>
         </w:rPr>
       </w:pPr>
-      <w:hyperlink w:anchor="_Toc244162638" w:history="1">
+      <w:hyperlink w:anchor="_Toc244163857" w:history="1">
         <w:r>
           <w:rPr>
             <w:rStyle w:val="Hyperlink"/>
@@ -3077,7 +3105,7 @@
             <w:webHidden/>
             <w:sz w:val="22"/>
           </w:rPr>
-          <w:instrText xml:space="preserve"> PAGEREF _Toc244162638 \h </w:instrText>
+          <w:instrText xml:space="preserve"> PAGEREF _Toc244163857 \h </w:instrText>
         </w:r>
         <w:r>
           <w:rPr>
@@ -3126,7 +3154,7 @@
           <w:sz w:val="22"/>
         </w:rPr>
       </w:pPr>
-      <w:hyperlink w:anchor="_Toc244162639" w:history="1">
+      <w:hyperlink w:anchor="_Toc244163858" w:history="1">
         <w:r>
           <w:rPr>
             <w:rStyle w:val="Hyperlink"/>
@@ -3157,7 +3185,7 @@
             <w:webHidden/>
             <w:sz w:val="22"/>
           </w:rPr>
-          <w:instrText xml:space="preserve"> PAGEREF _Toc244162639 \h </w:instrText>
+          <w:instrText xml:space="preserve"> PAGEREF _Toc244163858 \h </w:instrText>
         </w:r>
         <w:r>
           <w:rPr>
@@ -3206,7 +3234,7 @@
           <w:sz w:val="22"/>
         </w:rPr>
       </w:pPr>
-      <w:hyperlink w:anchor="_Toc244162640" w:history="1">
+      <w:hyperlink w:anchor="_Toc244163859" w:history="1">
         <w:r>
           <w:rPr>
             <w:rStyle w:val="Hyperlink"/>
@@ -3237,7 +3265,7 @@
             <w:webHidden/>
             <w:sz w:val="22"/>
           </w:rPr>
-          <w:instrText xml:space="preserve"> PAGEREF _Toc244162640 \h </w:instrText>
+          <w:instrText xml:space="preserve"> PAGEREF _Toc244163859 \h </w:instrText>
         </w:r>
         <w:r>
           <w:rPr>
@@ -3286,7 +3314,7 @@
           <w:sz w:val="22"/>
         </w:rPr>
       </w:pPr>
-      <w:hyperlink w:anchor="_Toc244162641" w:history="1">
+      <w:hyperlink w:anchor="_Toc244163860" w:history="1">
         <w:r>
           <w:rPr>
             <w:rStyle w:val="Hyperlink"/>
@@ -3317,7 +3345,7 @@
             <w:webHidden/>
             <w:sz w:val="22"/>
           </w:rPr>
-          <w:instrText xml:space="preserve"> PAGEREF _Toc244162641 \h </w:instrText>
+          <w:instrText xml:space="preserve"> PAGEREF _Toc244163860 \h </w:instrText>
         </w:r>
         <w:r>
           <w:rPr>
@@ -3366,7 +3394,7 @@
           <w:sz w:val="22"/>
         </w:rPr>
       </w:pPr>
-      <w:hyperlink w:anchor="_Toc244162642" w:history="1">
+      <w:hyperlink w:anchor="_Toc244163861" w:history="1">
         <w:r>
           <w:rPr>
             <w:rStyle w:val="Hyperlink"/>
@@ -3397,7 +3425,7 @@
             <w:webHidden/>
             <w:sz w:val="22"/>
           </w:rPr>
-          <w:instrText xml:space="preserve"> PAGEREF _Toc244162642 \h </w:instrText>
+          <w:instrText xml:space="preserve"> PAGEREF _Toc244163861 \h </w:instrText>
         </w:r>
         <w:r>
           <w:rPr>
@@ -3448,7 +3476,7 @@
         <w:pStyle w:val="Heading1"/>
         <w:pageBreakBefore/>
       </w:pPr>
-      <w:bookmarkStart w:id="1" w:name="_Toc244162604"/>
+      <w:bookmarkStart w:id="1" w:name="_Toc244163823"/>
       <w:r>
         <w:lastRenderedPageBreak/>
         <w:t>CHƯƠNG 1  TỔNG QUAN ĐỀ TÀI</w:t>
@@ -3459,7 +3487,7 @@
       <w:pPr>
         <w:pStyle w:val="Heading2"/>
       </w:pPr>
-      <w:bookmarkStart w:id="2" w:name="_Toc244162605"/>
+      <w:bookmarkStart w:id="2" w:name="_Toc244163824"/>
       <w:r>
         <w:t>1.1 Bài toán và mục tiêu</w:t>
       </w:r>
@@ -3467,28 +3495,19 @@
     </w:p>
     <w:p>
       <w:r>
-        <w:t xml:space="preserve">Sách cũ có </w:t>
-      </w:r>
-      <w:r>
-        <w:t xml:space="preserve">đặc điểm khác với hàng hóa đồng nhất: hai cuốn cùng một đầu sách có thể khác tình trạng, giá bán và địa điểm lưu kho. Nếu chỉ quản lý số lượng theo tên sách, cửa hàng khó xác định chính xác cuốn đã bán, còn người mua khó biết tình trạng cuốn mình đặt. Góc </w:t>
-      </w:r>
-      <w:r>
-        <w:t>Sách giải quyết bài toán này bằng cách quản lý từng bản sách vật lý trong một hệ thống nhiều cửa hàng.</w:t>
+        <w:t>Sách cũ có đặc điểm khác với hàng hóa đồng nhất: hai cuốn cùng một đầu sách có thể khác tình trạng, giá bán và địa điểm lưu kho. Nếu chỉ quản lý số lượng theo tên sách, cửa hàng khó xác định chính xác cuốn đã bán, còn người mua khó biết tình trạng cuốn mình đặt. Góc Sách giải quyết bài toán này bằng cách quản lý từng bản sách vật lý trong một hệ thống nhiều cửa hàng.</w:t>
       </w:r>
     </w:p>
     <w:p>
       <w:r>
-        <w:t>Ứng dụng hỗ trợ người mua tìm kiếm, so sánh và đặt sách; đồng thời cung cấp công cụ để cửa hàng quản lý kho, xử lý đơn và theo dõi doanh thu. Các chức nă</w:t>
-      </w:r>
-      <w:r>
-        <w:t>ng cùng sử dụng một mô hình dữ liệu và quy tắc phân quyền, giúp quá trình mua, thanh toán, giao nhận và trả hàng được theo dõi nhất quán.</w:t>
+        <w:t>Ứng dụng hỗ trợ người mua tìm kiếm, so sánh và đặt sách; đồng thời cung cấp công cụ để cửa hàng quản lý kho, xử lý đơn và theo dõi doanh thu. Các chức năng cùng sử dụng một mô hình dữ liệu và quy tắc phân quyền, giúp quá trình mua, thanh toán, giao nhận và trả hàng được theo dõi nhất quán.</w:t>
       </w:r>
     </w:p>
     <w:p>
       <w:pPr>
         <w:pStyle w:val="Heading2"/>
       </w:pPr>
-      <w:bookmarkStart w:id="3" w:name="_Toc244162606"/>
+      <w:bookmarkStart w:id="3" w:name="_Toc244163825"/>
       <w:r>
         <w:t>1.2 Phạm vi chức năng</w:t>
       </w:r>
@@ -3608,13 +3627,7 @@
               <w:rPr>
                 <w:sz w:val="21"/>
               </w:rPr>
-              <w:t xml:space="preserve">Tài khoản và OTP; tìm kiếm, xếp hạng; hồ sơ, địa chỉ; giỏ, yêu </w:t>
-            </w:r>
-            <w:r>
-              <w:rPr>
-                <w:sz w:val="21"/>
-              </w:rPr>
-              <w:t>thích; đặt hàng; đánh giá kèm ảnh/video.</w:t>
+              <w:t>Tài khoản và OTP; tìm kiếm, xếp hạng; hồ sơ, địa chỉ; giỏ, yêu thích; đặt hàng; đánh giá kèm ảnh/video.</w:t>
             </w:r>
           </w:p>
         </w:tc>
@@ -3716,13 +3729,7 @@
               <w:rPr>
                 <w:sz w:val="21"/>
               </w:rPr>
-              <w:t xml:space="preserve">Duyệt cửa hàng; thành viên; kho từng bản; danh mục; voucher; phí </w:t>
-            </w:r>
-            <w:r>
-              <w:rPr>
-                <w:sz w:val="21"/>
-              </w:rPr>
-              <w:t>giao hàng; doanh thu; tài khoản và kiểm duyệt.</w:t>
+              <w:t>Duyệt cửa hàng; thành viên; kho từng bản; danh mục; voucher; phí giao hàng; doanh thu; tài khoản và kiểm duyệt.</w:t>
             </w:r>
           </w:p>
         </w:tc>
@@ -3733,7 +3740,7 @@
       <w:pPr>
         <w:pStyle w:val="Heading2"/>
       </w:pPr>
-      <w:bookmarkStart w:id="4" w:name="_Toc244162607"/>
+      <w:bookmarkStart w:id="4" w:name="_Toc244163826"/>
       <w:r>
         <w:t>1.3 Tổ chức nhóm</w:t>
       </w:r>
@@ -3918,13 +3925,7 @@
               <w:rPr>
                 <w:sz w:val="21"/>
               </w:rPr>
-              <w:t xml:space="preserve">Tài </w:t>
-            </w:r>
-            <w:r>
-              <w:rPr>
-                <w:sz w:val="21"/>
-              </w:rPr>
-              <w:t>khoản, OTP, phiên/JWT; catalog, tìm kiếm, xếp hạng; hồ sơ, địa chỉ, giỏ; đánh giá và media.</w:t>
+              <w:t>Tài khoản, OTP, phiên/JWT; catalog, tìm kiếm, xếp hạng; hồ sơ, địa chỉ, giỏ; đánh giá và media.</w:t>
             </w:r>
           </w:p>
         </w:tc>
@@ -3991,22 +3992,16 @@
     <w:p/>
     <w:p>
       <w:r>
-        <w:t xml:space="preserve">Thành cung cấp danh tính, địa </w:t>
-      </w:r>
-      <w:r>
-        <w:t>chỉ và giỏ hàng; Khang cung cấp thông tin bản sách, voucher và phí giao hàng; Bảo kết hợp các dữ liệu này để tính báo giá, tạo đơn và xử lý thanh toán. Các thay đổi của đơn hàng được đối chiếu với kho để tránh bán trùng một bản sách.</w:t>
+        <w:t>Thành cung cấp danh tính, địa chỉ và giỏ hàng; Khang cung cấp thông tin bản sách, voucher và phí giao hàng; Bảo kết hợp các dữ liệu này để tính báo giá, tạo đơn và xử lý thanh toán. Các thay đổi của đơn hàng được đối chiếu với kho để tránh bán trùng một bản sách.</w:t>
       </w:r>
     </w:p>
     <w:p>
       <w:pPr>
         <w:pStyle w:val="Heading1"/>
       </w:pPr>
-      <w:bookmarkStart w:id="5" w:name="_Toc244162608"/>
+      <w:bookmarkStart w:id="5" w:name="_Toc244163827"/>
       <w:r>
-        <w:t>CHƯƠNG 2  KIẾN TRÚC VÀ</w:t>
-      </w:r>
-      <w:r>
-        <w:t xml:space="preserve"> THIẾT KẾ DỮ LIỆU</w:t>
+        <w:t>CHƯƠNG 2  KIẾN TRÚC VÀ THIẾT KẾ DỮ LIỆU</w:t>
       </w:r>
       <w:bookmarkEnd w:id="5"/>
     </w:p>
@@ -4014,7 +4009,7 @@
       <w:pPr>
         <w:pStyle w:val="Heading2"/>
       </w:pPr>
-      <w:bookmarkStart w:id="6" w:name="_Toc244162609"/>
+      <w:bookmarkStart w:id="6" w:name="_Toc244163828"/>
       <w:r>
         <w:t>2.1 Công nghệ và cấu trúc ứng dụng</w:t>
       </w:r>
@@ -4026,10 +4021,7 @@
       </w:r>
       <w:r>
         <w:lastRenderedPageBreak/>
-        <w:t xml:space="preserve">đi qua controller rồi </w:t>
-      </w:r>
-      <w:r>
-        <w:t>service. Repository chịu trách nhiệm đọc ghi; service giữ quy tắc và ranh giới transaction.</w:t>
+        <w:t>đi qua controller rồi service. Repository chịu trách nhiệm đọc ghi; service giữ quy tắc và ranh giới transaction.</w:t>
       </w:r>
     </w:p>
     <w:p>
@@ -4202,13 +4194,7 @@
               <w:rPr>
                 <w:sz w:val="21"/>
               </w:rPr>
-              <w:t>Quản lý hồ sơ, giỏ, địa chỉ, đặt đơn, đánh giá và yêu cầu trả đơ</w:t>
-            </w:r>
-            <w:r>
-              <w:rPr>
-                <w:sz w:val="21"/>
-              </w:rPr>
-              <w:t>n thuộc mình.</w:t>
+              <w:t>Quản lý hồ sơ, giỏ, địa chỉ, đặt đơn, đánh giá và yêu cầu trả đơn thuộc mình.</w:t>
             </w:r>
           </w:p>
         </w:tc>
@@ -4323,10 +4309,7 @@
     </w:p>
     <w:p>
       <w:r>
-        <w:t xml:space="preserve">Seller/Manager không phải quyền quản trị toàn hệ </w:t>
-      </w:r>
-      <w:r>
-        <w:t>thống. Mỗi request đối chiếu trạng thái active, blocked và auth_version. API Bearer và web session dùng các security chain riêng. JWT dùng RS256; grant lưu trong bộ nhớ một instance nên restart thu hồi token cũ.</w:t>
+        <w:t>Seller/Manager không phải quyền quản trị toàn hệ thống. Mỗi request đối chiếu trạng thái active, blocked và auth_version. API Bearer và web session dùng các security chain riêng. JWT dùng RS256; grant lưu trong bộ nhớ một instance nên restart thu hồi token cũ.</w:t>
       </w:r>
     </w:p>
     <w:p>
@@ -4387,12 +4370,9 @@
       <w:pPr>
         <w:pStyle w:val="Heading2"/>
       </w:pPr>
-      <w:bookmarkStart w:id="7" w:name="_Toc244162610"/>
+      <w:bookmarkStart w:id="7" w:name="_Toc244163829"/>
       <w:r>
-        <w:t>2.</w:t>
-      </w:r>
-      <w:r>
-        <w:t>2 Mô hình dữ liệu</w:t>
+        <w:t>2.2 Mô hình dữ liệu</w:t>
       </w:r>
       <w:bookmarkEnd w:id="7"/>
     </w:p>
@@ -4561,13 +4541,7 @@
               <w:rPr>
                 <w:sz w:val="21"/>
               </w:rPr>
-              <w:t>categories → products → book_copies. Mỗi bản thuộc một shop, có</w:t>
-            </w:r>
-            <w:r>
-              <w:rPr>
-                <w:sz w:val="21"/>
-              </w:rPr>
-              <w:t xml:space="preserve"> mã, giá, tình trạng và trạng thái riêng.</w:t>
+              <w:t>categories → products → book_copies. Mỗi bản thuộc một shop, có mã, giá, tình trạng và trạng thái riêng.</w:t>
             </w:r>
           </w:p>
         </w:tc>
@@ -4669,13 +4643,7 @@
               <w:rPr>
                 <w:sz w:val="21"/>
               </w:rPr>
-              <w:t>payment_attempts giữ mã/link/trạng thái cổng; payment_eve</w:t>
-            </w:r>
-            <w:r>
-              <w:rPr>
-                <w:sz w:val="21"/>
-              </w:rPr>
-              <w:t>nts ghi giao dịch đã xác minh, có ràng buộc chống lặp.</w:t>
+              <w:t>payment_attempts giữ mã/link/trạng thái cổng; payment_events ghi giao dịch đã xác minh, có ràng buộc chống lặp.</w:t>
             </w:r>
           </w:p>
         </w:tc>
@@ -4778,13 +4746,7 @@
               <w:rPr>
                 <w:sz w:val="21"/>
               </w:rPr>
-              <w:t xml:space="preserve">vouchers theo shop; carriers lưu phí; return_requests duy nhất theo </w:t>
-            </w:r>
-            <w:r>
-              <w:rPr>
-                <w:sz w:val="21"/>
-              </w:rPr>
-              <w:t>đơn. Đơn chốt discount, carrier_name, voucher_code và commission_rate.</w:t>
+              <w:t>vouchers theo shop; carriers lưu phí; return_requests duy nhất theo đơn. Đơn chốt discount, carrier_name, voucher_code và commission_rate.</w:t>
             </w:r>
           </w:p>
         </w:tc>
@@ -4805,10 +4767,7 @@
     </w:p>
     <w:p>
       <w:r>
-        <w:t>UNAVAILABLE → AVAILABLE → RESERVED → SOLD. Bản mới nhập cần phân loại và mở bán. Đặt đơn giữ bản; hủy hợp lệ trả bản về kho. Khi nhận hàng trả lại và xác nhận ho</w:t>
-      </w:r>
-      <w:r>
-        <w:t>àn tiền, bản chuyển về UNAVAILABLE để kiểm tra lại trước khi bán. Không cho form kho tự chuyển bản đang giữ hoặc đã bán.</w:t>
+        <w:t>UNAVAILABLE → AVAILABLE → RESERVED → SOLD. Bản mới nhập cần phân loại và mở bán. Đặt đơn giữ bản; hủy hợp lệ trả bản về kho. Khi nhận hàng trả lại và xác nhận hoàn tiền, bản chuyển về UNAVAILABLE để kiểm tra lại trước khi bán. Không cho form kho tự chuyển bản đang giữ hoặc đã bán.</w:t>
       </w:r>
     </w:p>
     <w:p>
@@ -4821,17 +4780,14 @@
     </w:p>
     <w:p>
       <w:r>
-        <w:t>Đổi tên sách, giá mới, phí giao hàng hoặc tỷ lệ chiết khấu của shop không làm thay đổi đơn cũ.</w:t>
-      </w:r>
-      <w:r>
-        <w:t xml:space="preserve"> Đơn dùng snapshot để giải thích số tiền người mua đã đồng ý. Công thức tổng đơn là tiền sách cộng phí giao hàng, trừ giảm giá. Mọi phép tính tiền dùng BigDecimal; không dùng số thực nhị phân.</w:t>
+        <w:t>Đổi tên sách, giá mới, phí giao hàng hoặc tỷ lệ chiết khấu của shop không làm thay đổi đơn cũ. Đơn dùng snapshot để giải thích số tiền người mua đã đồng ý. Công thức tổng đơn là tiền sách cộng phí giao hàng, trừ giảm giá. Mọi phép tính tiền dùng BigDecimal; không dùng số thực nhị phân.</w:t>
       </w:r>
     </w:p>
     <w:p>
       <w:pPr>
         <w:pStyle w:val="Heading2"/>
       </w:pPr>
-      <w:bookmarkStart w:id="8" w:name="_Toc244162611"/>
+      <w:bookmarkStart w:id="8" w:name="_Toc244163830"/>
       <w:r>
         <w:t>2.3 Quy tắc giao dịch và tích hợp</w:t>
       </w:r>
@@ -4839,13 +4795,7 @@
     </w:p>
     <w:p>
       <w:r>
-        <w:t xml:space="preserve">Controller tiếp nhận yêu cầu </w:t>
-      </w:r>
-      <w:r>
-        <w:t xml:space="preserve">và chuyển dữ liệu vào service. Service kiểm tra quyền, trạng thái và ranh giới transaction; Store/JpaStore thực hiện truy cập dữ liệu. Các adapter payOS, SMTP và Cloudinary tập trung xử lý giao tiếp với dịch vụ ngoài. Cách tổ chức này cho phép form web và </w:t>
-      </w:r>
-      <w:r>
-        <w:t>REST API dùng chung quy tắc nghiệp vụ.</w:t>
+        <w:t>Controller tiếp nhận yêu cầu và chuyển dữ liệu vào service. Service kiểm tra quyền, trạng thái và ranh giới transaction; Store/JpaStore thực hiện truy cập dữ liệu. Các adapter payOS, SMTP và Cloudinary tập trung xử lý giao tiếp với dịch vụ ngoài. Cách tổ chức này cho phép form web và REST API dùng chung quy tắc nghiệp vụ.</w:t>
       </w:r>
     </w:p>
     <w:p>
@@ -4906,7 +4856,7 @@
       <w:pPr>
         <w:pStyle w:val="Heading1"/>
       </w:pPr>
-      <w:bookmarkStart w:id="9" w:name="_Toc244162612"/>
+      <w:bookmarkStart w:id="9" w:name="_Toc244163831"/>
       <w:r>
         <w:t>CHƯƠNG 3  XÂY DỰNG CÁC CHỨC NĂNG</w:t>
       </w:r>
@@ -4916,7 +4866,7 @@
       <w:pPr>
         <w:pStyle w:val="Heading2"/>
       </w:pPr>
-      <w:bookmarkStart w:id="10" w:name="_Toc244162613"/>
+      <w:bookmarkStart w:id="10" w:name="_Toc244163832"/>
       <w:r>
         <w:t>3.1 Tài khoản và xác thực</w:t>
       </w:r>
@@ -4924,10 +4874,7 @@
     </w:p>
     <w:p>
       <w:r>
-        <w:t>Luồng tài khoản gồm đăng ký, kích hoạt OTP, đăng nhập, quên mật khẩu, hồ sơ và địa chỉ. Người</w:t>
-      </w:r>
-      <w:r>
-        <w:t xml:space="preserve"> chưa kích hoạt không được coi là người dùng hoạt động; trạng thái bị quản trị khóa là </w:t>
+        <w:t xml:space="preserve">Luồng tài khoản gồm đăng ký, kích hoạt OTP, đăng nhập, quên mật khẩu, hồ sơ và địa chỉ. Người chưa kích hoạt không được coi là người dùng hoạt động; trạng thái bị quản trị khóa là </w:t>
       </w:r>
       <w:r>
         <w:lastRenderedPageBreak/>
@@ -5048,13 +4995,7 @@
               <w:rPr>
                 <w:sz w:val="21"/>
               </w:rPr>
-              <w:t xml:space="preserve">Nhập thông tin và kiểm tra dữ </w:t>
-            </w:r>
-            <w:r>
-              <w:rPr>
-                <w:sz w:val="21"/>
-              </w:rPr>
-              <w:t>liệu. Mật khẩu được băm trước khi lưu.</w:t>
+              <w:t>Nhập thông tin và kiểm tra dữ liệu. Mật khẩu được băm trước khi lưu.</w:t>
             </w:r>
           </w:p>
         </w:tc>
@@ -5207,13 +5148,7 @@
               <w:rPr>
                 <w:sz w:val="21"/>
               </w:rPr>
-              <w:t xml:space="preserve">Form thiếu CSRF hoặc </w:t>
-            </w:r>
-            <w:r>
-              <w:rPr>
-                <w:sz w:val="21"/>
-              </w:rPr>
-              <w:t>người dùng truy cập sai phạm vi bị từ chối; không chỉ ẩn nút ở giao diện.</w:t>
+              <w:t>Form thiếu CSRF hoặc người dùng truy cập sai phạm vi bị từ chối; không chỉ ẩn nút ở giao diện.</w:t>
             </w:r>
           </w:p>
         </w:tc>
@@ -5276,18 +5211,12 @@
     </w:p>
     <w:p>
       <w:r>
-        <w:t>Các test xác thực, SecurityWebTest và JWT kiểm tra phiên, CSRF và phân quyền. Mailpit phục vụ việc kiểm tra nhận OTP và kích hoạt tà</w:t>
-      </w:r>
-      <w:r>
-        <w:t>i khoản trong môi trường demo.</w:t>
+        <w:t>Các test xác thực, SecurityWebTest và JWT kiểm tra phiên, CSRF và phân quyền. Mailpit phục vụ việc kiểm tra nhận OTP và kích hoạt tài khoản trong môi trường demo.</w:t>
       </w:r>
     </w:p>
     <w:p>
       <w:r>
-        <w:t>Khi đăng ký, AuthController kiểm tra dữ liệu form và gọi AuthService để tạo tài khoản chưa kích hoạt, đồng thời gửi mã OTP. Người dùng được chuyển sang trang kích hoạt để nhập mã; mã hợp lệ cho phép kích hoạt tài khoản. Các t</w:t>
-      </w:r>
-      <w:r>
-        <w:t>hao tác gửi mã và xác minh có giới hạn tốc độ. Luồng quên mật khẩu cũng yêu cầu mã xác nhận trước khi lưu mật khẩu mới.</w:t>
+        <w:t>Khi đăng ký, AuthController kiểm tra dữ liệu form và gọi AuthService để tạo tài khoản chưa kích hoạt, đồng thời gửi mã OTP. Người dùng được chuyển sang trang kích hoạt để nhập mã; mã hợp lệ cho phép kích hoạt tài khoản. Các thao tác gửi mã và xác minh có giới hạn tốc độ. Luồng quên mật khẩu cũng yêu cầu mã xác nhận trước khi lưu mật khẩu mới.</w:t>
       </w:r>
     </w:p>
     <w:p>
@@ -5300,17 +5229,14 @@
     </w:p>
     <w:p>
       <w:r>
-        <w:t>ProfileApiController cung cấp thao tác đọc, cập nhật hồ sơ và quản lý địa chỉ giao hàng. Service xác định người dùng từ</w:t>
-      </w:r>
-      <w:r>
-        <w:t xml:space="preserve"> phiên hoặc token, kiểm tra chủ sở hữu của địa chỉ rồi mới đọc hoặc ghi dữ liệu. Các địa chỉ này được dùng lại ở checkout để tránh nhập thông tin người nhận cho từng đơn.</w:t>
+        <w:t>ProfileApiController cung cấp thao tác đọc, cập nhật hồ sơ và quản lý địa chỉ giao hàng. Service xác định người dùng từ phiên hoặc token, kiểm tra chủ sở hữu của địa chỉ rồi mới đọc hoặc ghi dữ liệu. Các địa chỉ này được dùng lại ở checkout để tránh nhập thông tin người nhận cho từng đơn.</w:t>
       </w:r>
     </w:p>
     <w:p>
       <w:pPr>
         <w:pStyle w:val="Heading2"/>
       </w:pPr>
-      <w:bookmarkStart w:id="11" w:name="_Toc244162614"/>
+      <w:bookmarkStart w:id="11" w:name="_Toc244163833"/>
       <w:r>
         <w:t>3.2 Danh mục và tìm kiếm</w:t>
       </w:r>
@@ -5318,10 +5244,7 @@
     </w:p>
     <w:p>
       <w:r>
-        <w:t xml:space="preserve">Catalog chỉ công khai các bản AVAILABLE đã phân loại, thuộc </w:t>
-      </w:r>
-      <w:r>
-        <w:t>shop đang hoạt động và danh mục đang bật. Tìm kiếm theo tên/tác giả; giá thấp nhất và tồn kho được tính từ các bản thực sự phù hợp bộ lọc. Vì vậy, một đầu sách có thể vẫn tồn tại nhưng không còn xuất hiện như sách đang bán.</w:t>
+        <w:t>Catalog chỉ công khai các bản AVAILABLE đã phân loại, thuộc shop đang hoạt động và danh mục đang bật. Tìm kiếm theo tên/tác giả; giá thấp nhất và tồn kho được tính từ các bản thực sự phù hợp bộ lọc. Vì vậy, một đầu sách có thể vẫn tồn tại nhưng không còn xuất hiện như sách đang bán.</w:t>
       </w:r>
     </w:p>
     <w:tbl>
@@ -5439,13 +5362,7 @@
               <w:rPr>
                 <w:sz w:val="21"/>
               </w:rPr>
-              <w:t>Theo</w:t>
-            </w:r>
-            <w:r>
-              <w:rPr>
-                <w:sz w:val="21"/>
-              </w:rPr>
-              <w:t xml:space="preserve"> thời điểm tạo và ID để thứ tự ổn định.</w:t>
+              <w:t>Theo thời điểm tạo và ID để thứ tự ổn định.</w:t>
             </w:r>
           </w:p>
         </w:tc>
@@ -5666,25 +5583,19 @@
     </w:p>
     <w:p>
       <w:r>
-        <w:t>Quy tắc thống kê: số bản đã bán khác số bản đang còn; hoàn tiền ảnh hưởng thống kê bán, còn yêu cầu trả đang chờ chưa đ</w:t>
-      </w:r>
-      <w:r>
-        <w:t>ược coi là đã hoàn tiền. RankingTest kiểm tra giới hạn, phân trang và sách bị ẩn; CatalogQueryTest kiểm tra cú pháp truy vấn JPA.</w:t>
+        <w:t>Quy tắc thống kê: số bản đã bán khác số bản đang còn; hoàn tiền ảnh hưởng thống kê bán, còn yêu cầu trả đang chờ chưa được coi là đã hoàn tiền. RankingTest kiểm tra giới hạn, phân trang và sách bị ẩn; CatalogQueryTest kiểm tra cú pháp truy vấn JPA.</w:t>
       </w:r>
     </w:p>
     <w:p>
       <w:r>
-        <w:t xml:space="preserve">Người mua có thể lưu đầu sách yêu thích và xem lại lịch sử đã xem. Hai danh sách gắn với tài khoản; API yêu thích hỗ trợ thêm </w:t>
-      </w:r>
-      <w:r>
-        <w:t>và xóa theo productId. Danh mục và chi tiết sách được truy cập công khai, còn các danh sách cá nhân yêu cầu xác thực.</w:t>
+        <w:t>Người mua có thể lưu đầu sách yêu thích và xem lại lịch sử đã xem. Hai danh sách gắn với tài khoản; API yêu thích hỗ trợ thêm và xóa theo productId. Danh mục và chi tiết sách được truy cập công khai, còn các danh sách cá nhân yêu cầu xác thực.</w:t>
       </w:r>
     </w:p>
     <w:p>
       <w:pPr>
         <w:pStyle w:val="Heading2"/>
       </w:pPr>
-      <w:bookmarkStart w:id="12" w:name="_Toc244162615"/>
+      <w:bookmarkStart w:id="12" w:name="_Toc244163834"/>
       <w:r>
         <w:t>3.3 Giỏ hàng và checkout</w:t>
       </w:r>
@@ -5692,10 +5603,7 @@
     </w:p>
     <w:p>
       <w:r>
-        <w:t>Giỏ lưu từng bản sách cụ thể. Khi checkout, hệ thống nhóm các bản theo shop và tạo đơn con, cho phép mỗi cửa hàng</w:t>
-      </w:r>
-      <w:r>
-        <w:t xml:space="preserve"> xử lý độc lập. Tổng phí giao hàng tính theo từng shop. Một voucher chỉ áp dụng cho shop phát hành mã; mức giảm không vượt tiền sách của shop đó.</w:t>
+        <w:t>Giỏ lưu từng bản sách cụ thể. Khi checkout, hệ thống nhóm các bản theo shop và tạo đơn con, cho phép mỗi cửa hàng xử lý độc lập. Tổng phí giao hàng tính theo từng shop. Một voucher chỉ áp dụng cho shop phát hành mã; mức giảm không vượt tiền sách của shop đó.</w:t>
       </w:r>
     </w:p>
     <w:tbl>
@@ -5812,13 +5720,7 @@
               <w:rPr>
                 <w:sz w:val="21"/>
               </w:rPr>
-              <w:t xml:space="preserve">Người mua chọn địa chỉ, hãng giao hàng và mã giảm giá; server trả bảng tiền </w:t>
-            </w:r>
-            <w:r>
-              <w:rPr>
-                <w:sz w:val="21"/>
-              </w:rPr>
-              <w:t>cùng fingerprint.</w:t>
+              <w:t>Người mua chọn địa chỉ, hãng giao hàng và mã giảm giá; server trả bảng tiền cùng fingerprint.</w:t>
             </w:r>
           </w:p>
         </w:tc>
@@ -5971,13 +5873,7 @@
               <w:rPr>
                 <w:sz w:val="21"/>
               </w:rPr>
-              <w:t>Nếu hợp lệ,</w:t>
-            </w:r>
-            <w:r>
-              <w:rPr>
-                <w:sz w:val="21"/>
-              </w:rPr>
-              <w:t xml:space="preserve"> tạo checkout group và đơn theo shop, giữ bản sách và tăng lượt voucher trong cùng transaction. Gửi lại cùng key trả đơn cũ, không trừ lượt lần nữa.</w:t>
+              <w:t>Nếu hợp lệ, tạo checkout group và đơn theo shop, giữ bản sách và tăng lượt voucher trong cùng transaction. Gửi lại cùng key trả đơn cũ, không trừ lượt lần nữa.</w:t>
             </w:r>
           </w:p>
         </w:tc>
@@ -6045,17 +5941,14 @@
     </w:p>
     <w:p>
       <w:r>
-        <w:t>Fingerprint chuẩn hóa số tiền bằng stripTrail</w:t>
-      </w:r>
-      <w:r>
-        <w:t>ingZeros().toPlainString() để các giá trị tương đương như 10000 và 10000.00 tạo cùng kết quả. Test hồi quy kiểm tra tính nhất quán của báo giá.</w:t>
+        <w:t>Fingerprint chuẩn hóa số tiền bằng stripTrailingZeros().toPlainString() để các giá trị tương đương như 10000 và 10000.00 tạo cùng kết quả. Test hồi quy kiểm tra tính nhất quán của báo giá.</w:t>
       </w:r>
     </w:p>
     <w:p>
       <w:pPr>
         <w:pStyle w:val="Heading2"/>
       </w:pPr>
-      <w:bookmarkStart w:id="13" w:name="_Toc244162616"/>
+      <w:bookmarkStart w:id="13" w:name="_Toc244163835"/>
       <w:r>
         <w:t>3.4 Thanh toán trực tuyến</w:t>
       </w:r>
@@ -6063,10 +5956,7 @@
     </w:p>
     <w:p>
       <w:r>
-        <w:t>Mỗi đơn con có mã thanh toán riêng. Ứng dụng lưu mã trước khi gọi cổng, gọi mạng ngoài</w:t>
-      </w:r>
-      <w:r>
-        <w:t xml:space="preserve"> transaction giữ khóa và dùng timeout hữu hạn. Link thanh toán chỉ là yêu cầu thu tiền; tham số return/cancel trong trình duyệt không đủ để đánh dấu đơn đã trả tiền.</w:t>
+        <w:t>Mỗi đơn con có mã thanh toán riêng. Ứng dụng lưu mã trước khi gọi cổng, gọi mạng ngoài transaction giữ khóa và dùng timeout hữu hạn. Link thanh toán chỉ là yêu cầu thu tiền; tham số return/cancel trong trình duyệt không đủ để đánh dấu đơn đã trả tiền.</w:t>
       </w:r>
     </w:p>
     <w:tbl>
@@ -6183,13 +6073,7 @@
               <w:rPr>
                 <w:sz w:val="21"/>
               </w:rPr>
-              <w:t xml:space="preserve">Tạo đơn PAYOS và giữ sách trong hạn thanh toán. Adapter </w:t>
-            </w:r>
-            <w:r>
-              <w:rPr>
-                <w:sz w:val="21"/>
-              </w:rPr>
-              <w:t>tạo hoặc đọc lại thông tin link.</w:t>
+              <w:t>Tạo đơn PAYOS và giữ sách trong hạn thanh toán. Adapter tạo hoặc đọc lại thông tin link.</w:t>
             </w:r>
           </w:p>
         </w:tc>
@@ -6342,13 +6226,7 @@
               <w:rPr>
                 <w:sz w:val="21"/>
               </w:rPr>
-              <w:t xml:space="preserve">Callback lặp không ghi nhận tiền lần </w:t>
-            </w:r>
-            <w:r>
-              <w:rPr>
-                <w:sz w:val="21"/>
-              </w:rPr>
-              <w:t>hai. Sai số tiền hoặc tiền đến sau hủy chuyển REVIEW_REQUIRED.</w:t>
+              <w:t>Callback lặp không ghi nhận tiền lần hai. Sai số tiền hoặc tiền đến sau hủy chuyển REVIEW_REQUIRED.</w:t>
             </w:r>
           </w:p>
         </w:tc>
@@ -6426,17 +6304,14 @@
     </w:p>
     <w:p>
       <w:r>
-        <w:t xml:space="preserve">Kiểm thử thanh toán sử dụng cổng </w:t>
-      </w:r>
-      <w:r>
-        <w:t>mô phỏng cho các nhánh thành công, hủy, lỗi API, chữ ký sai, giao dịch lặp và đến muộn. Khi triển khai payOS, cấu hình dịch vụ và webhook HTTPS cần được kiểm tra trong môi trường tích hợp.</w:t>
+        <w:t>Kiểm thử thanh toán sử dụng cổng mô phỏng cho các nhánh thành công, hủy, lỗi API, chữ ký sai, giao dịch lặp và đến muộn. Khi triển khai payOS, cấu hình dịch vụ và webhook HTTPS cần được kiểm tra trong môi trường tích hợp.</w:t>
       </w:r>
     </w:p>
     <w:p>
       <w:pPr>
         <w:pStyle w:val="Heading2"/>
       </w:pPr>
-      <w:bookmarkStart w:id="14" w:name="_Toc244162617"/>
+      <w:bookmarkStart w:id="14" w:name="_Toc244163836"/>
       <w:r>
         <w:t>3.5 Đơn hàng và thông báo</w:t>
       </w:r>
@@ -6444,10 +6319,7 @@
     </w:p>
     <w:p>
       <w:r>
-        <w:t>Người mua xem đơn của chính mình và lọc t</w:t>
-      </w:r>
-      <w:r>
-        <w:t>heo PENDING, CONFIRMED, SHIPPING, COMPLETED, CANCELLED. Người bán chỉ thấy đơn thuộc shop mình có quyền. Service kiểm tra cả chuyển trạng thái hợp lệ và điều kiện thanh toán; đơn PAYOS chưa PAID không được giao.</w:t>
+        <w:t>Người mua xem đơn của chính mình và lọc theo PENDING, CONFIRMED, SHIPPING, COMPLETED, CANCELLED. Người bán chỉ thấy đơn thuộc shop mình có quyền. Service kiểm tra cả chuyển trạng thái hợp lệ và điều kiện thanh toán; đơn PAYOS chưa PAID không được giao.</w:t>
       </w:r>
     </w:p>
     <w:p>
@@ -6505,26 +6377,17 @@
         <w:pStyle w:val="Heading3"/>
       </w:pPr>
       <w:r>
-        <w:t>Th</w:t>
-      </w:r>
-      <w:r>
-        <w:t>ông báo WebSocket</w:t>
+        <w:t>Thông báo WebSocket</w:t>
       </w:r>
     </w:p>
     <w:p>
       <w:r>
-        <w:t>Endpoint /ws dùng phiên đã đăng nhập và kiểm tra lại danh tính mỗi chu kỳ 5 giây. Server dựng snapshot các đơn mà tài khoản được phép xem và chỉ đẩy thay đổi. Payload chứa ID, trạng thái đơn, thanh toán và trả hàng; không gửi địa chỉ hoặc</w:t>
-      </w:r>
-      <w:r>
-        <w:t xml:space="preserve"> thông tin ngân hàng.</w:t>
+        <w:t>Endpoint /ws dùng phiên đã đăng nhập và kiểm tra lại danh tính mỗi chu kỳ 5 giây. Server dựng snapshot các đơn mà tài khoản được phép xem và chỉ đẩy thay đổi. Payload chứa ID, trạng thái đơn, thanh toán và trả hàng; không gửi địa chỉ hoặc thông tin ngân hàng.</w:t>
       </w:r>
     </w:p>
     <w:p>
       <w:r>
-        <w:t>Phía client hiển thị thông báo và đường dẫn xem đơn. Người dùng không được đăng ký tùy ý một mã shop hoặc user khác. Phiên hết hạn/đăng xuất hoặc auth_version thay đổi sẽ đóng kết nối. Đây là cơ chế kiểm tra định kỳ trên server, không</w:t>
-      </w:r>
-      <w:r>
-        <w:t xml:space="preserve"> phải hệ thống sự kiện phân tán nhiều instance.</w:t>
+        <w:t>Phía client hiển thị thông báo và đường dẫn xem đơn. Người dùng không được đăng ký tùy ý một mã shop hoặc user khác. Phiên hết hạn/đăng xuất hoặc auth_version thay đổi sẽ đóng kết nối. Đây là cơ chế kiểm tra định kỳ trên server, không phải hệ thống sự kiện phân tán nhiều instance.</w:t>
       </w:r>
     </w:p>
     <w:p>
@@ -6536,7 +6399,7 @@
       <w:pPr>
         <w:pStyle w:val="Heading2"/>
       </w:pPr>
-      <w:bookmarkStart w:id="15" w:name="_Toc244162618"/>
+      <w:bookmarkStart w:id="15" w:name="_Toc244163837"/>
       <w:r>
         <w:lastRenderedPageBreak/>
         <w:t>3.6 Cửa hàng và kho</w:t>
@@ -6545,10 +6408,7 @@
     </w:p>
     <w:p>
       <w:r>
-        <w:t xml:space="preserve">Người dùng gửi yêu cầu </w:t>
-      </w:r>
-      <w:r>
-        <w:t>mở shop; Admin duyệt hoặc từ chối và giữ lịch sử. Thành viên được gán Seller/Manager theo cửa hàng. Shop bị tạm khóa không còn cung cấp bản sách cho catalog; quyền nghiệp vụ cũng được kiểm tra từ trạng thái shop hiện hành.</w:t>
+        <w:t>Người dùng gửi yêu cầu mở shop; Admin duyệt hoặc từ chối và giữ lịch sử. Thành viên được gán Seller/Manager theo cửa hàng. Shop bị tạm khóa không còn cung cấp bản sách cho catalog; quyền nghiệp vụ cũng được kiểm tra từ trạng thái shop hiện hành.</w:t>
       </w:r>
     </w:p>
     <w:tbl>
@@ -6767,13 +6627,7 @@
               <w:rPr>
                 <w:sz w:val="21"/>
               </w:rPr>
-              <w:t>Checkout chuyển RESERVED; đơn hoàn tất chuyển SOLD. Các trạng thái này không sửa tùy ý</w:t>
-            </w:r>
-            <w:r>
-              <w:rPr>
-                <w:sz w:val="21"/>
-              </w:rPr>
-              <w:t xml:space="preserve"> bằng form kho.</w:t>
+              <w:t>Checkout chuyển RESERVED; đơn hoàn tất chuyển SOLD. Các trạng thái này không sửa tùy ý bằng form kho.</w:t>
             </w:r>
           </w:p>
         </w:tc>
@@ -6837,10 +6691,7 @@
     </w:p>
     <w:p>
       <w:r>
-        <w:t>Service khóa shop trước rồi khóa bản; version của form giúp phát hiện người khác đã thay đổi dữ liệu. Không xóa đầu sách đã có bản</w:t>
-      </w:r>
-      <w:r>
-        <w:t xml:space="preserve"> vật lý trong kho. Danh sách kho có phân trang; lịch sử hiển thị 100 dòng gần nhất mà không xóa lịch sử cũ.</w:t>
+        <w:t>Service khóa shop trước rồi khóa bản; version của form giúp phát hiện người khác đã thay đổi dữ liệu. Không xóa đầu sách đã có bản vật lý trong kho. Danh sách kho có phân trang; lịch sử hiển thị 100 dòng gần nhất mà không xóa lịch sử cũ.</w:t>
       </w:r>
     </w:p>
     <w:p>
@@ -6903,10 +6754,7 @@
     </w:p>
     <w:p>
       <w:r>
-        <w:t>Luồng quản lý kho gồm nhập bản sách, phân loại, xác định giá và mở bán. Người mua chỉ t</w:t>
-      </w:r>
-      <w:r>
-        <w:t>hấy các bản đủ điều kiện; quyền cập nhật kho được giới hạn theo thành viên của từng cửa hàng.</w:t>
+        <w:t>Luồng quản lý kho gồm nhập bản sách, phân loại, xác định giá và mở bán. Người mua chỉ thấy các bản đủ điều kiện; quyền cập nhật kho được giới hạn theo thành viên của từng cửa hàng.</w:t>
       </w:r>
     </w:p>
     <w:p>
@@ -6968,7 +6816,7 @@
       <w:pPr>
         <w:pStyle w:val="Heading2"/>
       </w:pPr>
-      <w:bookmarkStart w:id="16" w:name="_Toc244162619"/>
+      <w:bookmarkStart w:id="16" w:name="_Toc244163838"/>
       <w:r>
         <w:t>3.7 Voucher giao hàng và doanh thu</w:t>
       </w:r>
@@ -6976,18 +6824,12 @@
     </w:p>
     <w:p>
       <w:r>
-        <w:t>Voucher có mã duy nhất, shop, số tiền giảm, ngưỡng đơn, hạn dùng và số lượt tối đa. Hệ t</w:t>
-      </w:r>
-      <w:r>
-        <w:t>hống kiểm tra lại khi đặt đơn dưới khóa dữ liệu. Hủy đơn hiện không trả lại lượt voucher; đây là quy tắc áp dụng trong hệ thống.</w:t>
+        <w:t>Voucher có mã duy nhất, shop, số tiền giảm, ngưỡng đơn, hạn dùng và số lượt tối đa. Hệ thống kiểm tra lại khi đặt đơn dưới khóa dữ liệu. Hủy đơn hiện không trả lại lượt voucher; đây là quy tắc áp dụng trong hệ thống.</w:t>
       </w:r>
     </w:p>
     <w:p>
       <w:r>
-        <w:t>Admin quản lý đơn vị giao hàng và mức phí. Mức giao tiêu chuẩn 30.000 đồng vẫn có sẵn làm phương án mặc định. Đây là bảng phí n</w:t>
-      </w:r>
-      <w:r>
-        <w:t>ội bộ để tính đơn, chưa kết nối API tạo vận đơn hoặc theo dõi của hãng giao hàng ngoài.</w:t>
+        <w:t>Admin quản lý đơn vị giao hàng và mức phí. Mức giao tiêu chuẩn 30.000 đồng vẫn có sẵn làm phương án mặc định. Đây là bảng phí nội bộ để tính đơn, chưa kết nối API tạo vận đơn hoặc theo dõi của hãng giao hàng ngoài.</w:t>
       </w:r>
     </w:p>
     <w:tbl>
@@ -7257,13 +7099,7 @@
               <w:rPr>
                 <w:sz w:val="21"/>
               </w:rPr>
-              <w:t>Tiền sách sau giảm trừ chiết khấu; phí giao hàng thống kê riêng. Không phải lệnh chuyển ti</w:t>
-            </w:r>
-            <w:r>
-              <w:rPr>
-                <w:sz w:val="21"/>
-              </w:rPr>
-              <w:t>ền thực tế.</w:t>
+              <w:t>Tiền sách sau giảm trừ chiết khấu; phí giao hàng thống kê riêng. Không phải lệnh chuyển tiền thực tế.</w:t>
             </w:r>
           </w:p>
         </w:tc>
@@ -7281,17 +7117,14 @@
     </w:p>
     <w:p>
       <w:r>
-        <w:t>Ví dụ: tiền sách 100.000 đồng, giảm 10.000 đồng, tỷ lệ 5% thì chiết khấu 4.500 đồng và phần sách của shop là 85.500 đồng. Đổi tỷ lệ hiện hành không thay tỷ lệ đã chốt của đơn cũ. OperationsTest xác nhận snapshot và lần đặt lại không tiêu hao</w:t>
-      </w:r>
-      <w:r>
-        <w:t xml:space="preserve"> voucher thêm.</w:t>
+        <w:t>Ví dụ: tiền sách 100.000 đồng, giảm 10.000 đồng, tỷ lệ 5% thì chiết khấu 4.500 đồng và phần sách của shop là 85.500 đồng. Đổi tỷ lệ hiện hành không thay tỷ lệ đã chốt của đơn cũ. OperationsTest xác nhận snapshot và lần đặt lại không tiêu hao voucher thêm.</w:t>
       </w:r>
     </w:p>
     <w:p>
       <w:pPr>
         <w:pStyle w:val="Heading2"/>
       </w:pPr>
-      <w:bookmarkStart w:id="17" w:name="_Toc244162620"/>
+      <w:bookmarkStart w:id="17" w:name="_Toc244163839"/>
       <w:r>
         <w:t>3.8 Trả hàng đánh giá và quản trị</w:t>
       </w:r>
@@ -7299,19 +7132,13 @@
     </w:p>
     <w:p>
       <w:r>
-        <w:t>Người mua chỉ gửi yêu cầu trả cho đơn thuộc mình, đã hoàn tất và PAID, trong 7 ngày sau khi hoàn tất. Yêu cầu đi qua REQUESTED → APPROVED hoặc REJECTED; chỉ yêu cầu được duyệt mới ghi REFUNDED. Người bán nhậ</w:t>
-      </w:r>
-      <w:r>
-        <w:t>p tham chiếu hoàn tiền và xác nhận đã nhận sách, hoàn tiền bên ngoài.</w:t>
+        <w:t>Người mua chỉ gửi yêu cầu trả cho đơn thuộc mình, đã hoàn tất và PAID, trong 7 ngày sau khi hoàn tất. Yêu cầu đi qua REQUESTED → APPROVED hoặc REJECTED; chỉ yêu cầu được duyệt mới ghi REFUNDED. Người bán nhập tham chiếu hoàn tiền và xác nhận đã nhận sách, hoàn tiền bên ngoài.</w:t>
       </w:r>
     </w:p>
     <w:p>
       <w:r>
         <w:lastRenderedPageBreak/>
-        <w:t>REFUNDED chỉ ghi nhận đối soát thủ công, không gọi ngân hàng. Bản sách trả về UNAVAILABLE để kiểm tra lại. Trạng thái đơn gốc vẫn COMPLETED và thanh toán PAID; trạng thái hoàn tiền lưu ở</w:t>
-      </w:r>
-      <w:r>
-        <w:t xml:space="preserve"> return_requests, tránh viết lại lịch sử giao nhận ban đầu.</w:t>
+        <w:t>REFUNDED chỉ ghi nhận đối soát thủ công, không gọi ngân hàng. Bản sách trả về UNAVAILABLE để kiểm tra lại. Trạng thái đơn gốc vẫn COMPLETED và thanh toán PAID; trạng thái hoàn tiền lưu ở return_requests, tránh viết lại lịch sử giao nhận ban đầu.</w:t>
       </w:r>
     </w:p>
     <w:p>
@@ -7324,17 +7151,14 @@
     </w:p>
     <w:p>
       <w:r>
-        <w:t>Chỉ người đã mua trong đơn COMPLETED được đánh giá; mỗi người một đánh giá trên đầu sách. Nội dung từ 50 đến 5.000 ký tự. Có thể đính kèm ảnh hoặc video MP4 tối đa 5 MB qua Cloud</w:t>
-      </w:r>
-      <w:r>
-        <w:t>inary; kiểm tra quyền và nội dung trước khi gọi upload. Admin ẩn/hiện review có ghi lý do; thống kê chỉ lấy PUBLISHED.</w:t>
+        <w:t>Chỉ người đã mua trong đơn COMPLETED được đánh giá; mỗi người một đánh giá trên đầu sách. Nội dung từ 50 đến 5.000 ký tự. Có thể đính kèm ảnh hoặc video MP4 tối đa 5 MB qua Cloudinary; kiểm tra quyền và nội dung trước khi gọi upload. Admin ẩn/hiện review có ghi lý do; thống kê chỉ lấy PUBLISHED.</w:t>
       </w:r>
     </w:p>
     <w:p>
       <w:pPr>
         <w:pStyle w:val="Heading1"/>
       </w:pPr>
-      <w:bookmarkStart w:id="18" w:name="_Toc244162621"/>
+      <w:bookmarkStart w:id="18" w:name="_Toc244163840"/>
       <w:r>
         <w:t>CHƯƠNG 4  DIỄN GIẢI MÃ NGUỒN VÀ API</w:t>
       </w:r>
@@ -7344,7 +7168,7 @@
       <w:pPr>
         <w:pStyle w:val="Heading2"/>
       </w:pPr>
-      <w:bookmarkStart w:id="19" w:name="_Toc244162622"/>
+      <w:bookmarkStart w:id="19" w:name="_Toc244163841"/>
       <w:r>
         <w:t>4.1 Tổ chức xử lý tại controller và service</w:t>
       </w:r>
@@ -7352,28 +7176,19 @@
     </w:p>
     <w:p>
       <w:r>
-        <w:t>Controller nhận form hoặc JSON, kiểm tra định dạng và chu</w:t>
-      </w:r>
-      <w:r>
-        <w:t xml:space="preserve">yển sang service. Service quyết định quyền truy cập, trạng thái hợp lệ và phạm vi transaction. Với checkout, hệ thống khóa dữ liệu cần thay đổi, tính lại tiền từ nguồn hiện hành và chỉ ghi đơn khi báo giá còn hợp lệ. Lỗi trong transaction làm rollback các </w:t>
-      </w:r>
-      <w:r>
-        <w:t>thay đổi liên quan.</w:t>
+        <w:t>Controller nhận form hoặc JSON, kiểm tra định dạng và chuyển sang service. Service quyết định quyền truy cập, trạng thái hợp lệ và phạm vi transaction. Với checkout, hệ thống khóa dữ liệu cần thay đổi, tính lại tiền từ nguồn hiện hành và chỉ ghi đơn khi báo giá còn hợp lệ. Lỗi trong transaction làm rollback các thay đổi liên quan.</w:t>
       </w:r>
     </w:p>
     <w:p>
       <w:r>
-        <w:t xml:space="preserve">Khi xử lý trả hàng, service kiểm tra điều kiện của đơn và tất cả các bản trước khi cập nhật. Sách nhận lại chuyển về UNAVAILABLE để cửa hàng kiểm tra tình trạng; chỉ mở bán sau khi phân loại lại. Quy tắc này giữ thống nhất giữa lịch sử </w:t>
-      </w:r>
-      <w:r>
-        <w:t>đơn và trạng thái kho.</w:t>
+        <w:t>Khi xử lý trả hàng, service kiểm tra điều kiện của đơn và tất cả các bản trước khi cập nhật. Sách nhận lại chuyển về UNAVAILABLE để cửa hàng kiểm tra tình trạng; chỉ mở bán sau khi phân loại lại. Quy tắc này giữ thống nhất giữa lịch sử đơn và trạng thái kho.</w:t>
       </w:r>
     </w:p>
     <w:p>
       <w:pPr>
         <w:pStyle w:val="Heading2"/>
       </w:pPr>
-      <w:bookmarkStart w:id="20" w:name="_Toc244162623"/>
+      <w:bookmarkStart w:id="20" w:name="_Toc244163842"/>
       <w:r>
         <w:t>4.2 Mã nguồn minh họa</w:t>
       </w:r>
@@ -7435,10 +7250,7 @@
     </w:p>
     <w:p>
       <w:r>
-        <w:t xml:space="preserve">Đoạn xử lý khóa người dùng trước khi tra cứu kết quả checkout theo idempotency key. Nếu yêu cầu đã được xử lý, service trả lại các đơn đã có; </w:t>
-      </w:r>
-      <w:r>
-        <w:t>các kiểm tra địa chỉ và bản sách chỉ tiếp tục đối với một yêu cầu mới. Cơ chế này giới hạn tác động của thao tác gửi lại trên cùng tài khoản.</w:t>
+        <w:t>Đoạn xử lý khóa người dùng trước khi tra cứu kết quả checkout theo idempotency key. Nếu yêu cầu đã được xử lý, service trả lại các đơn đã có; các kiểm tra địa chỉ và bản sách chỉ tiếp tục đối với một yêu cầu mới. Cơ chế này giới hạn tác động của thao tác gửi lại trên cùng tài khoản.</w:t>
       </w:r>
     </w:p>
     <w:p>
@@ -7498,17 +7310,14 @@
     </w:p>
     <w:p>
       <w:r>
-        <w:t xml:space="preserve">PaymentService sử dụng dữ liệu đã được gateway xác minh </w:t>
-      </w:r>
-      <w:r>
-        <w:t>rồi đối chiếu giao dịch trong luồng nghiệp vụ. Phần xác minh nguồn thông báo và phần quyết định trạng thái đơn được tách riêng để có thể kiểm thử độc lập.</w:t>
+        <w:t>PaymentService sử dụng dữ liệu đã được gateway xác minh rồi đối chiếu giao dịch trong luồng nghiệp vụ. Phần xác minh nguồn thông báo và phần quyết định trạng thái đơn được tách riêng để có thể kiểm thử độc lập.</w:t>
       </w:r>
     </w:p>
     <w:p>
       <w:pPr>
         <w:pStyle w:val="Heading2"/>
       </w:pPr>
-      <w:bookmarkStart w:id="21" w:name="_Toc244162624"/>
+      <w:bookmarkStart w:id="21" w:name="_Toc244163843"/>
       <w:r>
         <w:t>4.3 Quy ước sử dụng REST API</w:t>
       </w:r>
@@ -7516,13 +7325,7 @@
     </w:p>
     <w:p>
       <w:r>
-        <w:t xml:space="preserve">Địa chỉ gốc của ứng dụng là http://localhost:8080. API riêng sử dụng </w:t>
-      </w:r>
-      <w:r>
-        <w:t>Authorization: Bearer &lt;access_token&gt;; form web sử dụng cookie phiên và CSRF. Sau khi đăng nhập web, client gửi POST /auth/api-token với cookie và CSRF hiện hành để nhận token. Dữ liệu người dùng được lấy từ danh tính đã xác thực, không lựa chọn bằng userId</w:t>
-      </w:r>
-      <w:r>
-        <w:t xml:space="preserve"> tùy ý trong request.</w:t>
+        <w:t>Địa chỉ gốc của ứng dụng là http://localhost:8080. API riêng sử dụng Authorization: Bearer &lt;access_token&gt;; form web sử dụng cookie phiên và CSRF. Sau khi đăng nhập web, client gửi POST /auth/api-token với cookie và CSRF hiện hành để nhận token. Dữ liệu người dùng được lấy từ danh tính đã xác thực, không lựa chọn bằng userId tùy ý trong request.</w:t>
       </w:r>
     </w:p>
     <w:tbl>
@@ -7741,13 +7544,7 @@
               <w:rPr>
                 <w:sz w:val="21"/>
               </w:rPr>
-              <w:t>Không tìm thấy tài nguyên trong</w:t>
-            </w:r>
-            <w:r>
-              <w:rPr>
-                <w:sz w:val="21"/>
-              </w:rPr>
-              <w:t xml:space="preserve"> phạm vi truy cập; xung đột dữ liệu; vượt giới hạn tốc độ.</w:t>
+              <w:t>Không tìm thấy tài nguyên trong phạm vi truy cập; xung đột dữ liệu; vượt giới hạn tốc độ.</w:t>
             </w:r>
           </w:p>
         </w:tc>
@@ -7763,12 +7560,9 @@
       <w:pPr>
         <w:pStyle w:val="Heading1"/>
       </w:pPr>
-      <w:bookmarkStart w:id="22" w:name="_Toc244162625"/>
+      <w:bookmarkStart w:id="22" w:name="_Toc244163844"/>
       <w:r>
-        <w:t>CHƯƠNG 5  KIỂM THỬ VÀ TRIỂN KHA</w:t>
-      </w:r>
-      <w:r>
-        <w:t>I</w:t>
+        <w:t>CHƯƠNG 5  KIỂM THỬ VÀ TRIỂN KHAI</w:t>
       </w:r>
       <w:bookmarkEnd w:id="22"/>
     </w:p>
@@ -7776,7 +7570,7 @@
       <w:pPr>
         <w:pStyle w:val="Heading2"/>
       </w:pPr>
-      <w:bookmarkStart w:id="23" w:name="_Toc244162626"/>
+      <w:bookmarkStart w:id="23" w:name="_Toc244163845"/>
       <w:r>
         <w:t>5.1 Phương pháp và kết quả kiểm thử</w:t>
       </w:r>
@@ -7850,14 +7644,7 @@
                 <w:b/>
                 <w:sz w:val="21"/>
               </w:rPr>
-              <w:t xml:space="preserve">Bằng </w:t>
-            </w:r>
-            <w:r>
-              <w:rPr>
-                <w:b/>
-                <w:sz w:val="21"/>
-              </w:rPr>
-              <w:t>chứng và kết quả</w:t>
+              <w:t>Bằng chứng và kết quả</w:t>
             </w:r>
           </w:p>
         </w:tc>
@@ -7959,13 +7746,7 @@
               <w:rPr>
                 <w:sz w:val="21"/>
               </w:rPr>
-              <w:t>FinalWebTest kiểm tra đăng nhập, quyền admin, CSRF, bốn top 20, quote, phạ</w:t>
-            </w:r>
-            <w:r>
-              <w:rPr>
-                <w:sz w:val="21"/>
-              </w:rPr>
-              <w:t>m vi đơn và thông báo thay đổi riêng.</w:t>
+              <w:t>FinalWebTest kiểm tra đăng nhập, quyền admin, CSRF, bốn top 20, quote, phạm vi đơn và thông báo thay đổi riêng.</w:t>
             </w:r>
           </w:p>
         </w:tc>
@@ -8068,13 +7849,7 @@
               <w:rPr>
                 <w:sz w:val="21"/>
               </w:rPr>
-              <w:t>Schema mới và seed nhập thành công. FinalDatabaseAcceptance validate</w:t>
-            </w:r>
-            <w:r>
-              <w:rPr>
-                <w:sz w:val="21"/>
-              </w:rPr>
-              <w:t xml:space="preserve"> mapping, voucher/fee, trả hàng và fake payment trong transaction rollback.</w:t>
+              <w:t>Schema mới và seed nhập thành công. FinalDatabaseAcceptance validate mapping, voucher/fee, trả hàng và fake payment trong transaction rollback.</w:t>
             </w:r>
           </w:p>
         </w:tc>
@@ -8176,13 +7951,7 @@
               <w:rPr>
                 <w:sz w:val="21"/>
               </w:rPr>
-              <w:t xml:space="preserve">Các adapter payOS và Cloudinary có </w:t>
-            </w:r>
-            <w:r>
-              <w:rPr>
-                <w:sz w:val="21"/>
-              </w:rPr>
-              <w:t>cấu hình và kiểm thử riêng; kiểm tra dịch vụ thực tế được thực hiện theo môi trường triển khai.</w:t>
+              <w:t>Các adapter payOS và Cloudinary có cấu hình và kiểm thử riêng; kiểm tra dịch vụ thực tế được thực hiện theo môi trường triển khai.</w:t>
             </w:r>
           </w:p>
         </w:tc>
@@ -8203,17 +7972,14 @@
     </w:p>
     <w:p>
       <w:r>
-        <w:t>Kiểm thử hồi quy tập trung vào chuẩn hóa số tiền, đối chiếu giảm giá và phí giao hàng, kiểm tra quyền và tính nhất quán giữa API với giao diệ</w:t>
-      </w:r>
-      <w:r>
-        <w:t>n.</w:t>
+        <w:t>Kiểm thử hồi quy tập trung vào chuẩn hóa số tiền, đối chiếu giảm giá và phí giao hàng, kiểm tra quyền và tính nhất quán giữa API với giao diện.</w:t>
       </w:r>
     </w:p>
     <w:p>
       <w:pPr>
         <w:pStyle w:val="Heading2"/>
       </w:pPr>
-      <w:bookmarkStart w:id="24" w:name="_Toc244162627"/>
+      <w:bookmarkStart w:id="24" w:name="_Toc244163846"/>
       <w:r>
         <w:t>5.2 Cài đặt ứng dụng</w:t>
       </w:r>
@@ -8435,13 +8201,7 @@
               <w:rPr>
                 <w:sz w:val="21"/>
               </w:rPr>
-              <w:t xml:space="preserve">Tại thư mục dự án, chạy docker compose up -d </w:t>
-            </w:r>
-            <w:r>
-              <w:rPr>
-                <w:sz w:val="21"/>
-              </w:rPr>
-              <w:t>--build --wait. Compose tự tạo PostgreSQL, schema/seed khi volume trống và khóa JWT riêng.</w:t>
+              <w:t>Tại thư mục dự án, chạy docker compose up -d --build --wait. Compose tự tạo PostgreSQL, schema/seed khi volume trống và khóa JWT riêng.</w:t>
             </w:r>
           </w:p>
         </w:tc>
@@ -8543,13 +8303,7 @@
               <w:rPr>
                 <w:sz w:val="21"/>
               </w:rPr>
-              <w:t xml:space="preserve">Dừng bằng docker compose stop hoặc </w:t>
-            </w:r>
-            <w:r>
-              <w:rPr>
-                <w:sz w:val="21"/>
-              </w:rPr>
-              <w:t>down để giữ volume. Không thêm -v nếu muốn giữ dữ liệu. Hướng dẫn đầy đủ: docs/DOCKER_QUICKSTART.md.</w:t>
+              <w:t>Dừng bằng docker compose stop hoặc down để giữ volume. Không thêm -v nếu muốn giữ dữ liệu. Hướng dẫn đầy đủ: docs/DOCKER_QUICKSTART.md.</w:t>
             </w:r>
           </w:p>
         </w:tc>
@@ -8725,13 +8479,7 @@
               <w:rPr>
                 <w:sz w:val="21"/>
               </w:rPr>
-              <w:t xml:space="preserve">admin, reader, buyer, seller, reviewer, manager; </w:t>
-            </w:r>
-            <w:r>
-              <w:rPr>
-                <w:sz w:val="21"/>
-              </w:rPr>
-              <w:t>mật khẩu demo-password-123. Chỉ dùng với dữ liệu minh họa.</w:t>
+              <w:t>admin, reader, buyer, seller, reviewer, manager; mật khẩu demo-password-123. Chỉ dùng với dữ liệu minh họa.</w:t>
             </w:r>
           </w:p>
         </w:tc>
@@ -8833,13 +8581,7 @@
               <w:rPr>
                 <w:sz w:val="21"/>
               </w:rPr>
-              <w:t>GOCSACH10 giảm 10.000 đồng cho shop 1, ngưỡng 50.000 đồng, tối đa 30 lượt; h</w:t>
-            </w:r>
-            <w:r>
-              <w:rPr>
-                <w:sz w:val="21"/>
-              </w:rPr>
-              <w:t>ạn theo bộ seed.</w:t>
+              <w:t>GOCSACH10 giảm 10.000 đồng cho shop 1, ngưỡng 50.000 đồng, tối đa 30 lượt; hạn theo bộ seed.</w:t>
             </w:r>
           </w:p>
         </w:tc>
@@ -8903,17 +8645,14 @@
     </w:p>
     <w:p>
       <w:r>
-        <w:t>Docker Compose tổ chức app, PostgreSQL và Mailpit thành các dịch vụ riêng. Schema và dữ liệu mẫu chỉ được khởi tạo trên volume mới; dữ liệu được giữ khi tạo l</w:t>
-      </w:r>
-      <w:r>
-        <w:t>ại container. payOS mặc định tắt trong cấu hình học nhóm, các dịch vụ ngoài dùng file cấu hình riêng.</w:t>
+        <w:t>Docker Compose tổ chức app, PostgreSQL và Mailpit thành các dịch vụ riêng. Schema và dữ liệu mẫu chỉ được khởi tạo trên volume mới; dữ liệu được giữ khi tạo lại container. payOS mặc định tắt trong cấu hình học nhóm, các dịch vụ ngoài dùng file cấu hình riêng.</w:t>
       </w:r>
     </w:p>
     <w:p>
       <w:pPr>
         <w:pStyle w:val="Heading2"/>
       </w:pPr>
-      <w:bookmarkStart w:id="25" w:name="_Toc244162628"/>
+      <w:bookmarkStart w:id="25" w:name="_Toc244163847"/>
       <w:r>
         <w:lastRenderedPageBreak/>
         <w:t>5.3 Luồng kiểm tra tích hợp</w:t>
@@ -9034,13 +8773,7 @@
               <w:rPr>
                 <w:sz w:val="21"/>
               </w:rPr>
-              <w:t>Đăng ký, nhập OTP từ Mailpit, đăng nhập và tạo địa chỉ. Dữ liệu thuộc đúng</w:t>
-            </w:r>
-            <w:r>
-              <w:rPr>
-                <w:sz w:val="21"/>
-              </w:rPr>
-              <w:t xml:space="preserve"> tài khoản.</w:t>
+              <w:t>Đăng ký, nhập OTP từ Mailpit, đăng nhập và tạo địa chỉ. Dữ liệu thuộc đúng tài khoản.</w:t>
             </w:r>
           </w:p>
         </w:tc>
@@ -9193,13 +8926,7 @@
               <w:rPr>
                 <w:sz w:val="21"/>
               </w:rPr>
-              <w:t xml:space="preserve">Người bán xử lý đơn </w:t>
-            </w:r>
-            <w:r>
-              <w:rPr>
-                <w:sz w:val="21"/>
-              </w:rPr>
-              <w:t>trong cửa hàng được phân quyền; đơn payOS chỉ được giao sau khi xác nhận thanh toán hợp lệ.</w:t>
+              <w:t>Người bán xử lý đơn trong cửa hàng được phân quyền; đơn payOS chỉ được giao sau khi xác nhận thanh toán hợp lệ.</w:t>
             </w:r>
           </w:p>
         </w:tc>
@@ -9261,7 +8988,7 @@
       <w:pPr>
         <w:pStyle w:val="Heading1"/>
       </w:pPr>
-      <w:bookmarkStart w:id="26" w:name="_Toc244162629"/>
+      <w:bookmarkStart w:id="26" w:name="_Toc244163848"/>
       <w:r>
         <w:t>CHƯƠNG 6  PHÂN CÔNG VÀ ỨNG DỤNG AI</w:t>
       </w:r>
@@ -9271,36 +8998,27 @@
       <w:pPr>
         <w:pStyle w:val="Heading2"/>
       </w:pPr>
-      <w:bookmarkStart w:id="27" w:name="_Toc244162630"/>
+      <w:bookmarkStart w:id="27" w:name="_Toc244163849"/>
       <w:r>
-        <w:t>6.1 Phối hợp phát tr</w:t>
-      </w:r>
-      <w:r>
-        <w:t>iển</w:t>
+        <w:t>6.1 Phối hợp phát triển</w:t>
       </w:r>
       <w:bookmarkEnd w:id="27"/>
     </w:p>
     <w:p>
       <w:r>
-        <w:t xml:space="preserve">Nhóm phân chia công việc theo phân hệ, mỗi thành viên phụ trách từ API đến nghiệp vụ và kiểm thử của phần mình. Trưởng nhóm thống nhất cấu trúc DTO, quy tắc lỗi và thứ tự tích hợp. Những điểm giao nhau như danh tính, giỏ, kho, voucher và đơn hàng được </w:t>
-      </w:r>
-      <w:r>
-        <w:t>kiểm tra theo luồng đầy đủ trước khi sử dụng chung.</w:t>
+        <w:t>Nhóm phân chia công việc theo phân hệ, mỗi thành viên phụ trách từ API đến nghiệp vụ và kiểm thử của phần mình. Trưởng nhóm thống nhất cấu trúc DTO, quy tắc lỗi và thứ tự tích hợp. Những điểm giao nhau như danh tính, giỏ, kho, voucher và đơn hàng được kiểm tra theo luồng đầy đủ trước khi sử dụng chung.</w:t>
       </w:r>
     </w:p>
     <w:p>
       <w:r>
-        <w:t>AI được sử dụng để hỗ trợ phân tích yêu cầu, đề xuất cấu trúc controller/service, xây dựng truy vấn, liệt kê tình huống lỗi và soạn ca kiểm thử. Các mẫu prompt dưới đây được tổ chức theo nhiệm vụ của từng</w:t>
-      </w:r>
-      <w:r>
-        <w:t xml:space="preserve"> thành viên. Mỗi yêu cầu nêu bối cảnh, ràng buộc dữ liệu và đầu ra cần kiểm tra; phần code đề xuất được đối chiếu với source và kết quả chạy.</w:t>
+        <w:t>AI được sử dụng để hỗ trợ phân tích yêu cầu, đề xuất cấu trúc controller/service, xây dựng truy vấn, liệt kê tình huống lỗi và soạn ca kiểm thử. Các mẫu prompt dưới đây được tổ chức theo nhiệm vụ của từng thành viên. Mỗi yêu cầu nêu bối cảnh, ràng buộc dữ liệu và đầu ra cần kiểm tra; phần code đề xuất được đối chiếu với source và kết quả chạy.</w:t>
       </w:r>
     </w:p>
     <w:p>
       <w:pPr>
         <w:pStyle w:val="Heading2"/>
       </w:pPr>
-      <w:bookmarkStart w:id="28" w:name="_Toc244162631"/>
+      <w:bookmarkStart w:id="28" w:name="_Toc244163850"/>
       <w:r>
         <w:t>6.2 Lê Trọng Bảo</w:t>
       </w:r>
@@ -9324,24 +9042,12 @@
     </w:p>
     <w:p>
       <w:r>
-        <w:t xml:space="preserve">Tôi là trưởng nhóm 27 </w:t>
-      </w:r>
-      <w:r>
-        <w:t>làm Góc Sách, đề tài 14, với ba thành viên. Bảo phụ trách đơn hàng, thanh toán và tích hợp; Thành phụ trách tài khoản và trải nghiệm người mua; Khang phụ trách shop, kho và quản trị. Hãy đọc yêu cầu cùng source hiện có, chia công việc theo chức năng có thể</w:t>
-      </w:r>
-      <w:r>
-        <w:t xml:space="preserve"> demo độc lập. Với mỗi việc, ghi người phụ trách, đầu ra, phần phụ thuộc, cách nghiệm thu và vướng mắc. Phân biệt đã có code, đã test và đã chạy được trên môi trường demo; không tự đánh dấu hoàn thành. Từ kết quả kiểm tra tôi cung cấp, đề xuất thứ tự xử lý</w:t>
-      </w:r>
-      <w:r>
-        <w:t xml:space="preserve"> phần còn thiếu trước buổi báo cáo, ưu tiên luồng mua hàng xuyên suốt và giải thích lý do đổi thứ tự.</w:t>
+        <w:t>Tôi là trưởng nhóm 27 làm Góc Sách, đề tài 14, với ba thành viên. Bảo phụ trách đơn hàng, thanh toán và tích hợp; Thành phụ trách tài khoản và trải nghiệm người mua; Khang phụ trách shop, kho và quản trị. Hãy đọc yêu cầu cùng source hiện có, chia công việc theo chức năng có thể demo độc lập. Với mỗi việc, ghi người phụ trách, đầu ra, phần phụ thuộc, cách nghiệm thu và vướng mắc. Phân biệt đã có code, đã test và đã chạy được trên môi trường demo; không tự đánh dấu hoàn thành. Từ kết quả kiểm tra tôi cung cấp, đề xuất thứ tự xử lý phần còn thiếu trước buổi báo cáo, ưu tiên luồng mua hàng xuyên suốt và giải thích lý do đổi thứ tự.</w:t>
       </w:r>
     </w:p>
     <w:p>
       <w:r>
-        <w:t>Kết quả cần kiểm tra: bảng công việc có bằng chứng và danh sách việc cần quyết định. Trưởng nhóm xác nhận lại với từng người; AI không tự suy tiến độ từ s</w:t>
-      </w:r>
-      <w:r>
-        <w:t>ố lượng commit.</w:t>
+        <w:t>Kết quả cần kiểm tra: bảng công việc có bằng chứng và danh sách việc cần quyết định. Trưởng nhóm xác nhận lại với từng người; AI không tự suy tiến độ từ số lượng commit.</w:t>
       </w:r>
     </w:p>
     <w:p>
@@ -9355,21 +9061,12 @@
     </w:p>
     <w:p>
       <w:r>
-        <w:t>Rà soát điểm nối giữa ba phần của Góc Sách: Thành bàn giao danh tính, địa chỉ và giỏ; Khang bàn giao bản sách, voucher và phí giao hàng; tôi nhận dữ liệu để báo giá và tạo đơn. Hãy đối chiếu controller</w:t>
-      </w:r>
-      <w:r>
-        <w:t xml:space="preserve">, DTO và service, lập danh sách URL, method, body, quyền, phản hồi và trạng thái lỗi cho các điểm nối này. Phát hiện trường đặt tên khác nhau, kiểu tiền không thống nhất hoặc kiểm tra quyền bị bỏ qua. Đề xuất chỉnh sửa nhỏ nhất để tái sử dụng service hiện </w:t>
-      </w:r>
-      <w:r>
-        <w:t>có. Sau đó viết ca kiểm thử tích hợp từ đăng nhập đến đặt đơn, gồm giỏ nhiều shop, địa chỉ khác chủ và bản sách vừa hết hàng. Đừng tạo endpoint mới nếu source đã có chức năng tương đương.</w:t>
+        <w:t>Rà soát điểm nối giữa ba phần của Góc Sách: Thành bàn giao danh tính, địa chỉ và giỏ; Khang bàn giao bản sách, voucher và phí giao hàng; tôi nhận dữ liệu để báo giá và tạo đơn. Hãy đối chiếu controller, DTO và service, lập danh sách URL, method, body, quyền, phản hồi và trạng thái lỗi cho các điểm nối này. Phát hiện trường đặt tên khác nhau, kiểu tiền không thống nhất hoặc kiểm tra quyền bị bỏ qua. Đề xuất chỉnh sửa nhỏ nhất để tái sử dụng service hiện có. Sau đó viết ca kiểm thử tích hợp từ đăng nhập đến đặt đơn, gồm giỏ nhiều shop, địa chỉ khác chủ và bản sách vừa hết hàng. Đừng tạo endpoint mới nếu source đã có chức năng tương đương.</w:t>
       </w:r>
     </w:p>
     <w:p>
       <w:r>
-        <w:t>Kết quả cần kiểm tra: hợp đồng API và ca kiểm thử giao nhau giữa các</w:t>
-      </w:r>
-      <w:r>
-        <w:t xml:space="preserve"> phần. Bảo cùng Thành, Khang review DTO và quy tắc kho trước khi tích hợp.</w:t>
+        <w:t>Kết quả cần kiểm tra: hợp đồng API và ca kiểm thử giao nhau giữa các phần. Bảo cùng Thành, Khang review DTO và quy tắc kho trước khi tích hợp.</w:t>
       </w:r>
     </w:p>
     <w:p>
@@ -9382,21 +9079,12 @@
     </w:p>
     <w:p>
       <w:r>
-        <w:t>Hãy hỗ trợ hoàn thiện GET /api/checkout/quote và POST /api/checkout. Mỗi cuốn sách vật lý chỉ có một bản; một giỏ có thể chứa sách của</w:t>
-      </w:r>
-      <w:r>
-        <w:t xml:space="preserve"> nhiều shop. Đọc OrderService rồi đề xuất phạm vi transaction và thứ tự khóa dữ liệu. Server phải tính lại giá, phí, voucher; so fingerprint với báo giá người mua đã xem; tách đơn theo shop và chốt các khoản tiền vào đơn. Request gửi lại cùng idempotency k</w:t>
-      </w:r>
-      <w:r>
-        <w:t>ey phải trả kết quả cũ, không tạo thêm đơn hoặc trừ lượt voucher lần nữa. Viết test cho hai người mua cùng bản, giá đổi sau báo giá và lỗi khiến toàn bộ thay đổi rollback. Kiểm tra cả cách chuẩn hóa BigDecimal khi đọc từ PostgreSQL.</w:t>
+        <w:t>Hãy hỗ trợ hoàn thiện GET /api/checkout/quote và POST /api/checkout. Mỗi cuốn sách vật lý chỉ có một bản; một giỏ có thể chứa sách của nhiều shop. Đọc OrderService rồi đề xuất phạm vi transaction và thứ tự khóa dữ liệu. Server phải tính lại giá, phí, voucher; so fingerprint với báo giá người mua đã xem; tách đơn theo shop và chốt các khoản tiền vào đơn. Request gửi lại cùng idempotency key phải trả kết quả cũ, không tạo thêm đơn hoặc trừ lượt voucher lần nữa. Viết test cho hai người mua cùng bản, giá đổi sau báo giá và lỗi khiến toàn bộ thay đổi rollback. Kiểm tra cả cách chuẩn hóa BigDecimal khi đọc từ PostgreSQL.</w:t>
       </w:r>
     </w:p>
     <w:p>
       <w:r>
-        <w:t xml:space="preserve">Kết quả cần kiểm tra: </w:t>
-      </w:r>
-      <w:r>
-        <w:t>controller gọi nghiệp vụ có sẵn, kiểm thử gửi lặp và tranh bản sách. Đối chiếu số tiền trên API, database và màn hình checkout.</w:t>
+        <w:t>Kết quả cần kiểm tra: controller gọi nghiệp vụ có sẵn, kiểm thử gửi lặp và tranh bản sách. Đối chiếu số tiền trên API, database và màn hình checkout.</w:t>
       </w:r>
     </w:p>
     <w:p>
@@ -9409,16 +9097,7 @@
     </w:p>
     <w:p>
       <w:r>
-        <w:t>Đọc PaymentService và adapter payOS, sau đó hỗ trợ hoàn thiện POST /api/order</w:t>
-      </w:r>
-      <w:r>
-        <w:t xml:space="preserve">s/{id}/payment/start, /payment/refresh, /payment/cancel và POST /payments/payos/webhook. Chỉ chuyển PAID sau khi xác minh chữ ký, mã đơn, payment link, loại tiền và số tiền. Không dùng return URL làm bằng chứng đã nhận tiền. Tạo fake gateway trong test để </w:t>
-      </w:r>
-      <w:r>
-        <w:t>mô phỏng thành công, hủy, chữ ký sai, sai tiền, callback lặp, tiền đến sau khi hủy và lỗi kết nối chưa rõ kết quả. Kiểm tra đơn không được giao khi thanh toán chưa hợp lệ; lỗi chưa rõ không được tự thả sách. Trình bày rõ nhánh nào đã kiểm thử giả lập và nh</w:t>
-      </w:r>
-      <w:r>
-        <w:t>ánh nào còn cần webhook HTTPS thật.</w:t>
+        <w:t>Đọc PaymentService và adapter payOS, sau đó hỗ trợ hoàn thiện POST /api/orders/{id}/payment/start, /payment/refresh, /payment/cancel và POST /payments/payos/webhook. Chỉ chuyển PAID sau khi xác minh chữ ký, mã đơn, payment link, loại tiền và số tiền. Không dùng return URL làm bằng chứng đã nhận tiền. Tạo fake gateway trong test để mô phỏng thành công, hủy, chữ ký sai, sai tiền, callback lặp, tiền đến sau khi hủy và lỗi kết nối chưa rõ kết quả. Kiểm tra đơn không được giao khi thanh toán chưa hợp lệ; lỗi chưa rõ không được tự thả sách. Trình bày rõ nhánh nào đã kiểm thử giả lập và nhánh nào còn cần webhook HTTPS thật.</w:t>
       </w:r>
     </w:p>
     <w:p>
@@ -9436,22 +9115,13 @@
     </w:p>
     <w:p>
       <w:r>
-        <w:t>Hỗ trợ hoàn thiện GET /api/orders, POST /api/seller/orders/{id}/status và /api/seller/orders/{id}/return/resolve dựa trên service hiện có. Người mua chỉ xem đơn của mình; người bán chỉ thao tác shop được giao. Lập bảng chuyển trạng thái và điều kiện từ chố</w:t>
-      </w:r>
-      <w:r>
-        <w:t>i. Yêu cầu trả chỉ áp dụng cho đơn COMPLETED và PAID trong bảy ngày; xác nhận hoàn tiền cần tham chiếu và xác nhận xử lý bên ngoài. Sách nhận lại phải về UNAVAILABLE để kiểm tra, không mở bán ngay. Rà soát WebSocket /ws để mỗi phiên chỉ nhận thay đổi đơn đ</w:t>
-      </w:r>
-      <w:r>
-        <w:t>ược phép xem. Viết test sai chủ đơn, sai shop, chuyển trạng thái không hợp lệ và phiên bị thu hồi.</w:t>
+        <w:t>Hỗ trợ hoàn thiện GET /api/orders, POST /api/seller/orders/{id}/status và /api/seller/orders/{id}/return/resolve dựa trên service hiện có. Người mua chỉ xem đơn của mình; người bán chỉ thao tác shop được giao. Lập bảng chuyển trạng thái và điều kiện từ chối. Yêu cầu trả chỉ áp dụng cho đơn COMPLETED và PAID trong bảy ngày; xác nhận hoàn tiền cần tham chiếu và xác nhận xử lý bên ngoài. Sách nhận lại phải về UNAVAILABLE để kiểm tra, không mở bán ngay. Rà soát WebSocket /ws để mỗi phiên chỉ nhận thay đổi đơn được phép xem. Viết test sai chủ đơn, sai shop, chuyển trạng thái không hợp lệ và phiên bị thu hồi.</w:t>
       </w:r>
     </w:p>
     <w:p>
       <w:r>
         <w:lastRenderedPageBreak/>
-        <w:t xml:space="preserve">Kết quả cần kiểm tra: API đơn và trả hàng thống nhất với kho, thông báo không lộ đơn của người khác. Phân biệt ghi nhận hoàn tiền với API chuyển tiền tự </w:t>
-      </w:r>
-      <w:r>
-        <w:t>động.</w:t>
+        <w:t>Kết quả cần kiểm tra: API đơn và trả hàng thống nhất với kho, thông báo không lộ đơn của người khác. Phân biệt ghi nhận hoàn tiền với API chuyển tiền tự động.</w:t>
       </w:r>
     </w:p>
     <w:p>
@@ -9464,28 +9134,19 @@
     </w:p>
     <w:p>
       <w:r>
-        <w:t>Tôi cần bàn giao Góc Sách để hai bạn clone về và chạy bằng docker compose up -d --build --wait. Hãy kiểm tra Compose, cấu hình app, schema và seed; liệt kê phần máy mới cần chuẩn bị. Database demo p</w:t>
-      </w:r>
-      <w:r>
-        <w:t xml:space="preserve">hải độc lập, chỉ seed volume mới; khóa JWT và OTP tự sinh, key dịch vụ nhận qua config/team.properties gửi riêng. Lập checklist chạy từ bản clone sạch, đăng ký và nhận OTP qua Mailpit, gọi API bằng Bearer, đặt COD và giữ dữ liệu sau khi tạo lại container. </w:t>
-      </w:r>
-      <w:r>
-        <w:t>Đối chiếu báo cáo, URL API, SQL và source ZIP với phiên bản bàn giao. Tổng hợp lỗi còn mở, giới hạn dịch vụ thật và đề xuất nội dung demo của từng thành viên, không kết luận đạt khi chưa có kết quả chạy.</w:t>
+        <w:t>Tôi cần bàn giao Góc Sách để hai bạn clone về và chạy bằng docker compose up -d --build --wait. Hãy kiểm tra Compose, cấu hình app, schema và seed; liệt kê phần máy mới cần chuẩn bị. Database demo phải độc lập, chỉ seed volume mới; khóa JWT và OTP tự sinh, key dịch vụ nhận qua config/team.properties gửi riêng. Lập checklist chạy từ bản clone sạch, đăng ký và nhận OTP qua Mailpit, gọi API bằng Bearer, đặt COD và giữ dữ liệu sau khi tạo lại container. Đối chiếu báo cáo, URL API, SQL và source ZIP với phiên bản bàn giao. Tổng hợp lỗi còn mở, giới hạn dịch vụ thật và đề xuất nội dung demo của từng thành viên, không kết luận đạt khi chưa có kết quả chạy.</w:t>
       </w:r>
     </w:p>
     <w:p>
       <w:r>
-        <w:t xml:space="preserve">Kết quả cần kiểm tra: hướng dẫn một lệnh, checklist </w:t>
-      </w:r>
-      <w:r>
-        <w:t>nghiệm thu và danh sách thiếu sót. Bảo kiểm tra bản đóng gói cuối; không đưa key thật vào Git hoặc thư mục nộp chung.</w:t>
+        <w:t>Kết quả cần kiểm tra: hướng dẫn một lệnh, checklist nghiệm thu và danh sách thiếu sót. Bảo kiểm tra bản đóng gói cuối; không đưa key thật vào Git hoặc thư mục nộp chung.</w:t>
       </w:r>
     </w:p>
     <w:p>
       <w:pPr>
         <w:pStyle w:val="Heading2"/>
       </w:pPr>
-      <w:bookmarkStart w:id="29" w:name="_Toc244162632"/>
+      <w:bookmarkStart w:id="29" w:name="_Toc244163851"/>
       <w:r>
         <w:t>6.3 Nguyễn Kiều Thành</w:t>
       </w:r>
@@ -9509,16 +9170,7 @@
     </w:p>
     <w:p>
       <w:r>
-        <w:t>Tôi phụ trách tài khoản của Góc Sách.</w:t>
-      </w:r>
-      <w:r>
-        <w:t xml:space="preserve"> Hãy đọc cấu hình Spring Security và luồng đăng ký, OTP, đăng nhập, quên mật khẩu hiện có trước khi sửa. Giữ các form /auth/register, /auth/activate, /auth/login và /auth/reset với CSRF; không tự chuyển thành /api/login. Hỗ trợ hoàn thiện POST /auth/api-to</w:t>
-      </w:r>
-      <w:r>
-        <w:t>ken sau đăng nhập và hướng dẫn gọi GET /api/me bằng Bearer. Đề xuất test OTP sai hoặc hết hạn, gửi lại quá nhanh, thiếu CSRF, token hết hiệu lực sau logout hoặc khóa tài khoản. Dùng Mailpit để kiểm tra OTP ở môi trường demo. Giải thích rõ phần nào thuộc ph</w:t>
-      </w:r>
-      <w:r>
-        <w:t>iên web, phần nào thuộc JWT và điều kiện từ chối ở server.</w:t>
+        <w:t>Tôi phụ trách tài khoản của Góc Sách. Hãy đọc cấu hình Spring Security và luồng đăng ký, OTP, đăng nhập, quên mật khẩu hiện có trước khi sửa. Giữ các form /auth/register, /auth/activate, /auth/login và /auth/reset với CSRF; không tự chuyển thành /api/login. Hỗ trợ hoàn thiện POST /auth/api-token sau đăng nhập và hướng dẫn gọi GET /api/me bằng Bearer. Đề xuất test OTP sai hoặc hết hạn, gửi lại quá nhanh, thiếu CSRF, token hết hiệu lực sau logout hoặc khóa tài khoản. Dùng Mailpit để kiểm tra OTP ở môi trường demo. Giải thích rõ phần nào thuộc phiên web, phần nào thuộc JWT và điều kiện từ chối ở server.</w:t>
       </w:r>
     </w:p>
     <w:p>
@@ -9531,29 +9183,17 @@
         <w:pStyle w:val="Heading3"/>
       </w:pPr>
       <w:r>
-        <w:t>T02 Phát triển catalog tìm kiếm và bản</w:t>
-      </w:r>
-      <w:r>
-        <w:t>g xếp hạng</w:t>
+        <w:t>T02 Phát triển catalog tìm kiếm và bảng xếp hạng</w:t>
       </w:r>
     </w:p>
     <w:p>
       <w:r>
-        <w:t>Hỗ trợ xây dựng GET /api/products, GET /api/products/{id} và GET /api/rankings/{sort} cho Góc Sách. Đầu sách và bản sách vật lý là hai đối tượng khác nhau. Truy vấn chỉ tính bản AVAILABLE, đã phân loại, thuộc shop hoạt động và danh mục đang bật.</w:t>
-      </w:r>
-      <w:r>
-        <w:t xml:space="preserve"> Giá hiển thị phải là giá thấp nhất của các bản khớp bộ lọc, không lấy giá của bản đã bán hoặc khác điều kiện. Đọc tham số lọc hiện có, bổ sung phân trang và thứ tự ổn định khi bằng điểm. Viết test cho bốn top 20: mới nhất, bán chạy, yêu thích, đánh giá; m</w:t>
-      </w:r>
-      <w:r>
-        <w:t>ỗi trang mười đầu sách. Đối chiếu điều kiện đơn được tính bán và review được tính điểm với service, rồi mô tả cách hiển thị khi không có kết quả.</w:t>
+        <w:t>Hỗ trợ xây dựng GET /api/products, GET /api/products/{id} và GET /api/rankings/{sort} cho Góc Sách. Đầu sách và bản sách vật lý là hai đối tượng khác nhau. Truy vấn chỉ tính bản AVAILABLE, đã phân loại, thuộc shop hoạt động và danh mục đang bật. Giá hiển thị phải là giá thấp nhất của các bản khớp bộ lọc, không lấy giá của bản đã bán hoặc khác điều kiện. Đọc tham số lọc hiện có, bổ sung phân trang và thứ tự ổn định khi bằng điểm. Viết test cho bốn top 20: mới nhất, bán chạy, yêu thích, đánh giá; mỗi trang mười đầu sách. Đối chiếu điều kiện đơn được tính bán và review được tính điểm với service, rồi mô tả cách hiển thị khi không có kết quả.</w:t>
       </w:r>
     </w:p>
     <w:p>
       <w:r>
-        <w:t xml:space="preserve">Kết quả cần kiểm tra: truy vấn, DTO và test lọc đúng bản sách. Thành đối chiếu kết quả JSON với giao diện tìm </w:t>
-      </w:r>
-      <w:r>
-        <w:t>kiếm và bảng xếp hạng.</w:t>
+        <w:t>Kết quả cần kiểm tra: truy vấn, DTO và test lọc đúng bản sách. Thành đối chiếu kết quả JSON với giao diện tìm kiếm và bảng xếp hạng.</w:t>
       </w:r>
     </w:p>
     <w:p>
@@ -9570,21 +9210,12 @@
       </w:r>
       <w:r>
         <w:lastRenderedPageBreak/>
-        <w:t>/api/recen</w:t>
-      </w:r>
-      <w:r>
-        <w:t>t-views. Lấy người dùng từ danh tính đã xác thực; không nhận userId từ client để chọn chủ dữ liệu. Đối chiếu method và DTO đang dùng trước khi viết controller. Giỏ lưu theo copyId vì mỗi bản có tình trạng và giá riêng; khi bản không còn khả dụng phải trả l</w:t>
-      </w:r>
-      <w:r>
-        <w:t>ỗi rõ ràng. Viết test sửa địa chỉ của người khác, thêm bản không thể bán, gửi lặp yêu thích và xem lại giỏ sau đăng nhập. Chuẩn bị dữ liệu giỏ cùng địa chỉ hợp lệ để Bảo tích hợp báo giá và checkout.</w:t>
+        <w:t>/api/recent-views. Lấy người dùng từ danh tính đã xác thực; không nhận userId từ client để chọn chủ dữ liệu. Đối chiếu method và DTO đang dùng trước khi viết controller. Giỏ lưu theo copyId vì mỗi bản có tình trạng và giá riêng; khi bản không còn khả dụng phải trả lỗi rõ ràng. Viết test sửa địa chỉ của người khác, thêm bản không thể bán, gửi lặp yêu thích và xem lại giỏ sau đăng nhập. Chuẩn bị dữ liệu giỏ cùng địa chỉ hợp lệ để Bảo tích hợp báo giá và checkout.</w:t>
       </w:r>
     </w:p>
     <w:p>
       <w:r>
-        <w:t>Kết quả cần kiểm tra: API có kiểm tra quyền sở hữu, phản</w:t>
-      </w:r>
-      <w:r>
-        <w:t xml:space="preserve"> hồi lỗi dễ hiểu và dữ liệu bàn giao checkout. Không suy giá cuối cùng từ dữ liệu đang hiển thị trong giỏ.</w:t>
+        <w:t>Kết quả cần kiểm tra: API có kiểm tra quyền sở hữu, phản hồi lỗi dễ hiểu và dữ liệu bàn giao checkout. Không suy giá cuối cùng từ dữ liệu đang hiển thị trong giỏ.</w:t>
       </w:r>
     </w:p>
     <w:p>
@@ -9597,16 +9228,7 @@
     </w:p>
     <w:p>
       <w:r>
-        <w:t>Đọc ReviewService rồi hỗ trợ hoàn thiện POST /api/products/{productId}/reviews và PUT /api/products/{productId}</w:t>
-      </w:r>
-      <w:r>
-        <w:t xml:space="preserve">/reviews/mine, gồm JSON và multipart theo contract hiện tại. Chỉ người đã mua đầu sách trong đơn COMPLETED được đánh giá; mỗi người có một đánh giá cho đầu sách. Kiểm tra quyền trước khi upload, giới hạn nội dung và ảnh hoặc MP4 tối đa 5 MB theo cấu hình. </w:t>
-      </w:r>
-      <w:r>
-        <w:t xml:space="preserve">Dùng adapter Cloudinary hiện có, trả lỗi hợp lý khi dịch vụ thất bại. Viết test người chưa mua, product không thuộc lịch sử mua, file sai loại hoặc quá lớn, sửa đánh giá người khác và review bị ẩn. Phối hợp với Khang để review ẩn không xuất hiện công khai </w:t>
-      </w:r>
-      <w:r>
-        <w:t>hoặc làm sai điểm xếp hạng.</w:t>
+        <w:t>Đọc ReviewService rồi hỗ trợ hoàn thiện POST /api/products/{productId}/reviews và PUT /api/products/{productId}/reviews/mine, gồm JSON và multipart theo contract hiện tại. Chỉ người đã mua đầu sách trong đơn COMPLETED được đánh giá; mỗi người có một đánh giá cho đầu sách. Kiểm tra quyền trước khi upload, giới hạn nội dung và ảnh hoặc MP4 tối đa 5 MB theo cấu hình. Dùng adapter Cloudinary hiện có, trả lỗi hợp lý khi dịch vụ thất bại. Viết test người chưa mua, product không thuộc lịch sử mua, file sai loại hoặc quá lớn, sửa đánh giá người khác và review bị ẩn. Phối hợp với Khang để review ẩn không xuất hiện công khai hoặc làm sai điểm xếp hạng.</w:t>
       </w:r>
     </w:p>
     <w:p>
@@ -9618,7 +9240,7 @@
       <w:pPr>
         <w:pStyle w:val="Heading2"/>
       </w:pPr>
-      <w:bookmarkStart w:id="30" w:name="_Toc244162633"/>
+      <w:bookmarkStart w:id="30" w:name="_Toc244163852"/>
       <w:r>
         <w:t>6.4 Nguyễn An Khang</w:t>
       </w:r>
@@ -9637,29 +9259,17 @@
         <w:pStyle w:val="Heading3"/>
       </w:pPr>
       <w:r>
-        <w:t>K01 Quản lý shop và th</w:t>
-      </w:r>
-      <w:r>
-        <w:t>ành viên theo quyền</w:t>
+        <w:t>K01 Quản lý shop và thành viên theo quyền</w:t>
       </w:r>
     </w:p>
     <w:p>
       <w:r>
-        <w:t>Tôi phụ trách vận hành shop của Góc Sách. Hãy đọc ShopAccess và service hiện có để hoàn thiện POST /api/account/shop-applications, POST /api/admin/shop-applications/{id}/approve và các API thành viên dưới /api/seller/shops/{id}/members.</w:t>
-      </w:r>
-      <w:r>
-        <w:t xml:space="preserve"> Admin duyệt shop; quyền Manager và Seller phải kiểm tra theo shop_memberships, không chỉ theo một role chung. Xác định đúng method và body từ source, giữ kiểm tra trạng thái tài khoản và shop trong service. Viết test người ở shop A truy cập shop B, Seller</w:t>
-      </w:r>
-      <w:r>
-        <w:t xml:space="preserve"> cố sửa thành viên và shop bị đình chỉ. Giải thích request đi qua controller, kiểm tra quyền và dữ liệu như thế nào để tôi dùng trong phần demo quản trị.</w:t>
+        <w:t>Tôi phụ trách vận hành shop của Góc Sách. Hãy đọc ShopAccess và service hiện có để hoàn thiện POST /api/account/shop-applications, POST /api/admin/shop-applications/{id}/approve và các API thành viên dưới /api/seller/shops/{id}/members. Admin duyệt shop; quyền Manager và Seller phải kiểm tra theo shop_memberships, không chỉ theo một role chung. Xác định đúng method và body từ source, giữ kiểm tra trạng thái tài khoản và shop trong service. Viết test người ở shop A truy cập shop B, Seller cố sửa thành viên và shop bị đình chỉ. Giải thích request đi qua controller, kiểm tra quyền và dữ liệu như thế nào để tôi dùng trong phần demo quản trị.</w:t>
       </w:r>
     </w:p>
     <w:p>
       <w:r>
-        <w:t>Kết quả cần kiểm tra: API shop/thành viên và ma trận quyền có test. Khang bàn giao shop hoạt động cùng</w:t>
-      </w:r>
-      <w:r>
-        <w:t xml:space="preserve"> tài khoản đúng vai trò cho nhóm kiểm thử tích hợp.</w:t>
+        <w:t>Kết quả cần kiểm tra: API shop/thành viên và ma trận quyền có test. Khang bàn giao shop hoạt động cùng tài khoản đúng vai trò cho nhóm kiểm thử tích hợp.</w:t>
       </w:r>
     </w:p>
     <w:p>
@@ -9672,22 +9282,13 @@
     </w:p>
     <w:p>
       <w:r>
-        <w:t>Hỗ trợ xây dựng GET, POST và PUT cho bản sách dưới /api/seller/shops/{shopId}/copies, đồng thời rà soát CRUD /api/admin/products và /api/admin/categories.</w:t>
-      </w:r>
-      <w:r>
-        <w:t xml:space="preserve"> Đọc DTO trước khi viết: giá và tình trạng thuộc từng bản vật lý, không thuộc đầu sách dùng chung. Khi cập nhật kho phải gửi version nhận từ GET để phát hiện ghi đè; chỉ sửa dữ liệu trong shop có quyền. Không cho màn hình kho tự đổi bản RESERVED hoặc SOLD </w:t>
-      </w:r>
-      <w:r>
-        <w:t>trái luồng đơn. Viết test version cũ, sai shop và bản đang được giữ trong checkout. Phối hợp với Bảo để hủy đơn hoặc nhận hàng trả lại đi qua nghiệp vụ đơn, có lịch sử kho và rollback khi lỗi.</w:t>
+        <w:t>Hỗ trợ xây dựng GET, POST và PUT cho bản sách dưới /api/seller/shops/{shopId}/copies, đồng thời rà soát CRUD /api/admin/products và /api/admin/categories. Đọc DTO trước khi viết: giá và tình trạng thuộc từng bản vật lý, không thuộc đầu sách dùng chung. Khi cập nhật kho phải gửi version nhận từ GET để phát hiện ghi đè; chỉ sửa dữ liệu trong shop có quyền. Không cho màn hình kho tự đổi bản RESERVED hoặc SOLD trái luồng đơn. Viết test version cũ, sai shop và bản đang được giữ trong checkout. Phối hợp với Bảo để hủy đơn hoặc nhận hàng trả lại đi qua nghiệp vụ đơn, có lịch sử kho và rollback khi lỗi.</w:t>
       </w:r>
     </w:p>
     <w:p>
       <w:r>
         <w:lastRenderedPageBreak/>
-        <w:t>Kết quả cần kiểm tra: API kho có kiểm tra version và CRUD catal</w:t>
-      </w:r>
-      <w:r>
-        <w:t>og tách đúng dữ liệu. Dùng dữ liệu trước/sau để giải thích vì sao một cuốn không thể bán hai lần.</w:t>
+        <w:t>Kết quả cần kiểm tra: API kho có kiểm tra version và CRUD catalog tách đúng dữ liệu. Dùng dữ liệu trước/sau để giải thích vì sao một cuốn không thể bán hai lần.</w:t>
       </w:r>
     </w:p>
     <w:p>
@@ -9700,16 +9301,7 @@
     </w:p>
     <w:p>
       <w:r>
-        <w:t>Đọc OperationsService để hỗ trợ API voucher theo shop, /api/admin/carriers và GET /api/seller/shops/{id}/reve</w:t>
-      </w:r>
-      <w:r>
-        <w:t xml:space="preserve">nue. Voucher phải kiểm tra shop, hạn, ngưỡng đơn và lượt dùng; phía checkout tính lại trên server. Đề xuất dữ liệu kiểm thử để Bảo kiểm tra tiền sách, giảm giá, phí giao hàng và tỷ lệ chiết khấu được chốt vào đơn. Đổi cấu hình hiện tại không được làm thay </w:t>
-      </w:r>
-      <w:r>
-        <w:t xml:space="preserve">đổi số tiền đơn cũ. Với doanh thu, chỉ tính đơn COMPLETED và PAID, loại các trạng thái trả hàng theo quy tắc service; làm tròn bằng BigDecimal. Viết test voucher hết hạn, sai shop và thay phí sau đặt đơn; giải thích rõ phí vận chuyển thống kê riêng và kết </w:t>
-      </w:r>
-      <w:r>
-        <w:t>quả doanh thu không phải lệnh chuyển tiền.</w:t>
+        <w:t>Đọc OperationsService để hỗ trợ API voucher theo shop, /api/admin/carriers và GET /api/seller/shops/{id}/revenue. Voucher phải kiểm tra shop, hạn, ngưỡng đơn và lượt dùng; phía checkout tính lại trên server. Đề xuất dữ liệu kiểm thử để Bảo kiểm tra tiền sách, giảm giá, phí giao hàng và tỷ lệ chiết khấu được chốt vào đơn. Đổi cấu hình hiện tại không được làm thay đổi số tiền đơn cũ. Với doanh thu, chỉ tính đơn COMPLETED và PAID, loại các trạng thái trả hàng theo quy tắc service; làm tròn bằng BigDecimal. Viết test voucher hết hạn, sai shop và thay phí sau đặt đơn; giải thích rõ phí vận chuyển thống kê riêng và kết quả doanh thu không phải lệnh chuyển tiền.</w:t>
       </w:r>
     </w:p>
     <w:p>
@@ -9727,31 +9319,19 @@
     </w:p>
     <w:p>
       <w:r>
-        <w:t xml:space="preserve">Hãy hỗ </w:t>
-      </w:r>
-      <w:r>
-        <w:t>trợ hoàn thiện PUT /api/admin/users/{id}/block và PUT /api/admin/reviews/{id}/visibility theo controller hiện có. Chỉ Admin được thao tác; khóa tài khoản phải làm phiên và token cũ mất hiệu lực theo cơ chế auth_version của dự án. Ẩn review cần lý do và phả</w:t>
-      </w:r>
-      <w:r>
-        <w:t>i ảnh hưởng đúng đến danh sách công khai cùng điểm đánh giá sản phẩm. Viết test thiếu token, tài khoản không phải Admin, khóa user đang có phiên và ẩn rồi hiện lại review. Rà soát giao diện để thao tác lỗi giữ lại thông tin cần sửa, không báo thành công ch</w:t>
-      </w:r>
-      <w:r>
-        <w:t>ỉ vì đã bấm nút. Phối hợp với Thành xác nhận cả API lẫn màn hình người mua đều áp dụng trạng thái mới.</w:t>
+        <w:t>Hãy hỗ trợ hoàn thiện PUT /api/admin/users/{id}/block và PUT /api/admin/reviews/{id}/visibility theo controller hiện có. Chỉ Admin được thao tác; khóa tài khoản phải làm phiên và token cũ mất hiệu lực theo cơ chế auth_version của dự án. Ẩn review cần lý do và phải ảnh hưởng đúng đến danh sách công khai cùng điểm đánh giá sản phẩm. Viết test thiếu token, tài khoản không phải Admin, khóa user đang có phiên và ẩn rồi hiện lại review. Rà soát giao diện để thao tác lỗi giữ lại thông tin cần sửa, không báo thành công chỉ vì đã bấm nút. Phối hợp với Thành xác nhận cả API lẫn màn hình người mua đều áp dụng trạng thái mới.</w:t>
       </w:r>
     </w:p>
     <w:p>
       <w:r>
-        <w:t>Kết quả cần kiểm tra: API quản trị với test phân quyền và thu hồi quyền truy cập. Khang kiểm tra lại bằng tài khoản Admin và tài khoản thường trên cùng b</w:t>
-      </w:r>
-      <w:r>
-        <w:t>ộ dữ liệu demo.</w:t>
+        <w:t>Kết quả cần kiểm tra: API quản trị với test phân quyền và thu hồi quyền truy cập. Khang kiểm tra lại bằng tài khoản Admin và tài khoản thường trên cùng bộ dữ liệu demo.</w:t>
       </w:r>
     </w:p>
     <w:p>
       <w:pPr>
         <w:pStyle w:val="Heading2"/>
       </w:pPr>
-      <w:bookmarkStart w:id="31" w:name="_Toc244162634"/>
+      <w:bookmarkStart w:id="31" w:name="_Toc244163853"/>
       <w:r>
         <w:t>6.5 Kiểm soát kết quả và tích hợp</w:t>
       </w:r>
@@ -9759,10 +9339,7 @@
     </w:p>
     <w:p>
       <w:r>
-        <w:t xml:space="preserve">Các thay đổi được rà soát ở controller, service và lớp dữ liệu. Nhóm kiểm tra đầu vào hợp lệ, dữ liệu sai, sai quyền và xung đột trạng thái; sau đó đối chiếu kết quả API với giao diện. Đối với chức năng có </w:t>
-      </w:r>
-      <w:r>
-        <w:t>phụ thuộc, thành viên phụ trách trao đổi DTO và điều kiện nghiệp vụ với người nhận dữ liệu. Repository GitHub lưu mã nguồn, cấu hình mẫu, SQL, tài liệu API và hướng dẫn chạy bằng Docker.</w:t>
+        <w:t>Các thay đổi được rà soát ở controller, service và lớp dữ liệu. Nhóm kiểm tra đầu vào hợp lệ, dữ liệu sai, sai quyền và xung đột trạng thái; sau đó đối chiếu kết quả API với giao diện. Đối với chức năng có phụ thuộc, thành viên phụ trách trao đổi DTO và điều kiện nghiệp vụ với người nhận dữ liệu. Repository GitHub lưu mã nguồn, cấu hình mẫu, SQL, tài liệu API và hướng dẫn chạy bằng Docker.</w:t>
       </w:r>
     </w:p>
     <w:p>
@@ -9774,12 +9351,9 @@
       <w:pPr>
         <w:pStyle w:val="Heading1"/>
       </w:pPr>
-      <w:bookmarkStart w:id="32" w:name="_Toc244162635"/>
+      <w:bookmarkStart w:id="32" w:name="_Toc244163854"/>
       <w:r>
-        <w:t>CHƯƠNG 7  KẾT LUẬN</w:t>
-      </w:r>
-      <w:r>
-        <w:t xml:space="preserve"> VÀ HƯỚNG PHÁT TRIỂN</w:t>
+        <w:t>CHƯƠNG 7  KẾT LUẬN VÀ HƯỚNG PHÁT TRIỂN</w:t>
       </w:r>
       <w:bookmarkEnd w:id="32"/>
     </w:p>
@@ -9787,7 +9361,7 @@
       <w:pPr>
         <w:pStyle w:val="Heading2"/>
       </w:pPr>
-      <w:bookmarkStart w:id="33" w:name="_Toc244162636"/>
+      <w:bookmarkStart w:id="33" w:name="_Toc244163855"/>
       <w:r>
         <w:t>7.1 Kết quả của đề tài</w:t>
       </w:r>
@@ -9795,17 +9369,14 @@
     </w:p>
     <w:p>
       <w:r>
-        <w:t>Góc Sách hình thành một luồng nghiệp vụ từ tìm kiếm và lựa chọn bản sách, đặt hàng theo cửa hàng, thanh toán, xử lý đơn đến đánh giá và trả hàng. Việc quản lý từng bản vật lý giúp lưu đúng tình trạng, giá và lịch</w:t>
-      </w:r>
-      <w:r>
-        <w:t xml:space="preserve"> sử kho; snapshot giữ ổn định thông tin đơn khi cấu hình bán hàng thay đổi. Hệ thống phân quyền theo tài khoản và cửa hàng, đồng thời cung cấp API dùng chung service với giao diện web.</w:t>
+        <w:t>Góc Sách hình thành một luồng nghiệp vụ từ tìm kiếm và lựa chọn bản sách, đặt hàng theo cửa hàng, thanh toán, xử lý đơn đến đánh giá và trả hàng. Việc quản lý từng bản vật lý giúp lưu đúng tình trạng, giá và lịch sử kho; snapshot giữ ổn định thông tin đơn khi cấu hình bán hàng thay đổi. Hệ thống phân quyền theo tài khoản và cửa hàng, đồng thời cung cấp API dùng chung service với giao diện web.</w:t>
       </w:r>
     </w:p>
     <w:p>
       <w:pPr>
         <w:pStyle w:val="Heading2"/>
       </w:pPr>
-      <w:bookmarkStart w:id="34" w:name="_Toc244162637"/>
+      <w:bookmarkStart w:id="34" w:name="_Toc244163856"/>
       <w:r>
         <w:lastRenderedPageBreak/>
         <w:t>7.2 Phạm vi tích hợp và hướng mở rộng</w:t>
@@ -9814,21 +9385,12 @@
     </w:p>
     <w:p>
       <w:r>
-        <w:t>Phí giao hàng được quản lý bằng b</w:t>
-      </w:r>
-      <w:r>
-        <w:t>ảng phí nội bộ. Hoàn tiền hiện ghi nhận kết quả xử lý bên ngoài cùng tham chiếu đối soát. Kiểm thử payOS sử dụng gateway mô phỏng để chủ động kiểm tra các phản hồi và tình huống lỗi; triển khai thanh toán thực tế cần kiểm tra cấu hình dịch vụ và webhook HT</w:t>
-      </w:r>
-      <w:r>
-        <w:t>TPS trong môi trường tương ứng.</w:t>
+        <w:t>Phí giao hàng được quản lý bằng bảng phí nội bộ. Hoàn tiền hiện ghi nhận kết quả xử lý bên ngoài cùng tham chiếu đối soát. Kiểm thử payOS sử dụng gateway mô phỏng để chủ động kiểm tra các phản hồi và tình huống lỗi; triển khai thanh toán thực tế cần kiểm tra cấu hình dịch vụ và webhook HTTPS trong môi trường tương ứng.</w:t>
       </w:r>
     </w:p>
     <w:p>
       <w:r>
-        <w:t xml:space="preserve">Các hướng mở rộng gồm kết nối API vận đơn, tự động hóa đối soát và hoàn tiền, bổ sung cơ chế dọn media không còn sử dụng và đánh giá tải khi triển khai nhiều instance. Với môi trường nhiều máy chủ, cơ chế cấp quyền token và </w:t>
-      </w:r>
-      <w:r>
-        <w:t>thông báo cần chuyển từ bộ nhớ một instance sang hạ tầng dùng chung.</w:t>
+        <w:t>Các hướng mở rộng gồm kết nối API vận đơn, tự động hóa đối soát và hoàn tiền, bổ sung cơ chế dọn media không còn sử dụng và đánh giá tải khi triển khai nhiều instance. Với môi trường nhiều máy chủ, cơ chế cấp quyền token và thông báo cần chuyển từ bộ nhớ một instance sang hạ tầng dùng chung.</w:t>
       </w:r>
     </w:p>
     <w:p>
@@ -9836,7 +9398,7 @@
         <w:pStyle w:val="Heading1"/>
         <w:pageBreakBefore/>
       </w:pPr>
-      <w:bookmarkStart w:id="35" w:name="_Toc244162638"/>
+      <w:bookmarkStart w:id="35" w:name="_Toc244163857"/>
       <w:r>
         <w:lastRenderedPageBreak/>
         <w:t>PHỤ LỤC A  DANH MỤC API THEO THÀNH VIÊN</w:t>
@@ -9845,17 +9407,14 @@
     </w:p>
     <w:p>
       <w:r>
-        <w:t>Các URL sử dụng cấu hình mặc định http://localhost:8080. Tham số trong dấu ngoặc nhọn được thay bằng ID hoặc slug của tài nguyên. Khi thay port hoặ</w:t>
-      </w:r>
-      <w:r>
-        <w:t>c context-path, sử dụng địa chỉ tương ứng của môi trường chạy.</w:t>
+        <w:t>Các URL sử dụng cấu hình mặc định http://localhost:8080. Tham số trong dấu ngoặc nhọn được thay bằng ID hoặc slug của tài nguyên. Khi thay port hoặc context-path, sử dụng địa chỉ tương ứng của môi trường chạy.</w:t>
       </w:r>
     </w:p>
     <w:p>
       <w:pPr>
         <w:pStyle w:val="Heading2"/>
       </w:pPr>
-      <w:bookmarkStart w:id="36" w:name="_Toc244162639"/>
+      <w:bookmarkStart w:id="36" w:name="_Toc244163858"/>
       <w:r>
         <w:t>A.1 Lê Trọng Bảo</w:t>
       </w:r>
@@ -10054,13 +9613,7 @@
               <w:rPr>
                 <w:sz w:val="21"/>
               </w:rPr>
-              <w:t xml:space="preserve">GET </w:t>
-            </w:r>
-            <w:r>
-              <w:rPr>
-                <w:sz w:val="21"/>
-              </w:rPr>
-              <w:t>http://localhost:8080/api/orders</w:t>
+              <w:t>GET http://localhost:8080/api/orders</w:t>
             </w:r>
           </w:p>
         </w:tc>
@@ -10389,13 +9942,7 @@
               <w:rPr>
                 <w:sz w:val="21"/>
               </w:rPr>
-              <w:t>Bear</w:t>
-            </w:r>
-            <w:r>
-              <w:rPr>
-                <w:sz w:val="21"/>
-              </w:rPr>
-              <w:t>er, dữ liệu của mình</w:t>
+              <w:t>Bearer, dữ liệu của mình</w:t>
             </w:r>
           </w:p>
         </w:tc>
@@ -10576,13 +10123,7 @@
               <w:rPr>
                 <w:sz w:val="21"/>
               </w:rPr>
-              <w:t xml:space="preserve">GET </w:t>
-            </w:r>
-            <w:r>
-              <w:rPr>
-                <w:sz w:val="21"/>
-              </w:rPr>
-              <w:t>http://localhost:8080/api/seller/orders/{id}</w:t>
+              <w:t>GET http://localhost:8080/api/seller/orders/{id}</w:t>
             </w:r>
           </w:p>
         </w:tc>
@@ -10735,13 +10276,7 @@
               <w:rPr>
                 <w:sz w:val="21"/>
               </w:rPr>
-              <w:t>POST http://localhost:8080/api/seller/</w:t>
-            </w:r>
-            <w:r>
-              <w:rPr>
-                <w:sz w:val="21"/>
-              </w:rPr>
-              <w:t>orders/{id}/status</w:t>
+              <w:t>POST http://localhost:8080/api/seller/orders/{id}/status</w:t>
             </w:r>
           </w:p>
         </w:tc>
@@ -10875,17 +10410,14 @@
     <w:p/>
     <w:p>
       <w:r>
-        <w:t xml:space="preserve">Thông báo: ws://localhost:8080/ws, sử dụng phiên web đã đăng nhập. Webhook payOS </w:t>
-      </w:r>
-      <w:r>
-        <w:t>xác thực bằng chữ ký của cổng thanh toán.</w:t>
+        <w:t>Thông báo: ws://localhost:8080/ws, sử dụng phiên web đã đăng nhập. Webhook payOS xác thực bằng chữ ký của cổng thanh toán.</w:t>
       </w:r>
     </w:p>
     <w:p>
       <w:pPr>
         <w:pStyle w:val="Heading2"/>
       </w:pPr>
-      <w:bookmarkStart w:id="37" w:name="_Toc244162640"/>
+      <w:bookmarkStart w:id="37" w:name="_Toc244163859"/>
       <w:r>
         <w:t>A.2 Nguyễn Kiều Thành</w:t>
       </w:r>
@@ -11084,13 +10616,7 @@
               <w:rPr>
                 <w:sz w:val="21"/>
               </w:rPr>
-              <w:t xml:space="preserve">DELETE </w:t>
-            </w:r>
-            <w:r>
-              <w:rPr>
-                <w:sz w:val="21"/>
-              </w:rPr>
-              <w:t>http://localhost:8080/api/account/addresses/{id}</w:t>
+              <w:t>DELETE http://localhost:8080/api/account/addresses/{id}</w:t>
             </w:r>
           </w:p>
         </w:tc>
@@ -11244,13 +10770,7 @@
               <w:rPr>
                 <w:sz w:val="21"/>
               </w:rPr>
-              <w:t xml:space="preserve">GET </w:t>
-            </w:r>
-            <w:r>
-              <w:rPr>
-                <w:sz w:val="21"/>
-              </w:rPr>
-              <w:t>http://localhost:8080/api/account/profile</w:t>
+              <w:t>GET http://localhost:8080/api/account/profile</w:t>
             </w:r>
           </w:p>
         </w:tc>
@@ -11426,13 +10946,7 @@
               <w:rPr>
                 <w:sz w:val="21"/>
               </w:rPr>
-              <w:t>Bearer, dữ li</w:t>
-            </w:r>
-            <w:r>
-              <w:rPr>
-                <w:sz w:val="21"/>
-              </w:rPr>
-              <w:t>ệu của mình</w:t>
+              <w:t>Bearer, dữ liệu của mình</w:t>
             </w:r>
           </w:p>
         </w:tc>
@@ -11613,13 +11127,7 @@
               <w:rPr>
                 <w:sz w:val="21"/>
               </w:rPr>
-              <w:t xml:space="preserve">DELETE </w:t>
-            </w:r>
-            <w:r>
-              <w:rPr>
-                <w:sz w:val="21"/>
-              </w:rPr>
-              <w:t>http://localhost:8080/api/favorites/{productId}</w:t>
+              <w:t>DELETE http://localhost:8080/api/favorites/{productId}</w:t>
             </w:r>
           </w:p>
         </w:tc>
@@ -11795,13 +11303,7 @@
               <w:rPr>
                 <w:sz w:val="21"/>
               </w:rPr>
-              <w:t>Công k</w:t>
-            </w:r>
-            <w:r>
-              <w:rPr>
-                <w:sz w:val="21"/>
-              </w:rPr>
-              <w:t>hai</w:t>
+              <w:t>Công khai</w:t>
             </w:r>
           </w:p>
         </w:tc>
@@ -11982,13 +11484,7 @@
               <w:rPr>
                 <w:sz w:val="21"/>
               </w:rPr>
-              <w:t xml:space="preserve">GET </w:t>
-            </w:r>
-            <w:r>
-              <w:rPr>
-                <w:sz w:val="21"/>
-              </w:rPr>
-              <w:t>http://localhost:8080/api/products/{productId}/reviews/mine</w:t>
+              <w:t>GET http://localhost:8080/api/products/{productId}/reviews/mine</w:t>
             </w:r>
           </w:p>
         </w:tc>
@@ -12141,13 +11637,7 @@
               <w:rPr>
                 <w:sz w:val="21"/>
               </w:rPr>
-              <w:t>GET http://localhost:80</w:t>
-            </w:r>
-            <w:r>
-              <w:rPr>
-                <w:sz w:val="21"/>
-              </w:rPr>
-              <w:t>80/api/recent-views</w:t>
+              <w:t>GET http://localhost:8080/api/recent-views</w:t>
             </w:r>
           </w:p>
         </w:tc>
@@ -12351,13 +11841,7 @@
               <w:rPr>
                 <w:sz w:val="21"/>
               </w:rPr>
-              <w:t xml:space="preserve">POST </w:t>
-            </w:r>
-            <w:r>
-              <w:rPr>
-                <w:sz w:val="21"/>
-              </w:rPr>
-              <w:t>http://localhost:8080/auth/api-token</w:t>
+              <w:t>POST http://localhost:8080/auth/api-token</w:t>
             </w:r>
           </w:p>
         </w:tc>
@@ -12414,10 +11898,7 @@
     </w:p>
     <w:p>
       <w:r>
-        <w:t>http://localhost:8080/a</w:t>
-      </w:r>
-      <w:r>
-        <w:t>uth/reset</w:t>
+        <w:t>http://localhost:8080/auth/reset</w:t>
       </w:r>
     </w:p>
     <w:p>
@@ -12434,7 +11915,7 @@
       <w:pPr>
         <w:pStyle w:val="Heading2"/>
       </w:pPr>
-      <w:bookmarkStart w:id="38" w:name="_Toc244162641"/>
+      <w:bookmarkStart w:id="38" w:name="_Toc244163860"/>
       <w:r>
         <w:lastRenderedPageBreak/>
         <w:t>A.3 Nguyễn An Khang</w:t>
@@ -12583,13 +12064,7 @@
               <w:rPr>
                 <w:sz w:val="21"/>
               </w:rPr>
-              <w:t xml:space="preserve">POST </w:t>
-            </w:r>
-            <w:r>
-              <w:rPr>
-                <w:sz w:val="21"/>
-              </w:rPr>
-              <w:t>http://localhost:8080/api/account/shop-applications</w:t>
+              <w:t>POST http://localhost:8080/api/account/shop-applications</w:t>
             </w:r>
           </w:p>
         </w:tc>
@@ -12793,13 +12268,7 @@
               <w:rPr>
                 <w:sz w:val="21"/>
               </w:rPr>
-              <w:t xml:space="preserve">GET </w:t>
-            </w:r>
-            <w:r>
-              <w:rPr>
-                <w:sz w:val="21"/>
-              </w:rPr>
-              <w:t>http://localhost:8080/api/admin/categories</w:t>
+              <w:t>GET http://localhost:8080/api/admin/categories</w:t>
             </w:r>
           </w:p>
         </w:tc>
@@ -13003,13 +12472,7 @@
               <w:rPr>
                 <w:sz w:val="21"/>
               </w:rPr>
-              <w:t>PUT http://localhost:8080/api/</w:t>
-            </w:r>
-            <w:r>
-              <w:rPr>
-                <w:sz w:val="21"/>
-              </w:rPr>
-              <w:t>admin/categories/{id}</w:t>
+              <w:t>PUT http://localhost:8080/api/admin/categories/{id}</w:t>
             </w:r>
           </w:p>
         </w:tc>
@@ -13264,13 +12727,7 @@
               <w:rPr>
                 <w:sz w:val="21"/>
               </w:rPr>
-              <w:t xml:space="preserve">GET </w:t>
-            </w:r>
-            <w:r>
-              <w:rPr>
-                <w:sz w:val="21"/>
-              </w:rPr>
-              <w:t>http://localhost:8080/api/admin/products/{id}</w:t>
+              <w:t>GET http://localhost:8080/api/admin/products/{id}</w:t>
             </w:r>
           </w:p>
         </w:tc>
@@ -13474,13 +12931,7 @@
               <w:rPr>
                 <w:sz w:val="21"/>
               </w:rPr>
-              <w:t xml:space="preserve">GET </w:t>
-            </w:r>
-            <w:r>
-              <w:rPr>
-                <w:sz w:val="21"/>
-              </w:rPr>
-              <w:t>http://localhost:8080/api/admin/shop-applications</w:t>
+              <w:t>GET http://localhost:8080/api/admin/shop-applications</w:t>
             </w:r>
           </w:p>
         </w:tc>
@@ -13633,13 +13084,7 @@
               <w:rPr>
                 <w:sz w:val="21"/>
               </w:rPr>
-              <w:t>PUT http://localhost:8080/api/admin/shops/{id}/com</w:t>
-            </w:r>
-            <w:r>
-              <w:rPr>
-                <w:sz w:val="21"/>
-              </w:rPr>
-              <w:t>mission</w:t>
+              <w:t>PUT http://localhost:8080/api/admin/shops/{id}/commission</w:t>
             </w:r>
           </w:p>
         </w:tc>
@@ -14070,13 +13515,7 @@
               <w:rPr>
                 <w:sz w:val="21"/>
               </w:rPr>
-              <w:t>Qu</w:t>
-            </w:r>
-            <w:r>
-              <w:rPr>
-                <w:sz w:val="21"/>
-              </w:rPr>
-              <w:t>yền theo shop</w:t>
+              <w:t>Quyền theo shop</w:t>
             </w:r>
           </w:p>
         </w:tc>
@@ -14258,13 +13697,7 @@
               <w:rPr>
                 <w:sz w:val="21"/>
               </w:rPr>
-              <w:t xml:space="preserve">GET </w:t>
-            </w:r>
-            <w:r>
-              <w:rPr>
-                <w:sz w:val="21"/>
-              </w:rPr>
-              <w:t>http://localhost:8080/api/seller/shops/{shopId}/copies</w:t>
+              <w:t>GET http://localhost:8080/api/seller/shops/{shopId}/copies</w:t>
             </w:r>
           </w:p>
         </w:tc>
@@ -14417,13 +13850,7 @@
               <w:rPr>
                 <w:sz w:val="21"/>
               </w:rPr>
-              <w:t>PUT http://localhost:8080/</w:t>
-            </w:r>
-            <w:r>
-              <w:rPr>
-                <w:sz w:val="21"/>
-              </w:rPr>
-              <w:t>api/seller/shops/{shopId}/copies/{id}</w:t>
+              <w:t>PUT http://localhost:8080/api/seller/shops/{shopId}/copies/{id}</w:t>
             </w:r>
           </w:p>
         </w:tc>
@@ -14559,7 +13986,7 @@
       <w:pPr>
         <w:pStyle w:val="Heading1"/>
       </w:pPr>
-      <w:bookmarkStart w:id="39" w:name="_Toc244162642"/>
+      <w:bookmarkStart w:id="39" w:name="_Toc244163861"/>
       <w:r>
         <w:t>TÀI LIỆU THAM KHẢO</w:t>
       </w:r>
@@ -14570,10 +13997,7 @@
         <w:jc w:val="left"/>
       </w:pPr>
       <w:r>
-        <w:t xml:space="preserve">[1] Tài liệu </w:t>
-      </w:r>
-      <w:r>
-        <w:t>học phần Lập trình Web trên UTEx. https://utexlms.hcmute.edu.vn/course/view.php?id=102049</w:t>
+        <w:t>[1] Tài liệu học phần Lập trình Web trên UTEx. https://utexlms.hcmute.edu.vn/course/view.php?id=102049</w:t>
       </w:r>
     </w:p>
     <w:p>
@@ -14589,10 +14013,7 @@
         <w:jc w:val="left"/>
       </w:pPr>
       <w:r>
-        <w:t xml:space="preserve">[3] Tài liệu kỹ thuật kèm repository: docs/ARCHITECTURE.md, docs/API_REFERENCE.md, </w:t>
-      </w:r>
-      <w:r>
-        <w:t>docs/DOCKER_QUICKSTART.md và docs/VERIFICATION.md.</w:t>
+        <w:t>[3] Tài liệu kỹ thuật kèm repository: docs/ARCHITECTURE.md, docs/API_REFERENCE.md, docs/DOCKER_QUICKSTART.md và docs/VERIFICATION.md.</w:t>
       </w:r>
     </w:p>
     <w:sectPr>
@@ -26636,7 +26057,7 @@
 </file>
 
 <file path=customXml/itemProps1.xml><?xml version="1.0" encoding="utf-8"?>
-<ds:datastoreItem xmlns:ds="http://schemas.openxmlformats.org/officeDocument/2006/customXml" ds:itemID="{AC2A34E2-D513-47EB-B7E1-ED9D343967A3}">
+<ds:datastoreItem xmlns:ds="http://schemas.openxmlformats.org/officeDocument/2006/customXml" ds:itemID="{45E4F0B8-E0FC-4253-9A91-62735F78019C}">
   <ds:schemaRefs>
     <ds:schemaRef ds:uri="http://schemas.openxmlformats.org/officeDocument/2006/bibliography"/>
   </ds:schemaRefs>

</xml_diff>